<commit_message>
update functional requirements in documentation
</commit_message>
<xml_diff>
--- a/doctemplate_and_requirements/documentation_template.docx
+++ b/doctemplate_and_requirements/documentation_template.docx
@@ -1144,15 +1144,7 @@
             <w:color w:val="0563C1"/>
             <w:u w:val="single"/>
           </w:rPr>
-          <w:t>4</w:t>
-        </w:r>
-        <w:r>
-          <w:rPr>
-            <w:rFonts w:eastAsia="Calibri" w:cstheme="minorHAnsi"/>
-            <w:color w:val="0563C1"/>
-            <w:u w:val="single"/>
-          </w:rPr>
-          <w:t>.</w:t>
+          <w:t>4.</w:t>
         </w:r>
       </w:hyperlink>
       <w:r>
@@ -1480,6 +1472,32 @@
       <w:r>
         <w:rPr>
           <w:rFonts w:eastAsia="Calibri" w:cstheme="minorHAnsi"/>
+          <w:lang w:val="en-US"/>
+        </w:rPr>
+        <w:t xml:space="preserve"> </w:t>
+      </w:r>
+      <w:r>
+        <w:rPr>
+          <w:rFonts w:eastAsia="Calibri" w:cstheme="minorHAnsi"/>
+        </w:rPr>
+        <w:t xml:space="preserve">(чрез </w:t>
+      </w:r>
+      <w:r>
+        <w:rPr>
+          <w:rFonts w:eastAsia="Calibri" w:cstheme="minorHAnsi"/>
+          <w:lang w:val="en-US"/>
+        </w:rPr>
+        <w:t>csv</w:t>
+      </w:r>
+      <w:r>
+        <w:rPr>
+          <w:rFonts w:eastAsia="Calibri" w:cstheme="minorHAnsi"/>
+        </w:rPr>
+        <w:t xml:space="preserve"> файл)</w:t>
+      </w:r>
+      <w:r>
+        <w:rPr>
+          <w:rFonts w:eastAsia="Calibri" w:cstheme="minorHAnsi"/>
         </w:rPr>
         <w:t>.</w:t>
       </w:r>
@@ -1743,6 +1761,177 @@
           <w:rFonts w:eastAsia="Calibri" w:cstheme="minorHAnsi"/>
         </w:rPr>
         <w:t>дата, статут (свършил /започнал/предстои), капацитет (общ брой места за турнира и колко от тях вече са заети) и графика, показваща класирането в момента.</w:t>
+      </w:r>
+      <w:r>
+        <w:rPr>
+          <w:rFonts w:eastAsia="Calibri" w:cstheme="minorHAnsi"/>
+        </w:rPr>
+        <w:t xml:space="preserve"> Ако турнирът се провежда в момента или е завършил, потребителите могат да изтеглят </w:t>
+      </w:r>
+      <w:r>
+        <w:rPr>
+          <w:rFonts w:eastAsia="Calibri" w:cstheme="minorHAnsi"/>
+          <w:lang w:val="en-US"/>
+        </w:rPr>
+        <w:t>csv</w:t>
+      </w:r>
+      <w:r>
+        <w:rPr>
+          <w:rFonts w:eastAsia="Calibri" w:cstheme="minorHAnsi"/>
+        </w:rPr>
+        <w:t xml:space="preserve"> файл с текущото/финалното класиране.</w:t>
+      </w:r>
+    </w:p>
+    <w:p>
+      <w:pPr>
+        <w:spacing w:before="120" w:after="160" w:line="259" w:lineRule="auto"/>
+        <w:ind w:left="360"/>
+        <w:contextualSpacing/>
+        <w:rPr>
+          <w:rFonts w:eastAsia="Calibri" w:cstheme="minorHAnsi"/>
+        </w:rPr>
+      </w:pPr>
+    </w:p>
+    <w:p>
+      <w:pPr>
+        <w:pStyle w:val="ListParagraph"/>
+        <w:numPr>
+          <w:ilvl w:val="0"/>
+          <w:numId w:val="5"/>
+        </w:numPr>
+        <w:spacing w:before="120" w:after="160" w:line="259" w:lineRule="auto"/>
+        <w:rPr>
+          <w:rFonts w:eastAsia="Calibri" w:cstheme="minorHAnsi"/>
+          <w:color w:val="FF0000"/>
+        </w:rPr>
+      </w:pPr>
+      <w:r>
+        <w:rPr>
+          <w:rFonts w:eastAsia="Calibri" w:cstheme="minorHAnsi"/>
+          <w:lang w:val="en-US"/>
+        </w:rPr>
+        <w:t xml:space="preserve">API </w:t>
+      </w:r>
+    </w:p>
+    <w:p>
+      <w:pPr>
+        <w:pStyle w:val="ListParagraph"/>
+        <w:numPr>
+          <w:ilvl w:val="0"/>
+          <w:numId w:val="0"/>
+        </w:numPr>
+        <w:spacing w:before="120" w:after="160" w:line="259" w:lineRule="auto"/>
+        <w:ind w:left="360"/>
+        <w:rPr>
+          <w:rFonts w:eastAsia="Calibri" w:cstheme="minorHAnsi"/>
+          <w:color w:val="FF0000"/>
+        </w:rPr>
+      </w:pPr>
+      <w:r>
+        <w:rPr>
+          <w:rFonts w:eastAsia="Calibri" w:cstheme="minorHAnsi"/>
+        </w:rPr>
+        <w:t>П</w:t>
+      </w:r>
+      <w:r>
+        <w:rPr>
+          <w:rFonts w:eastAsia="Calibri" w:cstheme="minorHAnsi"/>
+        </w:rPr>
+        <w:t xml:space="preserve">озволява на други системи/скриптове да правят заявки към системата. </w:t>
+      </w:r>
+      <w:r>
+        <w:t xml:space="preserve">Достъпът до </w:t>
+      </w:r>
+      <w:r>
+        <w:t>описаните долу функционалности</w:t>
+      </w:r>
+      <w:bookmarkStart w:id="2" w:name="_GoBack"/>
+      <w:bookmarkEnd w:id="2"/>
+      <w:r>
+        <w:t xml:space="preserve"> трябва да бъде защитен чрез проверка на валиден токен за автентикация</w:t>
+      </w:r>
+    </w:p>
+    <w:p>
+      <w:pPr>
+        <w:pStyle w:val="ListParagraph"/>
+        <w:numPr>
+          <w:ilvl w:val="0"/>
+          <w:numId w:val="0"/>
+        </w:numPr>
+        <w:spacing w:before="120" w:after="160" w:line="259" w:lineRule="auto"/>
+        <w:ind w:left="360"/>
+        <w:rPr>
+          <w:rFonts w:eastAsia="Calibri" w:cstheme="minorHAnsi"/>
+          <w:color w:val="FF0000"/>
+        </w:rPr>
+      </w:pPr>
+    </w:p>
+    <w:p>
+      <w:pPr>
+        <w:pStyle w:val="ListParagraph"/>
+        <w:numPr>
+          <w:ilvl w:val="1"/>
+          <w:numId w:val="5"/>
+        </w:numPr>
+        <w:spacing w:before="120" w:after="160" w:line="259" w:lineRule="auto"/>
+        <w:rPr>
+          <w:rFonts w:eastAsia="Calibri" w:cstheme="minorHAnsi"/>
+          <w:color w:val="FF0000"/>
+        </w:rPr>
+      </w:pPr>
+      <w:r>
+        <w:rPr>
+          <w:rFonts w:eastAsia="Calibri" w:cstheme="minorHAnsi"/>
+        </w:rPr>
+        <w:t>Предоставя се възможност за въвеждане на частично/пълно име на турнир и се връща списък с имената на всики турнири, съвпадащи или съдържащи подадения низ, заедно с техните идентификатори.</w:t>
+      </w:r>
+    </w:p>
+    <w:p>
+      <w:pPr>
+        <w:pStyle w:val="ListParagraph"/>
+        <w:numPr>
+          <w:ilvl w:val="0"/>
+          <w:numId w:val="0"/>
+        </w:numPr>
+        <w:spacing w:before="120" w:after="160" w:line="259" w:lineRule="auto"/>
+        <w:ind w:left="792"/>
+        <w:rPr>
+          <w:rFonts w:eastAsia="Calibri" w:cstheme="minorHAnsi"/>
+          <w:color w:val="FF0000"/>
+        </w:rPr>
+      </w:pPr>
+    </w:p>
+    <w:p>
+      <w:pPr>
+        <w:pStyle w:val="ListParagraph"/>
+        <w:numPr>
+          <w:ilvl w:val="1"/>
+          <w:numId w:val="5"/>
+        </w:numPr>
+        <w:spacing w:before="120" w:after="160" w:line="259" w:lineRule="auto"/>
+        <w:rPr>
+          <w:rFonts w:eastAsia="Calibri" w:cstheme="minorHAnsi"/>
+          <w:color w:val="FF0000"/>
+        </w:rPr>
+      </w:pPr>
+      <w:r>
+        <w:rPr>
+          <w:rFonts w:eastAsia="Calibri" w:cstheme="minorHAnsi"/>
+        </w:rPr>
+        <w:t xml:space="preserve"> При подаване на идентификатор на турнир се връща </w:t>
+      </w:r>
+      <w:r>
+        <w:rPr>
+          <w:rFonts w:eastAsia="Calibri" w:cstheme="minorHAnsi"/>
+          <w:lang w:val="en-US"/>
+        </w:rPr>
+        <w:t>csv</w:t>
+      </w:r>
+      <w:r>
+        <w:rPr>
+          <w:rFonts w:eastAsia="Calibri" w:cstheme="minorHAnsi"/>
+        </w:rPr>
+        <w:t xml:space="preserve"> с резултатите от провеждането му.</w:t>
       </w:r>
     </w:p>
     <w:p>
@@ -1813,13 +2002,8 @@
         <w:rPr>
           <w:rFonts w:eastAsia="Calibri" w:cstheme="minorHAnsi"/>
         </w:rPr>
-        <w:t>Интерфейсът трябва да бъде инт</w:t>
-      </w:r>
-      <w:r>
-        <w:rPr>
-          <w:rFonts w:eastAsia="Calibri" w:cstheme="minorHAnsi"/>
-        </w:rPr>
-        <w:t>уитивен и лесен за използване, без да са необходими допълнителни разяснения.</w:t>
+        <w:lastRenderedPageBreak/>
+        <w:t>Интерфейсът трябва да бъде интуитивен и лесен за използване, без да са необходими допълнителни разяснения.</w:t>
       </w:r>
     </w:p>
     <w:p>
@@ -1927,25 +2111,7 @@
         <w:rPr>
           <w:rFonts w:eastAsia="Calibri" w:cstheme="minorHAnsi"/>
         </w:rPr>
-        <w:t>Системата трябва да работи бе</w:t>
-      </w:r>
-      <w:r>
-        <w:rPr>
-          <w:rFonts w:eastAsia="Calibri" w:cstheme="minorHAnsi"/>
-        </w:rPr>
-        <w:t xml:space="preserve">з прекъсвания, с минимален риск </w:t>
-      </w:r>
-      <w:r>
-        <w:rPr>
-          <w:rFonts w:eastAsia="Calibri" w:cstheme="minorHAnsi"/>
-        </w:rPr>
-        <w:t>от грешки</w:t>
-      </w:r>
-      <w:r>
-        <w:rPr>
-          <w:rFonts w:eastAsia="Calibri" w:cstheme="minorHAnsi"/>
-        </w:rPr>
-        <w:t>.</w:t>
+        <w:t>Системата трябва да работи без прекъсвания, с минимален риск от грешки.</w:t>
       </w:r>
     </w:p>
     <w:p>
@@ -1984,35 +2150,6 @@
     </w:p>
     <w:p>
       <w:pPr>
-        <w:pStyle w:val="ListParagraph"/>
-        <w:numPr>
-          <w:ilvl w:val="0"/>
-          <w:numId w:val="10"/>
-        </w:numPr>
-        <w:spacing w:before="120" w:after="160" w:line="259" w:lineRule="auto"/>
-        <w:rPr>
-          <w:rFonts w:eastAsia="Calibri" w:cstheme="minorHAnsi"/>
-          <w:color w:val="FF0000"/>
-        </w:rPr>
-      </w:pPr>
-      <w:r>
-        <w:rPr>
-          <w:rFonts w:eastAsia="Calibri" w:cstheme="minorHAnsi"/>
-        </w:rPr>
-        <w:t xml:space="preserve">Интеграция с външни услуги </w:t>
-      </w:r>
-      <w:r>
-        <w:rPr>
-          <w:rFonts w:eastAsia="Calibri" w:cstheme="minorHAnsi"/>
-          <w:color w:val="FF0000"/>
-        </w:rPr>
-        <w:t>????</w:t>
-      </w:r>
-      <w:bookmarkStart w:id="2" w:name="_GoBack"/>
-      <w:bookmarkEnd w:id="2"/>
-    </w:p>
-    <w:p>
-      <w:pPr>
         <w:pStyle w:val="Heading2"/>
         <w:rPr>
           <w:sz w:val="22"/>
@@ -2078,7 +2215,6 @@
           <w:sz w:val="22"/>
           <w:szCs w:val="22"/>
         </w:rPr>
-        <w:lastRenderedPageBreak/>
         <w:t xml:space="preserve">4. </w:t>
       </w:r>
       <w:r>
@@ -2586,6 +2722,7 @@
           <w:sz w:val="22"/>
           <w:szCs w:val="22"/>
         </w:rPr>
+        <w:lastRenderedPageBreak/>
         <w:t>1</w:t>
       </w:r>
       <w:r>
@@ -2749,7 +2886,6 @@
           <w:sz w:val="22"/>
           <w:szCs w:val="22"/>
         </w:rPr>
-        <w:lastRenderedPageBreak/>
         <w:t>1</w:t>
       </w:r>
       <w:r>
@@ -3350,7 +3486,14 @@
         <w:rPr>
           <w:lang w:bidi="he-IL"/>
         </w:rPr>
-        <w:t>2.2. За документация на проекта ползвайте шаблона (ще гледам да го кача скоро); Задължително потребителска документация (а.к.а. userguide) - няколко скрийншота с кратко разяснение; условие на проекта (т.е. какво сте разтълкували сме се разбрали да правите - то може и да се различава от описанието дадено в гугъл докс-а към момента); както и инструкции за инсталиране; за защитата - ще дам няколко дати през сесията/преди сесията + официалните дати, за който не успее да мине преди това; за защитата - кода, документацията/необходими библиотеки/среди, инсталации - за инсталирането се предават на DVD (ако има още такова нещо като CD-може и на CD). Може по изключение да сложа И форма за качване само на документацията и програмен код и в мудъл, НО идеята е, че ако няма интернет (да речем е паднал мудъла, спрял е тока и т.н. - само по съдържанието на диска, който сте предали да може да се инсталира</w:t>
+        <w:t xml:space="preserve">2.2. За документация на проекта ползвайте шаблона (ще гледам да го кача скоро); Задължително потребителска документация (а.к.а. userguide) - няколко скрийншота с кратко разяснение; условие на проекта (т.е. какво сте разтълкували сме се разбрали да правите - то може и да се различава от описанието дадено в гугъл докс-а към момента); както и инструкции за инсталиране; за защитата - ще дам няколко дати през сесията/преди сесията + официалните дати, за който не успее да мине преди това; за защитата - кода, документацията/необходими </w:t>
+      </w:r>
+      <w:r>
+        <w:rPr>
+          <w:lang w:bidi="he-IL"/>
+        </w:rPr>
+        <w:lastRenderedPageBreak/>
+        <w:t>библиотеки/среди, инсталации - за инсталирането се предават на DVD (ако има още такова нещо като CD-може и на CD). Може по изключение да сложа И форма за качване само на документацията и програмен код и в мудъл, НО идеята е, че ако няма интернет (да речем е паднал мудъла, спрял е тока и т.н. - само по съдържанието на диска, който сте предали да може да се инсталира</w:t>
       </w:r>
       <w:r>
         <w:rPr>
@@ -3374,14 +3517,7 @@
         <w:rPr>
           <w:lang w:bidi="he-IL"/>
         </w:rPr>
-        <w:t xml:space="preserve">проекта); Също така разпечатвате първа страница от проекта (с името ви и заданието), 1 страница от userguide-а и последната страница, където пише предал/приел (там пише вашите и моите имена), т.е. не е необходимо да печатите цялата документация - така или иначе ще я има в електронен формат; За хората, които не ползват MS Office - ще помоля освен изходният документ в docx/rtf, да качат нещата и е pdf формат, т.к. често такъв тип документация се размества и не се чете. В кода сложете и MySql sql скрипт със създаване на таблицата и скриптове, задаващи примерни данни (т.е. може да тестваме приложението дали работи без данни, и ако за да се види пълната прелест на проекта е нужно </w:t>
-      </w:r>
-      <w:r>
-        <w:rPr>
-          <w:lang w:bidi="he-IL"/>
-        </w:rPr>
-        <w:lastRenderedPageBreak/>
-        <w:t>да се вкарат предварително данни - sql и/или снимки/звуци и т.н. м</w:t>
+        <w:t>проекта); Също така разпечатвате първа страница от проекта (с името ви и заданието), 1 страница от userguide-а и последната страница, където пише предал/приел (там пише вашите и моите имена), т.е. не е необходимо да печатите цялата документация - така или иначе ще я има в електронен формат; За хората, които не ползват MS Office - ще помоля освен изходният документ в docx/rtf, да качат нещата и е pdf формат, т.к. често такъв тип документация се размества и не се чете. В кода сложете и MySql sql скрипт със създаване на таблицата и скриптове, задаващи примерни данни (т.е. може да тестваме приложението дали работи без данни, и ако за да се види пълната прелест на проекта е нужно да се вкарат предварително данни - sql и/или снимки/звуци и т.н. м</w:t>
       </w:r>
       <w:r>
         <w:rPr>
@@ -3793,7 +3929,14 @@
         <w:rPr>
           <w:lang w:bidi="he-IL"/>
         </w:rPr>
-        <w:t xml:space="preserve">, примерни данни за тестване - администраторски акаунти, ръководство на потребителя за различните роли </w:t>
+        <w:t xml:space="preserve">, примерни данни за тестване - администраторски акаунти, ръководство на </w:t>
+      </w:r>
+      <w:r>
+        <w:rPr>
+          <w:lang w:bidi="he-IL"/>
+        </w:rPr>
+        <w:lastRenderedPageBreak/>
+        <w:t xml:space="preserve">потребителя за различните роли </w:t>
       </w:r>
       <w:r>
         <w:rPr>
@@ -6321,6 +6464,7 @@
           <w:szCs w:val="20"/>
           <w:highlight w:val="yellow"/>
         </w:rPr>
+        <w:lastRenderedPageBreak/>
         <w:tab/>
       </w:r>
       <w:r>
@@ -7389,6 +7533,7 @@
           <w:iCs/>
           <w:lang w:bidi="he-IL"/>
         </w:rPr>
+        <w:lastRenderedPageBreak/>
         <w:t>?&gt;</w:t>
       </w:r>
     </w:p>

</xml_diff>

<commit_message>
security + api + documentation updates
</commit_message>
<xml_diff>
--- a/doctemplate_and_requirements/documentation_template.docx
+++ b/doctemplate_and_requirements/documentation_template.docx
@@ -1,6 +1,6 @@
 
 <file path=word/document.xml><?xml version="1.0" encoding="utf-8"?>
-<w:document xmlns:wpc="http://schemas.microsoft.com/office/word/2010/wordprocessingCanvas" xmlns:cx="http://schemas.microsoft.com/office/drawing/2014/chartex" xmlns:mc="http://schemas.openxmlformats.org/markup-compatibility/2006" xmlns:o="urn:schemas-microsoft-com:office:office" xmlns:r="http://schemas.openxmlformats.org/officeDocument/2006/relationships" xmlns:m="http://schemas.openxmlformats.org/officeDocument/2006/math" xmlns:v="urn:schemas-microsoft-com:vml" xmlns:wp14="http://schemas.microsoft.com/office/word/2010/wordprocessingDrawing" xmlns:wp="http://schemas.openxmlformats.org/drawingml/2006/wordprocessingDrawing" xmlns:w10="urn:schemas-microsoft-com:office:word" xmlns:w="http://schemas.openxmlformats.org/wordprocessingml/2006/main" xmlns:w14="http://schemas.microsoft.com/office/word/2010/wordml" xmlns:w15="http://schemas.microsoft.com/office/word/2012/wordml" xmlns:w16se="http://schemas.microsoft.com/office/word/2015/wordml/symex" xmlns:wpg="http://schemas.microsoft.com/office/word/2010/wordprocessingGroup" xmlns:wpi="http://schemas.microsoft.com/office/word/2010/wordprocessingInk" xmlns:wne="http://schemas.microsoft.com/office/word/2006/wordml" xmlns:wps="http://schemas.microsoft.com/office/word/2010/wordprocessingShape" mc:Ignorable="w14 w15 w16se wp14">
+<w:document xmlns:wpc="http://schemas.microsoft.com/office/word/2010/wordprocessingCanvas" xmlns:mc="http://schemas.openxmlformats.org/markup-compatibility/2006" xmlns:o="urn:schemas-microsoft-com:office:office" xmlns:r="http://schemas.openxmlformats.org/officeDocument/2006/relationships" xmlns:m="http://schemas.openxmlformats.org/officeDocument/2006/math" xmlns:v="urn:schemas-microsoft-com:vml" xmlns:wp14="http://schemas.microsoft.com/office/word/2010/wordprocessingDrawing" xmlns:wp="http://schemas.openxmlformats.org/drawingml/2006/wordprocessingDrawing" xmlns:w10="urn:schemas-microsoft-com:office:word" xmlns:w="http://schemas.openxmlformats.org/wordprocessingml/2006/main" xmlns:w14="http://schemas.microsoft.com/office/word/2010/wordml" xmlns:wpg="http://schemas.microsoft.com/office/word/2010/wordprocessingGroup" xmlns:wpi="http://schemas.microsoft.com/office/word/2010/wordprocessingInk" xmlns:wne="http://schemas.microsoft.com/office/word/2006/wordml" xmlns:wps="http://schemas.microsoft.com/office/word/2010/wordprocessingShape" mc:Ignorable="w14 wp14">
   <w:body>
     <w:p>
       <w:pPr>
@@ -1805,6 +1805,7 @@
         <w:rPr>
           <w:rFonts w:eastAsia="Calibri" w:cstheme="minorHAnsi"/>
           <w:color w:val="FF0000"/>
+          <w:lang w:val="en-US"/>
         </w:rPr>
       </w:pPr>
     </w:p>
@@ -2263,6 +2264,7 @@
         <w:rPr>
           <w:sz w:val="18"/>
           <w:szCs w:val="18"/>
+          <w:lang w:val="en-US"/>
         </w:rPr>
       </w:pPr>
       <w:r>
@@ -2276,6 +2278,415 @@
     </w:p>
     <w:p>
       <w:pPr>
+        <w:rPr>
+          <w:lang w:val="en-US"/>
+        </w:rPr>
+      </w:pPr>
+      <w:r>
+        <w:t>З</w:t>
+      </w:r>
+      <w:r>
+        <w:rPr>
+          <w:lang w:val="en-US"/>
+        </w:rPr>
+        <w:t xml:space="preserve">а </w:t>
+      </w:r>
+      <w:proofErr w:type="spellStart"/>
+      <w:r>
+        <w:rPr>
+          <w:lang w:val="en-US"/>
+        </w:rPr>
+        <w:t>да</w:t>
+      </w:r>
+      <w:proofErr w:type="spellEnd"/>
+      <w:r>
+        <w:rPr>
+          <w:lang w:val="en-US"/>
+        </w:rPr>
+        <w:t xml:space="preserve"> </w:t>
+      </w:r>
+      <w:proofErr w:type="spellStart"/>
+      <w:r>
+        <w:rPr>
+          <w:lang w:val="en-US"/>
+        </w:rPr>
+        <w:t>работи</w:t>
+      </w:r>
+      <w:proofErr w:type="spellEnd"/>
+      <w:r>
+        <w:rPr>
+          <w:lang w:val="en-US"/>
+        </w:rPr>
+        <w:t xml:space="preserve"> .</w:t>
+      </w:r>
+      <w:proofErr w:type="spellStart"/>
+      <w:r>
+        <w:rPr>
+          <w:lang w:val="en-US"/>
+        </w:rPr>
+        <w:t>htaccess</w:t>
+      </w:r>
+      <w:proofErr w:type="spellEnd"/>
+      <w:r>
+        <w:rPr>
+          <w:lang w:val="en-US"/>
+        </w:rPr>
+        <w:t xml:space="preserve"> </w:t>
+      </w:r>
+      <w:proofErr w:type="spellStart"/>
+      <w:r>
+        <w:rPr>
+          <w:lang w:val="en-US"/>
+        </w:rPr>
+        <w:t>правилно</w:t>
+      </w:r>
+      <w:proofErr w:type="spellEnd"/>
+      <w:r>
+        <w:rPr>
+          <w:lang w:val="en-US"/>
+        </w:rPr>
+        <w:t xml:space="preserve"> </w:t>
+      </w:r>
+      <w:proofErr w:type="spellStart"/>
+      <w:r>
+        <w:rPr>
+          <w:lang w:val="en-US"/>
+        </w:rPr>
+        <w:t>за</w:t>
+      </w:r>
+      <w:proofErr w:type="spellEnd"/>
+      <w:r>
+        <w:rPr>
+          <w:lang w:val="en-US"/>
+        </w:rPr>
+        <w:t xml:space="preserve"> </w:t>
+      </w:r>
+      <w:proofErr w:type="spellStart"/>
+      <w:r>
+        <w:rPr>
+          <w:lang w:val="en-US"/>
+        </w:rPr>
+        <w:t>пренасочване</w:t>
+      </w:r>
+      <w:proofErr w:type="spellEnd"/>
+      <w:r>
+        <w:rPr>
+          <w:lang w:val="en-US"/>
+        </w:rPr>
+        <w:t xml:space="preserve"> </w:t>
+      </w:r>
+      <w:proofErr w:type="spellStart"/>
+      <w:r>
+        <w:rPr>
+          <w:lang w:val="en-US"/>
+        </w:rPr>
+        <w:t>на</w:t>
+      </w:r>
+      <w:proofErr w:type="spellEnd"/>
+      <w:r>
+        <w:rPr>
+          <w:lang w:val="en-US"/>
+        </w:rPr>
+        <w:t xml:space="preserve"> </w:t>
+      </w:r>
+      <w:proofErr w:type="spellStart"/>
+      <w:r>
+        <w:rPr>
+          <w:lang w:val="en-US"/>
+        </w:rPr>
+        <w:t>заявки</w:t>
+      </w:r>
+      <w:proofErr w:type="spellEnd"/>
+      <w:r>
+        <w:rPr>
+          <w:lang w:val="en-US"/>
+        </w:rPr>
+        <w:t xml:space="preserve"> </w:t>
+      </w:r>
+      <w:proofErr w:type="spellStart"/>
+      <w:r>
+        <w:rPr>
+          <w:lang w:val="en-US"/>
+        </w:rPr>
+        <w:t>към</w:t>
+      </w:r>
+      <w:proofErr w:type="spellEnd"/>
+      <w:r>
+        <w:rPr>
+          <w:lang w:val="en-US"/>
+        </w:rPr>
+        <w:t xml:space="preserve"> </w:t>
+      </w:r>
+      <w:proofErr w:type="spellStart"/>
+      <w:r>
+        <w:rPr>
+          <w:lang w:val="en-US"/>
+        </w:rPr>
+        <w:t>index.php</w:t>
+      </w:r>
+      <w:proofErr w:type="spellEnd"/>
+      <w:r>
+        <w:t xml:space="preserve"> и блокиране на такива към файлове със сензитивна информация,</w:t>
+      </w:r>
+      <w:r>
+        <w:rPr>
+          <w:lang w:val="en-US"/>
+        </w:rPr>
+        <w:t xml:space="preserve"> </w:t>
+      </w:r>
+      <w:r>
+        <w:t xml:space="preserve">трябва в </w:t>
+      </w:r>
+      <w:proofErr w:type="spellStart"/>
+      <w:r>
+        <w:rPr>
+          <w:lang w:val="en-US"/>
+        </w:rPr>
+        <w:t>httpd.conf</w:t>
+      </w:r>
+      <w:proofErr w:type="spellEnd"/>
+      <w:r>
+        <w:rPr>
+          <w:lang w:val="en-US"/>
+        </w:rPr>
+        <w:t xml:space="preserve"> (</w:t>
+      </w:r>
+      <w:proofErr w:type="spellStart"/>
+      <w:r>
+        <w:rPr>
+          <w:lang w:val="en-US"/>
+        </w:rPr>
+        <w:t>или</w:t>
+      </w:r>
+      <w:proofErr w:type="spellEnd"/>
+      <w:r>
+        <w:rPr>
+          <w:lang w:val="en-US"/>
+        </w:rPr>
+        <w:t xml:space="preserve"> </w:t>
+      </w:r>
+      <w:proofErr w:type="spellStart"/>
+      <w:r>
+        <w:rPr>
+          <w:lang w:val="en-US"/>
+        </w:rPr>
+        <w:t>съответния</w:t>
+      </w:r>
+      <w:proofErr w:type="spellEnd"/>
+      <w:r>
+        <w:rPr>
+          <w:lang w:val="en-US"/>
+        </w:rPr>
+        <w:t xml:space="preserve"> </w:t>
+      </w:r>
+      <w:proofErr w:type="spellStart"/>
+      <w:r>
+        <w:rPr>
+          <w:lang w:val="en-US"/>
+        </w:rPr>
+        <w:t>конфигурационен</w:t>
+      </w:r>
+      <w:proofErr w:type="spellEnd"/>
+      <w:r>
+        <w:rPr>
+          <w:lang w:val="en-US"/>
+        </w:rPr>
+        <w:t xml:space="preserve"> </w:t>
+      </w:r>
+      <w:proofErr w:type="spellStart"/>
+      <w:r>
+        <w:rPr>
+          <w:lang w:val="en-US"/>
+        </w:rPr>
+        <w:t>фа</w:t>
+      </w:r>
+      <w:r>
+        <w:rPr>
+          <w:lang w:val="en-US"/>
+        </w:rPr>
+        <w:t>йл</w:t>
+      </w:r>
+      <w:proofErr w:type="spellEnd"/>
+      <w:r>
+        <w:rPr>
+          <w:lang w:val="en-US"/>
+        </w:rPr>
+        <w:t xml:space="preserve">) </w:t>
+      </w:r>
+      <w:r>
+        <w:t xml:space="preserve">да </w:t>
+      </w:r>
+      <w:r>
+        <w:rPr>
+          <w:lang w:val="en-US"/>
+        </w:rPr>
+        <w:t xml:space="preserve"> </w:t>
+      </w:r>
+      <w:proofErr w:type="spellStart"/>
+      <w:r>
+        <w:rPr>
+          <w:lang w:val="en-US"/>
+        </w:rPr>
+        <w:t>се</w:t>
+      </w:r>
+      <w:proofErr w:type="spellEnd"/>
+      <w:r>
+        <w:rPr>
+          <w:lang w:val="en-US"/>
+        </w:rPr>
+        <w:t xml:space="preserve"> </w:t>
+      </w:r>
+      <w:proofErr w:type="spellStart"/>
+      <w:r>
+        <w:rPr>
+          <w:lang w:val="en-US"/>
+        </w:rPr>
+        <w:t>уверяв</w:t>
+      </w:r>
+      <w:proofErr w:type="spellEnd"/>
+      <w:r>
+        <w:t>им</w:t>
+      </w:r>
+      <w:r>
+        <w:rPr>
+          <w:lang w:val="en-US"/>
+        </w:rPr>
+        <w:t xml:space="preserve">, </w:t>
+      </w:r>
+      <w:proofErr w:type="spellStart"/>
+      <w:r>
+        <w:rPr>
+          <w:lang w:val="en-US"/>
+        </w:rPr>
+        <w:t>че</w:t>
+      </w:r>
+      <w:proofErr w:type="spellEnd"/>
+      <w:r>
+        <w:rPr>
+          <w:lang w:val="en-US"/>
+        </w:rPr>
+        <w:t xml:space="preserve"> </w:t>
+      </w:r>
+      <w:proofErr w:type="spellStart"/>
+      <w:r>
+        <w:rPr>
+          <w:lang w:val="en-US"/>
+        </w:rPr>
+        <w:t>AllowOverride</w:t>
+      </w:r>
+      <w:proofErr w:type="spellEnd"/>
+      <w:r>
+        <w:rPr>
+          <w:lang w:val="en-US"/>
+        </w:rPr>
+        <w:t xml:space="preserve"> </w:t>
+      </w:r>
+      <w:r>
+        <w:t xml:space="preserve">има стойност </w:t>
+      </w:r>
+      <w:r>
+        <w:rPr>
+          <w:lang w:val="en-US"/>
+        </w:rPr>
+        <w:t>All.</w:t>
+      </w:r>
+      <w:bookmarkStart w:id="2" w:name="_GoBack"/>
+      <w:bookmarkEnd w:id="2"/>
+    </w:p>
+    <w:p>
+      <w:pPr>
+        <w:rPr>
+          <w:lang w:val="en-US"/>
+        </w:rPr>
+      </w:pPr>
+      <w:r>
+        <w:rPr>
+          <w:lang w:val="en-US"/>
+        </w:rPr>
+        <w:t>API:</w:t>
+      </w:r>
+    </w:p>
+    <w:p>
+      <w:r>
+        <w:t>В .</w:t>
+      </w:r>
+      <w:proofErr w:type="spellStart"/>
+      <w:r>
+        <w:rPr>
+          <w:lang w:val="en-US"/>
+        </w:rPr>
+        <w:t>env</w:t>
+      </w:r>
+      <w:proofErr w:type="spellEnd"/>
+      <w:r>
+        <w:rPr>
+          <w:lang w:val="en-US"/>
+        </w:rPr>
+        <w:t xml:space="preserve"> </w:t>
+      </w:r>
+      <w:r>
+        <w:t xml:space="preserve">като стойност на </w:t>
+      </w:r>
+      <w:r>
+        <w:rPr>
+          <w:lang w:val="en-US"/>
+        </w:rPr>
+        <w:t xml:space="preserve">CSV_API_TOKEN </w:t>
+      </w:r>
+      <w:r>
+        <w:t xml:space="preserve">се слага </w:t>
+      </w:r>
+      <w:proofErr w:type="spellStart"/>
+      <w:r>
+        <w:rPr>
+          <w:lang w:val="en-US"/>
+        </w:rPr>
+        <w:t>auth</w:t>
+      </w:r>
+      <w:proofErr w:type="spellEnd"/>
+      <w:r>
+        <w:rPr>
+          <w:lang w:val="en-US"/>
+        </w:rPr>
+        <w:t xml:space="preserve"> token</w:t>
+      </w:r>
+      <w:r>
+        <w:t>, който скриптове и други системи могат да ползват за достъп до някои функционалности на системата</w:t>
+      </w:r>
+      <w:r>
+        <w:t xml:space="preserve"> </w:t>
+      </w:r>
+      <w:hyperlink w:anchor="api" w:history="1">
+        <w:r>
+          <w:rPr>
+            <w:rStyle w:val="Hyperlink"/>
+          </w:rPr>
+          <w:t>(повече инфо</w:t>
+        </w:r>
+        <w:r>
+          <w:rPr>
+            <w:rStyle w:val="Hyperlink"/>
+          </w:rPr>
+          <w:t>р</w:t>
+        </w:r>
+        <w:r>
+          <w:rPr>
+            <w:rStyle w:val="Hyperlink"/>
+          </w:rPr>
+          <w:t>мация)</w:t>
+        </w:r>
+        <w:r>
+          <w:rPr>
+            <w:rStyle w:val="Hyperlink"/>
+            <w:sz w:val="18"/>
+            <w:szCs w:val="18"/>
+          </w:rPr>
+          <w:t>.</w:t>
+        </w:r>
+      </w:hyperlink>
+    </w:p>
+    <w:p>
+      <w:pPr>
         <w:pStyle w:val="Heading2"/>
         <w:rPr>
           <w:sz w:val="22"/>
@@ -2317,6 +2728,7 @@
         <w:rPr>
           <w:sz w:val="18"/>
           <w:szCs w:val="18"/>
+          <w:lang w:val="en-US"/>
         </w:rPr>
       </w:pPr>
       <w:r>
@@ -2330,10 +2742,410 @@
     </w:p>
     <w:p>
       <w:pPr>
-        <w:pStyle w:val="Heading2"/>
+        <w:rPr>
+          <w:lang w:val="en-US"/>
+        </w:rPr>
+      </w:pPr>
+      <w:bookmarkStart w:id="3" w:name="api"/>
+      <w:bookmarkEnd w:id="3"/>
+      <w:r>
+        <w:rPr>
+          <w:lang w:val="en-US"/>
+        </w:rPr>
+        <w:t>API:</w:t>
+      </w:r>
+    </w:p>
+    <w:p>
+      <w:r>
+        <w:t>Позволява</w:t>
+      </w:r>
+      <w:r>
+        <w:t xml:space="preserve"> да се взимат резултатите от турнир (спрямо подаден </w:t>
+      </w:r>
+      <w:proofErr w:type="spellStart"/>
+      <w:r>
+        <w:rPr>
+          <w:lang w:val="en-US"/>
+        </w:rPr>
+        <w:t>tournament_id</w:t>
+      </w:r>
+      <w:proofErr w:type="spellEnd"/>
+      <w:r>
+        <w:rPr>
+          <w:lang w:val="en-US"/>
+        </w:rPr>
+        <w:t xml:space="preserve">) </w:t>
+      </w:r>
+      <w:r>
+        <w:t xml:space="preserve">и да се взимат имената и </w:t>
+      </w:r>
+      <w:r>
+        <w:rPr>
+          <w:lang w:val="en-US"/>
+        </w:rPr>
+        <w:t>id-</w:t>
+      </w:r>
+      <w:r>
+        <w:t>тата на всички турнири</w:t>
+      </w:r>
+      <w:r>
+        <w:t>,чието име съвпада или съдържа</w:t>
+      </w:r>
+      <w:r>
+        <w:t xml:space="preserve"> даден подстринг на името</w:t>
+      </w:r>
+      <w:r>
+        <w:t xml:space="preserve"> (</w:t>
+      </w:r>
+      <w:proofErr w:type="spellStart"/>
+      <w:r>
+        <w:rPr>
+          <w:lang w:val="en-US"/>
+        </w:rPr>
+        <w:t>str</w:t>
+      </w:r>
+      <w:proofErr w:type="spellEnd"/>
+      <w:r>
+        <w:rPr>
+          <w:lang w:val="en-US"/>
+        </w:rPr>
+        <w:t>)</w:t>
+      </w:r>
+      <w:r>
+        <w:t>.</w:t>
+      </w:r>
+      <w:r>
+        <w:rPr>
+          <w:lang w:val="en-US"/>
+        </w:rPr>
+        <w:t xml:space="preserve"> </w:t>
+      </w:r>
+      <w:r>
+        <w:t xml:space="preserve">Като </w:t>
+      </w:r>
+      <w:r>
+        <w:rPr>
+          <w:lang w:val="en-US"/>
+        </w:rPr>
+        <w:t xml:space="preserve">header </w:t>
+      </w:r>
+      <w:r>
+        <w:t xml:space="preserve">се взима стойност на </w:t>
+      </w:r>
+      <w:r>
+        <w:rPr>
+          <w:lang w:val="en-US"/>
+        </w:rPr>
+        <w:t xml:space="preserve">Authorization, </w:t>
+      </w:r>
+      <w:proofErr w:type="spellStart"/>
+      <w:r>
+        <w:rPr>
+          <w:lang w:val="en-US"/>
+        </w:rPr>
+        <w:t>което</w:t>
+      </w:r>
+      <w:proofErr w:type="spellEnd"/>
+      <w:r>
+        <w:rPr>
+          <w:lang w:val="en-US"/>
+        </w:rPr>
+        <w:t xml:space="preserve"> </w:t>
+      </w:r>
+      <w:r>
+        <w:t>се сравнява със</w:t>
+      </w:r>
+      <w:r>
+        <w:rPr>
+          <w:lang w:val="en-US"/>
+        </w:rPr>
+        <w:t xml:space="preserve"> </w:t>
+      </w:r>
+      <w:proofErr w:type="spellStart"/>
+      <w:r>
+        <w:rPr>
+          <w:lang w:val="en-US"/>
+        </w:rPr>
+        <w:t>стойността</w:t>
+      </w:r>
+      <w:proofErr w:type="spellEnd"/>
+      <w:r>
+        <w:rPr>
+          <w:lang w:val="en-US"/>
+        </w:rPr>
+        <w:t xml:space="preserve"> </w:t>
+      </w:r>
+      <w:proofErr w:type="spellStart"/>
+      <w:r>
+        <w:rPr>
+          <w:lang w:val="en-US"/>
+        </w:rPr>
+        <w:t>на</w:t>
+      </w:r>
+      <w:proofErr w:type="spellEnd"/>
+      <w:r>
+        <w:rPr>
+          <w:lang w:val="en-US"/>
+        </w:rPr>
+        <w:t xml:space="preserve"> CSV_API_TOKEN </w:t>
+      </w:r>
+      <w:r>
+        <w:t>във файла .</w:t>
+      </w:r>
+      <w:proofErr w:type="spellStart"/>
+      <w:r>
+        <w:rPr>
+          <w:lang w:val="en-US"/>
+        </w:rPr>
+        <w:t>env</w:t>
+      </w:r>
+      <w:proofErr w:type="spellEnd"/>
+      <w:r>
+        <w:rPr>
+          <w:lang w:val="en-US"/>
+        </w:rPr>
+        <w:t xml:space="preserve"> </w:t>
+      </w:r>
+      <w:r>
+        <w:t xml:space="preserve"> в </w:t>
+      </w:r>
+      <w:r>
+        <w:rPr>
+          <w:lang w:val="en-US"/>
+        </w:rPr>
+        <w:t>root</w:t>
+      </w:r>
+      <w:r>
+        <w:t xml:space="preserve"> директорията.</w:t>
+      </w:r>
+    </w:p>
+    <w:p>
+      <w:r>
+        <w:t>Шаблон:</w:t>
+      </w:r>
+    </w:p>
+    <w:p>
+      <w:pPr>
+        <w:rPr>
+          <w:lang w:val="en-US"/>
+        </w:rPr>
+      </w:pPr>
+      <w:proofErr w:type="gramStart"/>
+      <w:r>
+        <w:rPr>
+          <w:lang w:val="en-US"/>
+        </w:rPr>
+        <w:t>curl</w:t>
+      </w:r>
+      <w:proofErr w:type="gramEnd"/>
+      <w:r>
+        <w:rPr>
+          <w:lang w:val="en-US"/>
+        </w:rPr>
+        <w:t xml:space="preserve"> -H "Authorization: {token}"  "</w:t>
+      </w:r>
+      <w:r>
+        <w:rPr>
+          <w:lang w:val="en-US"/>
+        </w:rPr>
+        <w:t>{</w:t>
+      </w:r>
+      <w:proofErr w:type="spellStart"/>
+      <w:r>
+        <w:rPr>
+          <w:lang w:val="en-US"/>
+        </w:rPr>
+        <w:t>project_root</w:t>
+      </w:r>
+      <w:proofErr w:type="spellEnd"/>
+      <w:r>
+        <w:rPr>
+          <w:lang w:val="en-US"/>
+        </w:rPr>
+        <w:t>}</w:t>
+      </w:r>
+      <w:r>
+        <w:rPr>
+          <w:lang w:val="en-US"/>
+        </w:rPr>
+        <w:t>/</w:t>
+      </w:r>
+      <w:proofErr w:type="spellStart"/>
+      <w:r>
+        <w:rPr>
+          <w:lang w:val="en-US"/>
+        </w:rPr>
+        <w:t>tournament-results?tournament_id</w:t>
+      </w:r>
+      <w:proofErr w:type="spellEnd"/>
+      <w:r>
+        <w:rPr>
+          <w:lang w:val="en-US"/>
+        </w:rPr>
+        <w:t>={id}</w:t>
+      </w:r>
+      <w:r>
+        <w:rPr>
+          <w:lang w:val="en-US"/>
+        </w:rPr>
+        <w:t>"</w:t>
+      </w:r>
+    </w:p>
+    <w:p>
+      <w:proofErr w:type="gramStart"/>
+      <w:r>
+        <w:rPr>
+          <w:lang w:val="en-US"/>
+        </w:rPr>
+        <w:t>curl</w:t>
+      </w:r>
+      <w:proofErr w:type="gramEnd"/>
+      <w:r>
+        <w:rPr>
+          <w:lang w:val="en-US"/>
+        </w:rPr>
+        <w:t xml:space="preserve"> -H "Authorization: {token}"  "{</w:t>
+      </w:r>
+      <w:proofErr w:type="spellStart"/>
+      <w:r>
+        <w:rPr>
+          <w:lang w:val="en-US"/>
+        </w:rPr>
+        <w:t>project_root</w:t>
+      </w:r>
+      <w:proofErr w:type="spellEnd"/>
+      <w:r>
+        <w:rPr>
+          <w:lang w:val="en-US"/>
+        </w:rPr>
+        <w:t>}</w:t>
+      </w:r>
+      <w:r>
+        <w:rPr>
+          <w:lang w:val="en-US"/>
+        </w:rPr>
+        <w:t>/</w:t>
+      </w:r>
+      <w:proofErr w:type="spellStart"/>
+      <w:r>
+        <w:rPr>
+          <w:lang w:val="en-US"/>
+        </w:rPr>
+        <w:t>show-tournaments?str</w:t>
+      </w:r>
+      <w:proofErr w:type="spellEnd"/>
+      <w:r>
+        <w:rPr>
+          <w:lang w:val="en-US"/>
+        </w:rPr>
+        <w:t>={</w:t>
+      </w:r>
+      <w:proofErr w:type="spellStart"/>
+      <w:r>
+        <w:rPr>
+          <w:lang w:val="en-US"/>
+        </w:rPr>
+        <w:t>substr</w:t>
+      </w:r>
+      <w:proofErr w:type="spellEnd"/>
+      <w:r>
+        <w:rPr>
+          <w:lang w:val="en-US"/>
+        </w:rPr>
+        <w:t>}</w:t>
+      </w:r>
+      <w:r>
+        <w:rPr>
+          <w:lang w:val="en-US"/>
+        </w:rPr>
+        <w:t>"</w:t>
+      </w:r>
+    </w:p>
+    <w:p>
+      <w:r>
+        <w:lastRenderedPageBreak/>
+        <w:t>Примери:</w:t>
+      </w:r>
+    </w:p>
+    <w:p>
+      <w:r>
+        <w:t xml:space="preserve">curl -H "Authorization: </w:t>
+      </w:r>
+      <w:proofErr w:type="spellStart"/>
+      <w:r>
+        <w:rPr>
+          <w:lang w:val="en-US"/>
+        </w:rPr>
+        <w:t>someToken</w:t>
+      </w:r>
+      <w:proofErr w:type="spellEnd"/>
+      <w:r>
+        <w:t>" "http://loc</w:t>
+      </w:r>
+      <w:r>
+        <w:t>alhost/tournament-manager</w:t>
+      </w:r>
+      <w:r>
+        <w:t>/show-tournaments?str=c"</w:t>
+      </w:r>
+    </w:p>
+    <w:p>
+      <w:r>
+        <w:t>﻿ID,Име</w:t>
+      </w:r>
+    </w:p>
+    <w:p>
+      <w:r>
+        <w:t>3,"CS 2 турнир"</w:t>
+      </w:r>
+    </w:p>
+    <w:p>
+      <w:r>
+        <w:t xml:space="preserve">curl -H "Authorization: </w:t>
+      </w:r>
+      <w:proofErr w:type="spellStart"/>
+      <w:r>
+        <w:rPr>
+          <w:lang w:val="en-US"/>
+        </w:rPr>
+        <w:t>someToken</w:t>
+      </w:r>
+      <w:proofErr w:type="spellEnd"/>
+      <w:r>
+        <w:t>" "http://loc</w:t>
+      </w:r>
+      <w:r>
+        <w:t>alhost/tournament-manager</w:t>
+      </w:r>
+      <w:r>
+        <w:t>/tournament-results?tournament_id=3"</w:t>
+      </w:r>
+    </w:p>
+    <w:p>
+      <w:r>
+        <w:t>﻿Участници,Позиция</w:t>
+      </w:r>
+    </w:p>
+    <w:p>
+      <w:r>
+        <w:t>aj,"ще се определи"</w:t>
+      </w:r>
+    </w:p>
+    <w:p>
+      <w:pPr>
         <w:rPr>
           <w:sz w:val="18"/>
           <w:szCs w:val="18"/>
+          <w:lang w:val="en-US"/>
+        </w:rPr>
+      </w:pPr>
+    </w:p>
+    <w:p>
+      <w:pPr>
+        <w:pStyle w:val="Heading2"/>
+        <w:rPr>
+          <w:sz w:val="18"/>
+          <w:szCs w:val="18"/>
         </w:rPr>
       </w:pPr>
       <w:r>
@@ -2350,8 +3162,6 @@
         </w:rPr>
         <w:t>Примерни данни</w:t>
       </w:r>
-      <w:bookmarkStart w:id="2" w:name="_GoBack"/>
-      <w:bookmarkEnd w:id="2"/>
     </w:p>
     <w:p>
       <w:pPr>
@@ -2532,7 +3342,7 @@
       <w:r>
         <w:t xml:space="preserve">Всички имейл адреси са от вида </w:t>
       </w:r>
-      <w:hyperlink r:id="rId5" w:history="1">
+      <w:hyperlink r:id="rId9" w:history="1">
         <w:r>
           <w:rPr>
             <w:rStyle w:val="Hyperlink"/>
@@ -2547,7 +3357,7 @@
         </w:rPr>
         <w:t xml:space="preserve">, </w:t>
       </w:r>
-      <w:hyperlink r:id="rId6" w:history="1">
+      <w:hyperlink r:id="rId10" w:history="1">
         <w:r>
           <w:rPr>
             <w:rStyle w:val="Hyperlink"/>
@@ -2893,7 +3703,6 @@
         </w:rPr>
       </w:pPr>
       <w:r>
-        <w:lastRenderedPageBreak/>
         <w:t xml:space="preserve">В директорията </w:t>
       </w:r>
       <w:proofErr w:type="spellStart"/>
@@ -3072,6 +3881,7 @@
           <w:sz w:val="22"/>
           <w:szCs w:val="22"/>
         </w:rPr>
+        <w:lastRenderedPageBreak/>
         <w:t xml:space="preserve">9. </w:t>
       </w:r>
       <w:r>
@@ -3246,6 +4056,7 @@
         <w:rPr>
           <w:sz w:val="18"/>
           <w:szCs w:val="18"/>
+          <w:lang w:val="en-US"/>
         </w:rPr>
       </w:pPr>
       <w:r>
@@ -3258,6 +4069,73 @@
       </w:r>
     </w:p>
     <w:p>
+      <w:r>
+        <w:t xml:space="preserve">Калоян – Научих основните на работата с </w:t>
+      </w:r>
+      <w:proofErr w:type="spellStart"/>
+      <w:r>
+        <w:rPr>
+          <w:lang w:val="en-US"/>
+        </w:rPr>
+        <w:t>xampp</w:t>
+      </w:r>
+      <w:proofErr w:type="spellEnd"/>
+      <w:r>
+        <w:t xml:space="preserve">, програма с която не съм се занимавал преди курса, упражних и научих нови неща за работа с </w:t>
+      </w:r>
+      <w:proofErr w:type="spellStart"/>
+      <w:r>
+        <w:rPr>
+          <w:lang w:val="en-US"/>
+        </w:rPr>
+        <w:t>git</w:t>
+      </w:r>
+      <w:proofErr w:type="spellEnd"/>
+      <w:r>
+        <w:rPr>
+          <w:lang w:val="en-US"/>
+        </w:rPr>
+        <w:t xml:space="preserve"> </w:t>
+      </w:r>
+      <w:proofErr w:type="spellStart"/>
+      <w:r>
+        <w:rPr>
+          <w:lang w:val="en-US"/>
+        </w:rPr>
+        <w:t>i</w:t>
+      </w:r>
+      <w:proofErr w:type="spellEnd"/>
+      <w:r>
+        <w:rPr>
+          <w:lang w:val="en-US"/>
+        </w:rPr>
+        <w:t xml:space="preserve"> </w:t>
+      </w:r>
+      <w:proofErr w:type="spellStart"/>
+      <w:r>
+        <w:rPr>
+          <w:lang w:val="en-US"/>
+        </w:rPr>
+        <w:t>Github</w:t>
+      </w:r>
+      <w:proofErr w:type="spellEnd"/>
+      <w:r>
+        <w:t xml:space="preserve">, както и за </w:t>
+      </w:r>
+      <w:r>
+        <w:rPr>
+          <w:lang w:val="en-US"/>
+        </w:rPr>
+        <w:t>API</w:t>
+      </w:r>
+      <w:r>
+        <w:t>.</w:t>
+      </w:r>
+      <w:r>
+        <w:t xml:space="preserve"> </w:t>
+      </w:r>
+    </w:p>
+    <w:p>
       <w:pPr>
         <w:pStyle w:val="Heading2"/>
         <w:rPr>
@@ -3314,73 +4192,59 @@
           <w:i/>
           <w:iCs/>
         </w:rPr>
-        <w:t xml:space="preserve">12.1 – Линк към проекта в </w:t>
-      </w:r>
-      <w:proofErr w:type="spellStart"/>
-      <w:r>
-        <w:rPr>
+        <w:t>12.1 – Линк към проекта в гитлаб на фми (</w:t>
+      </w:r>
+      <w:r>
+        <w:fldChar w:fldCharType="begin"/>
+      </w:r>
+      <w:r>
+        <w:instrText xml:space="preserve"> HYPERLINK "https://gitlab.hss.fmi.u</w:instrText>
+      </w:r>
+      <w:r>
+        <w:instrText xml:space="preserve">ni-sofia.bg/" </w:instrText>
+      </w:r>
+      <w:r>
+        <w:fldChar w:fldCharType="separate"/>
+      </w:r>
+      <w:r>
+        <w:rPr>
+          <w:rStyle w:val="Hyperlink"/>
           <w:i/>
           <w:iCs/>
         </w:rPr>
-        <w:t>гитлаб</w:t>
-      </w:r>
-      <w:proofErr w:type="spellEnd"/>
-      <w:r>
-        <w:rPr>
+        <w:t>https://gitlab.hss.fmi.uni-sofia.bg/</w:t>
+      </w:r>
+      <w:r>
+        <w:rPr>
+          <w:rStyle w:val="Hyperlink"/>
           <w:i/>
           <w:iCs/>
         </w:rPr>
-        <w:t xml:space="preserve"> на </w:t>
-      </w:r>
-      <w:proofErr w:type="spellStart"/>
+        <w:fldChar w:fldCharType="end"/>
+      </w:r>
       <w:r>
         <w:rPr>
           <w:i/>
           <w:iCs/>
         </w:rPr>
-        <w:t>фми</w:t>
-      </w:r>
-      <w:proofErr w:type="spellEnd"/>
-      <w:r>
+        <w:t xml:space="preserve"> - след като си направите акаунт пишете, да ви го активираме).</w:t>
+      </w:r>
+    </w:p>
+    <w:p>
+      <w:pPr>
         <w:rPr>
           <w:i/>
           <w:iCs/>
         </w:rPr>
-        <w:t xml:space="preserve"> (</w:t>
-      </w:r>
-      <w:hyperlink r:id="rId7" w:history="1">
-        <w:r>
-          <w:rPr>
-            <w:rStyle w:val="Hyperlink"/>
-            <w:i/>
-            <w:iCs/>
-          </w:rPr>
-          <w:t>https://gitlab.hss.fmi.uni-sofia.bg/</w:t>
-        </w:r>
-      </w:hyperlink>
+      </w:pPr>
       <w:r>
         <w:rPr>
           <w:i/>
           <w:iCs/>
         </w:rPr>
-        <w:t xml:space="preserve"> - след като си направите акаунт пишете, да ви го активираме).</w:t>
-      </w:r>
-    </w:p>
-    <w:p>
-      <w:pPr>
-        <w:rPr>
-          <w:i/>
-          <w:iCs/>
-        </w:rPr>
-      </w:pPr>
-      <w:r>
-        <w:rPr>
-          <w:i/>
-          <w:iCs/>
-        </w:rPr>
         <w:t xml:space="preserve">12.2. Линк към разгърнатият проект във ФМИ – нещо от вида </w:t>
       </w:r>
-      <w:hyperlink r:id="rId8" w:history="1">
+      <w:hyperlink r:id="rId11" w:history="1">
         <w:r>
           <w:rPr>
             <w:rStyle w:val="Hyperlink"/>
@@ -3924,6 +4788,7 @@
         <w:rPr>
           <w:lang w:bidi="he-IL"/>
         </w:rPr>
+        <w:lastRenderedPageBreak/>
         <w:t>Финален проект</w:t>
       </w:r>
       <w:r>
@@ -4209,7 +5074,6 @@
         <w:rPr>
           <w:lang w:bidi="he-IL"/>
         </w:rPr>
-        <w:lastRenderedPageBreak/>
         <w:t>Финален проект</w:t>
       </w:r>
       <w:r>
@@ -4389,6 +5253,7 @@
         <w:rPr>
           <w:lang w:bidi="he-IL"/>
         </w:rPr>
+        <w:lastRenderedPageBreak/>
         <w:t>II. ФУНКЦИОНАЛНИ ХАРАКТЕРИСТИКИ: Съгласуват се с преподавателя - избира се темата, а каква да е функционалността - питате на лекции или се явявате на предварителна защита, където съгласувате обхвата на изискванията;</w:t>
       </w:r>
       <w:r>
@@ -4930,6 +5795,7 @@
           <w:highlight w:val="yellow"/>
         </w:rPr>
         <w:tab/>
+        <w:t>DocumentRoot   "C:/</w:t>
       </w:r>
       <w:proofErr w:type="spellStart"/>
       <w:r>
@@ -4939,8 +5805,9 @@
           <w:sz w:val="20"/>
           <w:szCs w:val="20"/>
           <w:highlight w:val="yellow"/>
-        </w:rPr>
-        <w:t>DocumentRoot</w:t>
+          <w:lang w:val="en-US"/>
+        </w:rPr>
+        <w:t>xampp</w:t>
       </w:r>
       <w:proofErr w:type="spellEnd"/>
       <w:r>
@@ -4951,52 +5818,7 @@
           <w:szCs w:val="20"/>
           <w:highlight w:val="yellow"/>
         </w:rPr>
-        <w:t xml:space="preserve">   "C:/</w:t>
-      </w:r>
-      <w:proofErr w:type="spellStart"/>
-      <w:r>
-        <w:rPr>
-          <w:rFonts w:ascii="Courier New" w:hAnsi="Courier New" w:cs="Courier New"/>
-          <w:color w:val="808080"/>
-          <w:sz w:val="20"/>
-          <w:szCs w:val="20"/>
-          <w:highlight w:val="yellow"/>
-          <w:lang w:val="en-US"/>
-        </w:rPr>
-        <w:t>xampp</w:t>
-      </w:r>
-      <w:proofErr w:type="spellEnd"/>
-      <w:r>
-        <w:rPr>
-          <w:rFonts w:ascii="Courier New" w:hAnsi="Courier New" w:cs="Courier New"/>
-          <w:color w:val="808080"/>
-          <w:sz w:val="20"/>
-          <w:szCs w:val="20"/>
-          <w:highlight w:val="yellow"/>
-        </w:rPr>
-        <w:t>/</w:t>
-      </w:r>
-      <w:proofErr w:type="spellStart"/>
-      <w:r>
-        <w:rPr>
-          <w:rFonts w:ascii="Courier New" w:hAnsi="Courier New" w:cs="Courier New"/>
-          <w:color w:val="808080"/>
-          <w:sz w:val="20"/>
-          <w:szCs w:val="20"/>
-          <w:highlight w:val="yellow"/>
-        </w:rPr>
-        <w:t>htdocs</w:t>
-      </w:r>
-      <w:proofErr w:type="spellEnd"/>
-      <w:r>
-        <w:rPr>
-          <w:rFonts w:ascii="Courier New" w:hAnsi="Courier New" w:cs="Courier New"/>
-          <w:color w:val="808080"/>
-          <w:sz w:val="20"/>
-          <w:szCs w:val="20"/>
-          <w:highlight w:val="yellow"/>
-        </w:rPr>
-        <w:t>/w11ref.w3c.fmi.uni-sofia.bg/_PUB"</w:t>
+        <w:t>/htdocs/w11ref.w3c.fmi.uni-sofia.bg/_PUB"</w:t>
       </w:r>
     </w:p>
     <w:p>
@@ -5211,7 +6033,6 @@
           <w:szCs w:val="20"/>
           <w:highlight w:val="yellow"/>
         </w:rPr>
-        <w:lastRenderedPageBreak/>
         <w:tab/>
       </w:r>
       <w:r>
@@ -5725,6 +6546,7 @@
           <w:szCs w:val="20"/>
           <w:highlight w:val="yellow"/>
         </w:rPr>
+        <w:lastRenderedPageBreak/>
         <w:tab/>
       </w:r>
       <w:r>
@@ -7079,7 +7901,47 @@
           <w:szCs w:val="20"/>
           <w:highlight w:val="yellow"/>
         </w:rPr>
-        <w:t>'</w:t>
+        <w:t>'vhosts_DocumentRoot'</w:t>
+      </w:r>
+      <w:r>
+        <w:rPr>
+          <w:rFonts w:ascii="Courier New" w:hAnsi="Courier New" w:cs="Courier New"/>
+          <w:color w:val="000000"/>
+          <w:sz w:val="20"/>
+          <w:szCs w:val="20"/>
+          <w:highlight w:val="yellow"/>
+        </w:rPr>
+        <w:t xml:space="preserve"> </w:t>
+      </w:r>
+      <w:r>
+        <w:rPr>
+          <w:rFonts w:ascii="Courier New" w:hAnsi="Courier New" w:cs="Courier New"/>
+          <w:color w:val="8000FF"/>
+          <w:sz w:val="20"/>
+          <w:szCs w:val="20"/>
+          <w:highlight w:val="yellow"/>
+        </w:rPr>
+        <w:t>=&gt;</w:t>
+      </w:r>
+      <w:r>
+        <w:rPr>
+          <w:rFonts w:ascii="Courier New" w:hAnsi="Courier New" w:cs="Courier New"/>
+          <w:color w:val="000000"/>
+          <w:sz w:val="20"/>
+          <w:szCs w:val="20"/>
+          <w:highlight w:val="yellow"/>
+        </w:rPr>
+        <w:t xml:space="preserve"> </w:t>
+      </w:r>
+      <w:r>
+        <w:rPr>
+          <w:rFonts w:ascii="Courier New" w:hAnsi="Courier New" w:cs="Courier New"/>
+          <w:color w:val="808080"/>
+          <w:sz w:val="20"/>
+          <w:szCs w:val="20"/>
+          <w:highlight w:val="yellow"/>
+        </w:rPr>
+        <w:t>'C:/</w:t>
       </w:r>
       <w:proofErr w:type="spellStart"/>
       <w:r>
@@ -7089,8 +7951,9 @@
           <w:sz w:val="20"/>
           <w:szCs w:val="20"/>
           <w:highlight w:val="yellow"/>
-        </w:rPr>
-        <w:t>vhosts_DocumentRoot</w:t>
+          <w:lang w:val="en-US"/>
+        </w:rPr>
+        <w:t>xampp</w:t>
       </w:r>
       <w:proofErr w:type="spellEnd"/>
       <w:r>
@@ -7101,92 +7964,7 @@
           <w:szCs w:val="20"/>
           <w:highlight w:val="yellow"/>
         </w:rPr>
-        <w:t>'</w:t>
-      </w:r>
-      <w:r>
-        <w:rPr>
-          <w:rFonts w:ascii="Courier New" w:hAnsi="Courier New" w:cs="Courier New"/>
-          <w:color w:val="000000"/>
-          <w:sz w:val="20"/>
-          <w:szCs w:val="20"/>
-          <w:highlight w:val="yellow"/>
-        </w:rPr>
-        <w:t xml:space="preserve"> </w:t>
-      </w:r>
-      <w:r>
-        <w:rPr>
-          <w:rFonts w:ascii="Courier New" w:hAnsi="Courier New" w:cs="Courier New"/>
-          <w:color w:val="8000FF"/>
-          <w:sz w:val="20"/>
-          <w:szCs w:val="20"/>
-          <w:highlight w:val="yellow"/>
-        </w:rPr>
-        <w:t>=&gt;</w:t>
-      </w:r>
-      <w:r>
-        <w:rPr>
-          <w:rFonts w:ascii="Courier New" w:hAnsi="Courier New" w:cs="Courier New"/>
-          <w:color w:val="000000"/>
-          <w:sz w:val="20"/>
-          <w:szCs w:val="20"/>
-          <w:highlight w:val="yellow"/>
-        </w:rPr>
-        <w:t xml:space="preserve"> </w:t>
-      </w:r>
-      <w:r>
-        <w:rPr>
-          <w:rFonts w:ascii="Courier New" w:hAnsi="Courier New" w:cs="Courier New"/>
-          <w:color w:val="808080"/>
-          <w:sz w:val="20"/>
-          <w:szCs w:val="20"/>
-          <w:highlight w:val="yellow"/>
-        </w:rPr>
-        <w:t>'C:/</w:t>
-      </w:r>
-      <w:proofErr w:type="spellStart"/>
-      <w:r>
-        <w:rPr>
-          <w:rFonts w:ascii="Courier New" w:hAnsi="Courier New" w:cs="Courier New"/>
-          <w:color w:val="808080"/>
-          <w:sz w:val="20"/>
-          <w:szCs w:val="20"/>
-          <w:highlight w:val="yellow"/>
-          <w:lang w:val="en-US"/>
-        </w:rPr>
-        <w:t>xampp</w:t>
-      </w:r>
-      <w:proofErr w:type="spellEnd"/>
-      <w:r>
-        <w:rPr>
-          <w:rFonts w:ascii="Courier New" w:hAnsi="Courier New" w:cs="Courier New"/>
-          <w:color w:val="808080"/>
-          <w:sz w:val="20"/>
-          <w:szCs w:val="20"/>
-          <w:highlight w:val="yellow"/>
-        </w:rPr>
-        <w:t>/</w:t>
-      </w:r>
-      <w:proofErr w:type="spellStart"/>
-      <w:r>
-        <w:rPr>
-          <w:rFonts w:ascii="Courier New" w:hAnsi="Courier New" w:cs="Courier New"/>
-          <w:color w:val="808080"/>
-          <w:sz w:val="20"/>
-          <w:szCs w:val="20"/>
-          <w:highlight w:val="yellow"/>
-        </w:rPr>
-        <w:t>htdocs</w:t>
-      </w:r>
-      <w:proofErr w:type="spellEnd"/>
-      <w:r>
-        <w:rPr>
-          <w:rFonts w:ascii="Courier New" w:hAnsi="Courier New" w:cs="Courier New"/>
-          <w:color w:val="808080"/>
-          <w:sz w:val="20"/>
-          <w:szCs w:val="20"/>
-          <w:highlight w:val="yellow"/>
-        </w:rPr>
-        <w:t>/w11ref.w3c.fmi.uni-sofia.bg/_PUB'</w:t>
+        <w:t>/htdocs/w11ref.w3c.fmi.uni-sofia.bg/_PUB'</w:t>
       </w:r>
       <w:r>
         <w:rPr>
@@ -7796,7 +8574,6 @@
           <w:color w:val="00B050"/>
           <w:lang w:bidi="he-IL"/>
         </w:rPr>
-        <w:lastRenderedPageBreak/>
         <w:t>//or config.ini -&gt; със същите настройки;</w:t>
       </w:r>
     </w:p>
@@ -7941,6 +8718,7 @@
           <w:iCs/>
           <w:lang w:bidi="he-IL"/>
         </w:rPr>
+        <w:lastRenderedPageBreak/>
         <w:t>Name of Instructor, assistant: Name-Of-Assistant";</w:t>
       </w:r>
     </w:p>
@@ -7963,7 +8741,7 @@
       <w:r>
         <w:t>“</w:t>
       </w:r>
-      <w:hyperlink r:id="rId9" w:history="1">
+      <w:hyperlink r:id="rId12" w:history="1">
         <w:r>
           <w:rPr>
             <w:lang w:bidi="he-IL"/>
@@ -8308,9 +9086,59 @@
 </w:document>
 </file>
 
+<file path=word/endnotes.xml><?xml version="1.0" encoding="utf-8"?>
+<w:endnotes xmlns:wpc="http://schemas.microsoft.com/office/word/2010/wordprocessingCanvas" xmlns:mc="http://schemas.openxmlformats.org/markup-compatibility/2006" xmlns:o="urn:schemas-microsoft-com:office:office" xmlns:r="http://schemas.openxmlformats.org/officeDocument/2006/relationships" xmlns:m="http://schemas.openxmlformats.org/officeDocument/2006/math" xmlns:v="urn:schemas-microsoft-com:vml" xmlns:wp14="http://schemas.microsoft.com/office/word/2010/wordprocessingDrawing" xmlns:wp="http://schemas.openxmlformats.org/drawingml/2006/wordprocessingDrawing" xmlns:w10="urn:schemas-microsoft-com:office:word" xmlns:w="http://schemas.openxmlformats.org/wordprocessingml/2006/main" xmlns:w14="http://schemas.microsoft.com/office/word/2010/wordml" xmlns:wpg="http://schemas.microsoft.com/office/word/2010/wordprocessingGroup" xmlns:wpi="http://schemas.microsoft.com/office/word/2010/wordprocessingInk" xmlns:wne="http://schemas.microsoft.com/office/word/2006/wordml" xmlns:wps="http://schemas.microsoft.com/office/word/2010/wordprocessingShape" mc:Ignorable="w14 wp14">
+  <w:endnote w:type="separator" w:id="-1">
+    <w:p>
+      <w:pPr>
+        <w:spacing w:after="0" w:line="240" w:lineRule="auto"/>
+      </w:pPr>
+      <w:r>
+        <w:separator/>
+      </w:r>
+    </w:p>
+  </w:endnote>
+  <w:endnote w:type="continuationSeparator" w:id="0">
+    <w:p>
+      <w:pPr>
+        <w:spacing w:after="0" w:line="240" w:lineRule="auto"/>
+      </w:pPr>
+      <w:r>
+        <w:continuationSeparator/>
+      </w:r>
+    </w:p>
+  </w:endnote>
+</w:endnotes>
+</file>
+
+<file path=word/footnotes.xml><?xml version="1.0" encoding="utf-8"?>
+<w:footnotes xmlns:wpc="http://schemas.microsoft.com/office/word/2010/wordprocessingCanvas" xmlns:mc="http://schemas.openxmlformats.org/markup-compatibility/2006" xmlns:o="urn:schemas-microsoft-com:office:office" xmlns:r="http://schemas.openxmlformats.org/officeDocument/2006/relationships" xmlns:m="http://schemas.openxmlformats.org/officeDocument/2006/math" xmlns:v="urn:schemas-microsoft-com:vml" xmlns:wp14="http://schemas.microsoft.com/office/word/2010/wordprocessingDrawing" xmlns:wp="http://schemas.openxmlformats.org/drawingml/2006/wordprocessingDrawing" xmlns:w10="urn:schemas-microsoft-com:office:word" xmlns:w="http://schemas.openxmlformats.org/wordprocessingml/2006/main" xmlns:w14="http://schemas.microsoft.com/office/word/2010/wordml" xmlns:wpg="http://schemas.microsoft.com/office/word/2010/wordprocessingGroup" xmlns:wpi="http://schemas.microsoft.com/office/word/2010/wordprocessingInk" xmlns:wne="http://schemas.microsoft.com/office/word/2006/wordml" xmlns:wps="http://schemas.microsoft.com/office/word/2010/wordprocessingShape" mc:Ignorable="w14 wp14">
+  <w:footnote w:type="separator" w:id="-1">
+    <w:p>
+      <w:pPr>
+        <w:spacing w:after="0" w:line="240" w:lineRule="auto"/>
+      </w:pPr>
+      <w:r>
+        <w:separator/>
+      </w:r>
+    </w:p>
+  </w:footnote>
+  <w:footnote w:type="continuationSeparator" w:id="0">
+    <w:p>
+      <w:pPr>
+        <w:spacing w:after="0" w:line="240" w:lineRule="auto"/>
+      </w:pPr>
+      <w:r>
+        <w:continuationSeparator/>
+      </w:r>
+    </w:p>
+  </w:footnote>
+</w:footnotes>
+</file>
+
 <file path=word/numbering.xml><?xml version="1.0" encoding="utf-8"?>
-<w:numbering xmlns:wpc="http://schemas.microsoft.com/office/word/2010/wordprocessingCanvas" xmlns:cx="http://schemas.microsoft.com/office/drawing/2014/chartex" xmlns:mc="http://schemas.openxmlformats.org/markup-compatibility/2006" xmlns:o="urn:schemas-microsoft-com:office:office" xmlns:r="http://schemas.openxmlformats.org/officeDocument/2006/relationships" xmlns:m="http://schemas.openxmlformats.org/officeDocument/2006/math" xmlns:v="urn:schemas-microsoft-com:vml" xmlns:wp14="http://schemas.microsoft.com/office/word/2010/wordprocessingDrawing" xmlns:wp="http://schemas.openxmlformats.org/drawingml/2006/wordprocessingDrawing" xmlns:w10="urn:schemas-microsoft-com:office:word" xmlns:w="http://schemas.openxmlformats.org/wordprocessingml/2006/main" xmlns:w14="http://schemas.microsoft.com/office/word/2010/wordml" xmlns:w15="http://schemas.microsoft.com/office/word/2012/wordml" xmlns:w16se="http://schemas.microsoft.com/office/word/2015/wordml/symex" xmlns:wpg="http://schemas.microsoft.com/office/word/2010/wordprocessingGroup" xmlns:wpi="http://schemas.microsoft.com/office/word/2010/wordprocessingInk" xmlns:wne="http://schemas.microsoft.com/office/word/2006/wordml" xmlns:wps="http://schemas.microsoft.com/office/word/2010/wordprocessingShape" mc:Ignorable="w14 w15 w16se wp14">
-  <w:abstractNum w:abstractNumId="0" w15:restartNumberingAfterBreak="0">
+<w:numbering xmlns:wpc="http://schemas.microsoft.com/office/word/2010/wordprocessingCanvas" xmlns:mc="http://schemas.openxmlformats.org/markup-compatibility/2006" xmlns:o="urn:schemas-microsoft-com:office:office" xmlns:r="http://schemas.openxmlformats.org/officeDocument/2006/relationships" xmlns:m="http://schemas.openxmlformats.org/officeDocument/2006/math" xmlns:v="urn:schemas-microsoft-com:vml" xmlns:wp14="http://schemas.microsoft.com/office/word/2010/wordprocessingDrawing" xmlns:wp="http://schemas.openxmlformats.org/drawingml/2006/wordprocessingDrawing" xmlns:w10="urn:schemas-microsoft-com:office:word" xmlns:w="http://schemas.openxmlformats.org/wordprocessingml/2006/main" xmlns:w14="http://schemas.microsoft.com/office/word/2010/wordml" xmlns:wpg="http://schemas.microsoft.com/office/word/2010/wordprocessingGroup" xmlns:wpi="http://schemas.microsoft.com/office/word/2010/wordprocessingInk" xmlns:wne="http://schemas.microsoft.com/office/word/2006/wordml" xmlns:wps="http://schemas.microsoft.com/office/word/2010/wordprocessingShape" mc:Ignorable="w14 wp14">
+  <w:abstractNum w:abstractNumId="0">
     <w:nsid w:val="04B12A69"/>
     <w:multiLevelType w:val="hybridMultilevel"/>
     <w:tmpl w:val="656415A4"/>
@@ -8399,7 +9227,7 @@
       </w:pPr>
     </w:lvl>
   </w:abstractNum>
-  <w:abstractNum w:abstractNumId="1" w15:restartNumberingAfterBreak="0">
+  <w:abstractNum w:abstractNumId="1">
     <w:nsid w:val="0F9F74F6"/>
     <w:multiLevelType w:val="hybridMultilevel"/>
     <w:tmpl w:val="83B2BAF4"/>
@@ -8512,7 +9340,7 @@
       </w:rPr>
     </w:lvl>
   </w:abstractNum>
-  <w:abstractNum w:abstractNumId="2" w15:restartNumberingAfterBreak="0">
+  <w:abstractNum w:abstractNumId="2">
     <w:nsid w:val="11D4196B"/>
     <w:multiLevelType w:val="hybridMultilevel"/>
     <w:tmpl w:val="B366BD8C"/>
@@ -8598,7 +9426,7 @@
       </w:pPr>
     </w:lvl>
   </w:abstractNum>
-  <w:abstractNum w:abstractNumId="3" w15:restartNumberingAfterBreak="0">
+  <w:abstractNum w:abstractNumId="3">
     <w:nsid w:val="27732A9B"/>
     <w:multiLevelType w:val="multilevel"/>
     <w:tmpl w:val="0409001F"/>
@@ -8684,7 +9512,7 @@
       </w:pPr>
     </w:lvl>
   </w:abstractNum>
-  <w:abstractNum w:abstractNumId="4" w15:restartNumberingAfterBreak="0">
+  <w:abstractNum w:abstractNumId="4">
     <w:nsid w:val="2CF56644"/>
     <w:multiLevelType w:val="hybridMultilevel"/>
     <w:tmpl w:val="43EAE156"/>
@@ -8798,7 +9626,7 @@
       </w:rPr>
     </w:lvl>
   </w:abstractNum>
-  <w:abstractNum w:abstractNumId="5" w15:restartNumberingAfterBreak="0">
+  <w:abstractNum w:abstractNumId="5">
     <w:nsid w:val="2EC155CA"/>
     <w:multiLevelType w:val="hybridMultilevel"/>
     <w:tmpl w:val="D062D96E"/>
@@ -8888,7 +9716,7 @@
       </w:pPr>
     </w:lvl>
   </w:abstractNum>
-  <w:abstractNum w:abstractNumId="6" w15:restartNumberingAfterBreak="0">
+  <w:abstractNum w:abstractNumId="6">
     <w:nsid w:val="39B934AE"/>
     <w:multiLevelType w:val="hybridMultilevel"/>
     <w:tmpl w:val="C8306BBE"/>
@@ -8978,7 +9806,7 @@
       </w:pPr>
     </w:lvl>
   </w:abstractNum>
-  <w:abstractNum w:abstractNumId="7" w15:restartNumberingAfterBreak="0">
+  <w:abstractNum w:abstractNumId="7">
     <w:nsid w:val="415819F6"/>
     <w:multiLevelType w:val="hybridMultilevel"/>
     <w:tmpl w:val="725E2314"/>
@@ -9091,7 +9919,7 @@
       </w:rPr>
     </w:lvl>
   </w:abstractNum>
-  <w:abstractNum w:abstractNumId="8" w15:restartNumberingAfterBreak="0">
+  <w:abstractNum w:abstractNumId="8">
     <w:nsid w:val="4BEF580D"/>
     <w:multiLevelType w:val="hybridMultilevel"/>
     <w:tmpl w:val="8578F48E"/>
@@ -9204,7 +10032,7 @@
       </w:rPr>
     </w:lvl>
   </w:abstractNum>
-  <w:abstractNum w:abstractNumId="9" w15:restartNumberingAfterBreak="0">
+  <w:abstractNum w:abstractNumId="9">
     <w:nsid w:val="4D6F6379"/>
     <w:multiLevelType w:val="hybridMultilevel"/>
     <w:tmpl w:val="C5F00BB4"/>
@@ -9317,7 +10145,7 @@
       </w:rPr>
     </w:lvl>
   </w:abstractNum>
-  <w:abstractNum w:abstractNumId="10" w15:restartNumberingAfterBreak="0">
+  <w:abstractNum w:abstractNumId="10">
     <w:nsid w:val="621D3478"/>
     <w:multiLevelType w:val="hybridMultilevel"/>
     <w:tmpl w:val="287CA07C"/>
@@ -9430,7 +10258,120 @@
       </w:rPr>
     </w:lvl>
   </w:abstractNum>
-  <w:abstractNum w:abstractNumId="11" w15:restartNumberingAfterBreak="0">
+  <w:abstractNum w:abstractNumId="11">
+    <w:nsid w:val="621F17AA"/>
+    <w:multiLevelType w:val="multilevel"/>
+    <w:tmpl w:val="21285A5E"/>
+    <w:lvl w:ilvl="0">
+      <w:start w:val="1"/>
+      <w:numFmt w:val="decimal"/>
+      <w:lvlText w:val="%1."/>
+      <w:lvlJc w:val="left"/>
+      <w:pPr>
+        <w:tabs>
+          <w:tab w:val="num" w:pos="720"/>
+        </w:tabs>
+        <w:ind w:left="720" w:hanging="360"/>
+      </w:pPr>
+    </w:lvl>
+    <w:lvl w:ilvl="1" w:tentative="1">
+      <w:start w:val="1"/>
+      <w:numFmt w:val="decimal"/>
+      <w:lvlText w:val="%2."/>
+      <w:lvlJc w:val="left"/>
+      <w:pPr>
+        <w:tabs>
+          <w:tab w:val="num" w:pos="1440"/>
+        </w:tabs>
+        <w:ind w:left="1440" w:hanging="360"/>
+      </w:pPr>
+    </w:lvl>
+    <w:lvl w:ilvl="2" w:tentative="1">
+      <w:start w:val="1"/>
+      <w:numFmt w:val="decimal"/>
+      <w:lvlText w:val="%3."/>
+      <w:lvlJc w:val="left"/>
+      <w:pPr>
+        <w:tabs>
+          <w:tab w:val="num" w:pos="2160"/>
+        </w:tabs>
+        <w:ind w:left="2160" w:hanging="360"/>
+      </w:pPr>
+    </w:lvl>
+    <w:lvl w:ilvl="3" w:tentative="1">
+      <w:start w:val="1"/>
+      <w:numFmt w:val="decimal"/>
+      <w:lvlText w:val="%4."/>
+      <w:lvlJc w:val="left"/>
+      <w:pPr>
+        <w:tabs>
+          <w:tab w:val="num" w:pos="2880"/>
+        </w:tabs>
+        <w:ind w:left="2880" w:hanging="360"/>
+      </w:pPr>
+    </w:lvl>
+    <w:lvl w:ilvl="4" w:tentative="1">
+      <w:start w:val="1"/>
+      <w:numFmt w:val="decimal"/>
+      <w:lvlText w:val="%5."/>
+      <w:lvlJc w:val="left"/>
+      <w:pPr>
+        <w:tabs>
+          <w:tab w:val="num" w:pos="3600"/>
+        </w:tabs>
+        <w:ind w:left="3600" w:hanging="360"/>
+      </w:pPr>
+    </w:lvl>
+    <w:lvl w:ilvl="5" w:tentative="1">
+      <w:start w:val="1"/>
+      <w:numFmt w:val="decimal"/>
+      <w:lvlText w:val="%6."/>
+      <w:lvlJc w:val="left"/>
+      <w:pPr>
+        <w:tabs>
+          <w:tab w:val="num" w:pos="4320"/>
+        </w:tabs>
+        <w:ind w:left="4320" w:hanging="360"/>
+      </w:pPr>
+    </w:lvl>
+    <w:lvl w:ilvl="6" w:tentative="1">
+      <w:start w:val="1"/>
+      <w:numFmt w:val="decimal"/>
+      <w:lvlText w:val="%7."/>
+      <w:lvlJc w:val="left"/>
+      <w:pPr>
+        <w:tabs>
+          <w:tab w:val="num" w:pos="5040"/>
+        </w:tabs>
+        <w:ind w:left="5040" w:hanging="360"/>
+      </w:pPr>
+    </w:lvl>
+    <w:lvl w:ilvl="7" w:tentative="1">
+      <w:start w:val="1"/>
+      <w:numFmt w:val="decimal"/>
+      <w:lvlText w:val="%8."/>
+      <w:lvlJc w:val="left"/>
+      <w:pPr>
+        <w:tabs>
+          <w:tab w:val="num" w:pos="5760"/>
+        </w:tabs>
+        <w:ind w:left="5760" w:hanging="360"/>
+      </w:pPr>
+    </w:lvl>
+    <w:lvl w:ilvl="8" w:tentative="1">
+      <w:start w:val="1"/>
+      <w:numFmt w:val="decimal"/>
+      <w:lvlText w:val="%9."/>
+      <w:lvlJc w:val="left"/>
+      <w:pPr>
+        <w:tabs>
+          <w:tab w:val="num" w:pos="6480"/>
+        </w:tabs>
+        <w:ind w:left="6480" w:hanging="360"/>
+      </w:pPr>
+    </w:lvl>
+  </w:abstractNum>
+  <w:abstractNum w:abstractNumId="12">
     <w:nsid w:val="704846B8"/>
     <w:multiLevelType w:val="hybridMultilevel"/>
     <w:tmpl w:val="DB26C1EE"/>
@@ -9520,7 +10461,7 @@
       </w:pPr>
     </w:lvl>
   </w:abstractNum>
-  <w:abstractNum w:abstractNumId="12" w15:restartNumberingAfterBreak="0">
+  <w:abstractNum w:abstractNumId="13">
     <w:nsid w:val="79230737"/>
     <w:multiLevelType w:val="hybridMultilevel"/>
     <w:tmpl w:val="3AB475A0"/>
@@ -9658,13 +10599,13 @@
     <w:abstractNumId w:val="5"/>
   </w:num>
   <w:num w:numId="9">
-    <w:abstractNumId w:val="11"/>
+    <w:abstractNumId w:val="12"/>
   </w:num>
   <w:num w:numId="10">
     <w:abstractNumId w:val="6"/>
   </w:num>
   <w:num w:numId="11">
-    <w:abstractNumId w:val="12"/>
+    <w:abstractNumId w:val="13"/>
   </w:num>
   <w:num w:numId="12">
     <w:abstractNumId w:val="8"/>
@@ -9672,11 +10613,14 @@
   <w:num w:numId="13">
     <w:abstractNumId w:val="7"/>
   </w:num>
+  <w:num w:numId="14">
+    <w:abstractNumId w:val="11"/>
+  </w:num>
 </w:numbering>
 </file>
 
 <file path=word/styles.xml><?xml version="1.0" encoding="utf-8"?>
-<w:styles xmlns:mc="http://schemas.openxmlformats.org/markup-compatibility/2006" xmlns:r="http://schemas.openxmlformats.org/officeDocument/2006/relationships" xmlns:w="http://schemas.openxmlformats.org/wordprocessingml/2006/main" xmlns:w14="http://schemas.microsoft.com/office/word/2010/wordml" xmlns:w15="http://schemas.microsoft.com/office/word/2012/wordml" xmlns:w16se="http://schemas.microsoft.com/office/word/2015/wordml/symex" mc:Ignorable="w14 w15 w16se">
+<w:styles xmlns:mc="http://schemas.openxmlformats.org/markup-compatibility/2006" xmlns:r="http://schemas.openxmlformats.org/officeDocument/2006/relationships" xmlns:w="http://schemas.openxmlformats.org/wordprocessingml/2006/main" xmlns:w14="http://schemas.microsoft.com/office/word/2010/wordml" mc:Ignorable="w14">
   <w:docDefaults>
     <w:rPrDefault>
       <w:rPr>
@@ -9692,378 +10636,144 @@
       </w:pPr>
     </w:pPrDefault>
   </w:docDefaults>
-  <w:latentStyles w:defLockedState="0" w:defUIPriority="99" w:defSemiHidden="0" w:defUnhideWhenUsed="0" w:defQFormat="0" w:count="371">
-    <w:lsdException w:name="Normal" w:uiPriority="0" w:qFormat="1"/>
-    <w:lsdException w:name="heading 1" w:uiPriority="9" w:qFormat="1"/>
-    <w:lsdException w:name="heading 2" w:semiHidden="1" w:uiPriority="9" w:unhideWhenUsed="1" w:qFormat="1"/>
-    <w:lsdException w:name="heading 3" w:semiHidden="1" w:uiPriority="9" w:unhideWhenUsed="1" w:qFormat="1"/>
-    <w:lsdException w:name="heading 4" w:semiHidden="1" w:uiPriority="9" w:unhideWhenUsed="1" w:qFormat="1"/>
-    <w:lsdException w:name="heading 5" w:semiHidden="1" w:uiPriority="9" w:unhideWhenUsed="1" w:qFormat="1"/>
-    <w:lsdException w:name="heading 6" w:semiHidden="1" w:uiPriority="9" w:unhideWhenUsed="1" w:qFormat="1"/>
-    <w:lsdException w:name="heading 7" w:semiHidden="1" w:uiPriority="9" w:unhideWhenUsed="1" w:qFormat="1"/>
-    <w:lsdException w:name="heading 8" w:semiHidden="1" w:uiPriority="9" w:unhideWhenUsed="1" w:qFormat="1"/>
-    <w:lsdException w:name="heading 9" w:semiHidden="1" w:uiPriority="9" w:unhideWhenUsed="1" w:qFormat="1"/>
-    <w:lsdException w:name="index 1" w:semiHidden="1" w:unhideWhenUsed="1"/>
-    <w:lsdException w:name="index 2" w:semiHidden="1" w:unhideWhenUsed="1"/>
-    <w:lsdException w:name="index 3" w:semiHidden="1" w:unhideWhenUsed="1"/>
-    <w:lsdException w:name="index 4" w:semiHidden="1" w:unhideWhenUsed="1"/>
-    <w:lsdException w:name="index 5" w:semiHidden="1" w:unhideWhenUsed="1"/>
-    <w:lsdException w:name="index 6" w:semiHidden="1" w:unhideWhenUsed="1"/>
-    <w:lsdException w:name="index 7" w:semiHidden="1" w:unhideWhenUsed="1"/>
-    <w:lsdException w:name="index 8" w:semiHidden="1" w:unhideWhenUsed="1"/>
-    <w:lsdException w:name="index 9" w:semiHidden="1" w:unhideWhenUsed="1"/>
-    <w:lsdException w:name="toc 1" w:semiHidden="1" w:uiPriority="39" w:unhideWhenUsed="1"/>
-    <w:lsdException w:name="toc 2" w:semiHidden="1" w:uiPriority="39" w:unhideWhenUsed="1"/>
-    <w:lsdException w:name="toc 3" w:semiHidden="1" w:uiPriority="39" w:unhideWhenUsed="1"/>
-    <w:lsdException w:name="toc 4" w:semiHidden="1" w:uiPriority="39" w:unhideWhenUsed="1"/>
-    <w:lsdException w:name="toc 5" w:semiHidden="1" w:uiPriority="39" w:unhideWhenUsed="1"/>
-    <w:lsdException w:name="toc 6" w:semiHidden="1" w:uiPriority="39" w:unhideWhenUsed="1"/>
-    <w:lsdException w:name="toc 7" w:semiHidden="1" w:uiPriority="39" w:unhideWhenUsed="1"/>
-    <w:lsdException w:name="toc 8" w:semiHidden="1" w:uiPriority="39" w:unhideWhenUsed="1"/>
-    <w:lsdException w:name="toc 9" w:semiHidden="1" w:uiPriority="39" w:unhideWhenUsed="1"/>
-    <w:lsdException w:name="Normal Indent" w:semiHidden="1" w:unhideWhenUsed="1"/>
-    <w:lsdException w:name="footnote text" w:semiHidden="1" w:unhideWhenUsed="1"/>
-    <w:lsdException w:name="annotation text" w:semiHidden="1" w:unhideWhenUsed="1"/>
-    <w:lsdException w:name="header" w:semiHidden="1" w:unhideWhenUsed="1"/>
-    <w:lsdException w:name="footer" w:semiHidden="1" w:unhideWhenUsed="1"/>
-    <w:lsdException w:name="index heading" w:semiHidden="1" w:unhideWhenUsed="1"/>
-    <w:lsdException w:name="caption" w:semiHidden="1" w:uiPriority="35" w:unhideWhenUsed="1" w:qFormat="1"/>
-    <w:lsdException w:name="table of figures" w:semiHidden="1" w:unhideWhenUsed="1"/>
-    <w:lsdException w:name="envelope address" w:semiHidden="1" w:unhideWhenUsed="1"/>
-    <w:lsdException w:name="envelope return" w:semiHidden="1" w:unhideWhenUsed="1"/>
-    <w:lsdException w:name="footnote reference" w:semiHidden="1" w:unhideWhenUsed="1"/>
-    <w:lsdException w:name="annotation reference" w:semiHidden="1" w:unhideWhenUsed="1"/>
-    <w:lsdException w:name="line number" w:semiHidden="1" w:unhideWhenUsed="1"/>
-    <w:lsdException w:name="page number" w:semiHidden="1" w:unhideWhenUsed="1"/>
-    <w:lsdException w:name="endnote reference" w:semiHidden="1" w:unhideWhenUsed="1"/>
-    <w:lsdException w:name="endnote text" w:semiHidden="1" w:unhideWhenUsed="1"/>
-    <w:lsdException w:name="table of authorities" w:semiHidden="1" w:unhideWhenUsed="1"/>
-    <w:lsdException w:name="macro" w:semiHidden="1" w:unhideWhenUsed="1"/>
-    <w:lsdException w:name="toa heading" w:semiHidden="1" w:unhideWhenUsed="1"/>
-    <w:lsdException w:name="List" w:semiHidden="1" w:unhideWhenUsed="1"/>
-    <w:lsdException w:name="List Bullet" w:semiHidden="1" w:unhideWhenUsed="1"/>
-    <w:lsdException w:name="List Number" w:semiHidden="1" w:unhideWhenUsed="1"/>
-    <w:lsdException w:name="List 2" w:semiHidden="1" w:unhideWhenUsed="1"/>
-    <w:lsdException w:name="List 3" w:semiHidden="1" w:unhideWhenUsed="1"/>
-    <w:lsdException w:name="List 4" w:semiHidden="1" w:unhideWhenUsed="1"/>
-    <w:lsdException w:name="List 5" w:semiHidden="1" w:unhideWhenUsed="1"/>
-    <w:lsdException w:name="List Bullet 2" w:semiHidden="1" w:unhideWhenUsed="1"/>
-    <w:lsdException w:name="List Bullet 3" w:semiHidden="1" w:unhideWhenUsed="1"/>
-    <w:lsdException w:name="List Bullet 4" w:semiHidden="1" w:unhideWhenUsed="1"/>
-    <w:lsdException w:name="List Bullet 5" w:semiHidden="1" w:unhideWhenUsed="1"/>
-    <w:lsdException w:name="List Number 2" w:semiHidden="1" w:unhideWhenUsed="1"/>
-    <w:lsdException w:name="List Number 3" w:semiHidden="1" w:unhideWhenUsed="1"/>
-    <w:lsdException w:name="List Number 4" w:semiHidden="1" w:unhideWhenUsed="1"/>
-    <w:lsdException w:name="List Number 5" w:semiHidden="1" w:unhideWhenUsed="1"/>
-    <w:lsdException w:name="Title" w:uiPriority="10" w:qFormat="1"/>
-    <w:lsdException w:name="Closing" w:semiHidden="1" w:unhideWhenUsed="1"/>
-    <w:lsdException w:name="Signature" w:semiHidden="1" w:unhideWhenUsed="1"/>
-    <w:lsdException w:name="Default Paragraph Font" w:semiHidden="1" w:uiPriority="1" w:unhideWhenUsed="1"/>
-    <w:lsdException w:name="Body Text" w:semiHidden="1" w:unhideWhenUsed="1"/>
-    <w:lsdException w:name="Body Text Indent" w:semiHidden="1" w:unhideWhenUsed="1"/>
-    <w:lsdException w:name="List Continue" w:semiHidden="1" w:unhideWhenUsed="1"/>
-    <w:lsdException w:name="List Continue 2" w:semiHidden="1" w:unhideWhenUsed="1"/>
-    <w:lsdException w:name="List Continue 3" w:semiHidden="1" w:unhideWhenUsed="1"/>
-    <w:lsdException w:name="List Continue 4" w:semiHidden="1" w:unhideWhenUsed="1"/>
-    <w:lsdException w:name="List Continue 5" w:semiHidden="1" w:unhideWhenUsed="1"/>
-    <w:lsdException w:name="Message Header" w:semiHidden="1" w:unhideWhenUsed="1"/>
-    <w:lsdException w:name="Subtitle" w:uiPriority="11" w:qFormat="1"/>
-    <w:lsdException w:name="Salutation" w:semiHidden="1" w:unhideWhenUsed="1"/>
-    <w:lsdException w:name="Date" w:semiHidden="1" w:unhideWhenUsed="1"/>
-    <w:lsdException w:name="Body Text First Indent" w:semiHidden="1" w:unhideWhenUsed="1"/>
-    <w:lsdException w:name="Body Text First Indent 2" w:semiHidden="1" w:unhideWhenUsed="1"/>
-    <w:lsdException w:name="Note Heading" w:semiHidden="1" w:unhideWhenUsed="1"/>
-    <w:lsdException w:name="Body Text 2" w:semiHidden="1" w:unhideWhenUsed="1"/>
-    <w:lsdException w:name="Body Text 3" w:semiHidden="1" w:unhideWhenUsed="1"/>
-    <w:lsdException w:name="Body Text Indent 2" w:semiHidden="1" w:unhideWhenUsed="1"/>
-    <w:lsdException w:name="Body Text Indent 3" w:semiHidden="1" w:unhideWhenUsed="1"/>
-    <w:lsdException w:name="Block Text" w:semiHidden="1" w:unhideWhenUsed="1"/>
-    <w:lsdException w:name="Hyperlink" w:semiHidden="1" w:unhideWhenUsed="1"/>
-    <w:lsdException w:name="FollowedHyperlink" w:semiHidden="1" w:unhideWhenUsed="1"/>
-    <w:lsdException w:name="Strong" w:uiPriority="22" w:qFormat="1"/>
-    <w:lsdException w:name="Emphasis" w:uiPriority="20" w:qFormat="1"/>
-    <w:lsdException w:name="Document Map" w:semiHidden="1" w:unhideWhenUsed="1"/>
-    <w:lsdException w:name="Plain Text" w:semiHidden="1" w:unhideWhenUsed="1"/>
-    <w:lsdException w:name="E-mail Signature" w:semiHidden="1" w:unhideWhenUsed="1"/>
-    <w:lsdException w:name="HTML Top of Form" w:semiHidden="1" w:unhideWhenUsed="1"/>
-    <w:lsdException w:name="HTML Bottom of Form" w:semiHidden="1" w:unhideWhenUsed="1"/>
-    <w:lsdException w:name="Normal (Web)" w:semiHidden="1" w:unhideWhenUsed="1"/>
-    <w:lsdException w:name="HTML Acronym" w:semiHidden="1" w:unhideWhenUsed="1"/>
-    <w:lsdException w:name="HTML Address" w:semiHidden="1" w:unhideWhenUsed="1"/>
-    <w:lsdException w:name="HTML Cite" w:semiHidden="1" w:unhideWhenUsed="1"/>
-    <w:lsdException w:name="HTML Code" w:semiHidden="1" w:unhideWhenUsed="1"/>
-    <w:lsdException w:name="HTML Definition" w:semiHidden="1" w:unhideWhenUsed="1"/>
-    <w:lsdException w:name="HTML Keyboard" w:semiHidden="1" w:unhideWhenUsed="1"/>
-    <w:lsdException w:name="HTML Preformatted" w:semiHidden="1" w:unhideWhenUsed="1"/>
-    <w:lsdException w:name="HTML Sample" w:semiHidden="1" w:unhideWhenUsed="1"/>
-    <w:lsdException w:name="HTML Typewriter" w:semiHidden="1" w:unhideWhenUsed="1"/>
-    <w:lsdException w:name="HTML Variable" w:semiHidden="1" w:unhideWhenUsed="1"/>
-    <w:lsdException w:name="Normal Table" w:semiHidden="1" w:unhideWhenUsed="1"/>
-    <w:lsdException w:name="annotation subject" w:semiHidden="1" w:unhideWhenUsed="1"/>
-    <w:lsdException w:name="No List" w:semiHidden="1" w:unhideWhenUsed="1"/>
-    <w:lsdException w:name="Outline List 1" w:semiHidden="1" w:unhideWhenUsed="1"/>
-    <w:lsdException w:name="Outline List 2" w:semiHidden="1" w:unhideWhenUsed="1"/>
-    <w:lsdException w:name="Outline List 3" w:semiHidden="1" w:unhideWhenUsed="1"/>
-    <w:lsdException w:name="Table Simple 1" w:semiHidden="1" w:unhideWhenUsed="1"/>
-    <w:lsdException w:name="Table Simple 2" w:semiHidden="1" w:unhideWhenUsed="1"/>
-    <w:lsdException w:name="Table Simple 3" w:semiHidden="1" w:unhideWhenUsed="1"/>
-    <w:lsdException w:name="Table Classic 1" w:semiHidden="1" w:unhideWhenUsed="1"/>
-    <w:lsdException w:name="Table Classic 2" w:semiHidden="1" w:unhideWhenUsed="1"/>
-    <w:lsdException w:name="Table Classic 3" w:semiHidden="1" w:unhideWhenUsed="1"/>
-    <w:lsdException w:name="Table Classic 4" w:semiHidden="1" w:unhideWhenUsed="1"/>
-    <w:lsdException w:name="Table Colorful 1" w:semiHidden="1" w:unhideWhenUsed="1"/>
-    <w:lsdException w:name="Table Colorful 2" w:semiHidden="1" w:unhideWhenUsed="1"/>
-    <w:lsdException w:name="Table Colorful 3" w:semiHidden="1" w:unhideWhenUsed="1"/>
-    <w:lsdException w:name="Table Columns 1" w:semiHidden="1" w:unhideWhenUsed="1"/>
-    <w:lsdException w:name="Table Columns 2" w:semiHidden="1" w:unhideWhenUsed="1"/>
-    <w:lsdException w:name="Table Columns 3" w:semiHidden="1" w:unhideWhenUsed="1"/>
-    <w:lsdException w:name="Table Columns 4" w:semiHidden="1" w:unhideWhenUsed="1"/>
-    <w:lsdException w:name="Table Columns 5" w:semiHidden="1" w:unhideWhenUsed="1"/>
-    <w:lsdException w:name="Table Grid 1" w:semiHidden="1" w:unhideWhenUsed="1"/>
-    <w:lsdException w:name="Table Grid 2" w:semiHidden="1" w:unhideWhenUsed="1"/>
-    <w:lsdException w:name="Table Grid 3" w:semiHidden="1" w:unhideWhenUsed="1"/>
-    <w:lsdException w:name="Table Grid 4" w:semiHidden="1" w:unhideWhenUsed="1"/>
-    <w:lsdException w:name="Table Grid 5" w:semiHidden="1" w:unhideWhenUsed="1"/>
-    <w:lsdException w:name="Table Grid 6" w:semiHidden="1" w:unhideWhenUsed="1"/>
-    <w:lsdException w:name="Table Grid 7" w:semiHidden="1" w:unhideWhenUsed="1"/>
-    <w:lsdException w:name="Table Grid 8" w:semiHidden="1" w:unhideWhenUsed="1"/>
-    <w:lsdException w:name="Table List 1" w:semiHidden="1" w:unhideWhenUsed="1"/>
-    <w:lsdException w:name="Table List 2" w:semiHidden="1" w:unhideWhenUsed="1"/>
-    <w:lsdException w:name="Table List 3" w:semiHidden="1" w:unhideWhenUsed="1"/>
-    <w:lsdException w:name="Table List 4" w:semiHidden="1" w:unhideWhenUsed="1"/>
-    <w:lsdException w:name="Table List 5" w:semiHidden="1" w:unhideWhenUsed="1"/>
-    <w:lsdException w:name="Table List 6" w:semiHidden="1" w:unhideWhenUsed="1"/>
-    <w:lsdException w:name="Table List 7" w:semiHidden="1" w:unhideWhenUsed="1"/>
-    <w:lsdException w:name="Table List 8" w:semiHidden="1" w:unhideWhenUsed="1"/>
-    <w:lsdException w:name="Table 3D effects 1" w:semiHidden="1" w:unhideWhenUsed="1"/>
-    <w:lsdException w:name="Table 3D effects 2" w:semiHidden="1" w:unhideWhenUsed="1"/>
-    <w:lsdException w:name="Table 3D effects 3" w:semiHidden="1" w:unhideWhenUsed="1"/>
-    <w:lsdException w:name="Table Contemporary" w:semiHidden="1" w:unhideWhenUsed="1"/>
-    <w:lsdException w:name="Table Elegant" w:semiHidden="1" w:unhideWhenUsed="1"/>
-    <w:lsdException w:name="Table Professional" w:semiHidden="1" w:unhideWhenUsed="1"/>
-    <w:lsdException w:name="Table Subtle 1" w:semiHidden="1" w:unhideWhenUsed="1"/>
-    <w:lsdException w:name="Table Subtle 2" w:semiHidden="1" w:unhideWhenUsed="1"/>
-    <w:lsdException w:name="Table Web 1" w:semiHidden="1" w:unhideWhenUsed="1"/>
-    <w:lsdException w:name="Table Web 2" w:semiHidden="1" w:unhideWhenUsed="1"/>
-    <w:lsdException w:name="Table Web 3" w:semiHidden="1" w:unhideWhenUsed="1"/>
-    <w:lsdException w:name="Balloon Text" w:semiHidden="1" w:unhideWhenUsed="1"/>
-    <w:lsdException w:name="Table Grid" w:uiPriority="59"/>
-    <w:lsdException w:name="Table Theme" w:semiHidden="1" w:unhideWhenUsed="1"/>
-    <w:lsdException w:name="Placeholder Text" w:semiHidden="1"/>
-    <w:lsdException w:name="No Spacing" w:uiPriority="1" w:qFormat="1"/>
-    <w:lsdException w:name="Light Shading" w:uiPriority="60"/>
-    <w:lsdException w:name="Light List" w:uiPriority="61"/>
-    <w:lsdException w:name="Light Grid" w:uiPriority="62"/>
-    <w:lsdException w:name="Medium Shading 1" w:uiPriority="63"/>
-    <w:lsdException w:name="Medium Shading 2" w:uiPriority="64"/>
-    <w:lsdException w:name="Medium List 1" w:uiPriority="65"/>
-    <w:lsdException w:name="Medium List 2" w:uiPriority="66"/>
-    <w:lsdException w:name="Medium Grid 1" w:uiPriority="67"/>
-    <w:lsdException w:name="Medium Grid 2" w:uiPriority="68"/>
-    <w:lsdException w:name="Medium Grid 3" w:uiPriority="69"/>
-    <w:lsdException w:name="Dark List" w:uiPriority="70"/>
-    <w:lsdException w:name="Colorful Shading" w:uiPriority="71"/>
-    <w:lsdException w:name="Colorful List" w:uiPriority="72"/>
-    <w:lsdException w:name="Colorful Grid" w:uiPriority="73"/>
-    <w:lsdException w:name="Light Shading Accent 1" w:uiPriority="60"/>
-    <w:lsdException w:name="Light List Accent 1" w:uiPriority="61"/>
-    <w:lsdException w:name="Light Grid Accent 1" w:uiPriority="62"/>
-    <w:lsdException w:name="Medium Shading 1 Accent 1" w:uiPriority="63"/>
-    <w:lsdException w:name="Medium Shading 2 Accent 1" w:uiPriority="64"/>
-    <w:lsdException w:name="Medium List 1 Accent 1" w:uiPriority="65"/>
-    <w:lsdException w:name="Revision" w:semiHidden="1"/>
-    <w:lsdException w:name="List Paragraph" w:uiPriority="34" w:qFormat="1"/>
-    <w:lsdException w:name="Quote" w:uiPriority="29" w:qFormat="1"/>
-    <w:lsdException w:name="Intense Quote" w:uiPriority="30" w:qFormat="1"/>
-    <w:lsdException w:name="Medium List 2 Accent 1" w:uiPriority="66"/>
-    <w:lsdException w:name="Medium Grid 1 Accent 1" w:uiPriority="67"/>
-    <w:lsdException w:name="Medium Grid 2 Accent 1" w:uiPriority="68"/>
-    <w:lsdException w:name="Medium Grid 3 Accent 1" w:uiPriority="69"/>
-    <w:lsdException w:name="Dark List Accent 1" w:uiPriority="70"/>
-    <w:lsdException w:name="Colorful Shading Accent 1" w:uiPriority="71"/>
-    <w:lsdException w:name="Colorful List Accent 1" w:uiPriority="72"/>
-    <w:lsdException w:name="Colorful Grid Accent 1" w:uiPriority="73"/>
-    <w:lsdException w:name="Light Shading Accent 2" w:uiPriority="60"/>
-    <w:lsdException w:name="Light List Accent 2" w:uiPriority="61"/>
-    <w:lsdException w:name="Light Grid Accent 2" w:uiPriority="62"/>
-    <w:lsdException w:name="Medium Shading 1 Accent 2" w:uiPriority="63"/>
-    <w:lsdException w:name="Medium Shading 2 Accent 2" w:uiPriority="64"/>
-    <w:lsdException w:name="Medium List 1 Accent 2" w:uiPriority="65"/>
-    <w:lsdException w:name="Medium List 2 Accent 2" w:uiPriority="66"/>
-    <w:lsdException w:name="Medium Grid 1 Accent 2" w:uiPriority="67"/>
-    <w:lsdException w:name="Medium Grid 2 Accent 2" w:uiPriority="68"/>
-    <w:lsdException w:name="Medium Grid 3 Accent 2" w:uiPriority="69"/>
-    <w:lsdException w:name="Dark List Accent 2" w:uiPriority="70"/>
-    <w:lsdException w:name="Colorful Shading Accent 2" w:uiPriority="71"/>
-    <w:lsdException w:name="Colorful List Accent 2" w:uiPriority="72"/>
-    <w:lsdException w:name="Colorful Grid Accent 2" w:uiPriority="73"/>
-    <w:lsdException w:name="Light Shading Accent 3" w:uiPriority="60"/>
-    <w:lsdException w:name="Light List Accent 3" w:uiPriority="61"/>
-    <w:lsdException w:name="Light Grid Accent 3" w:uiPriority="62"/>
-    <w:lsdException w:name="Medium Shading 1 Accent 3" w:uiPriority="63"/>
-    <w:lsdException w:name="Medium Shading 2 Accent 3" w:uiPriority="64"/>
-    <w:lsdException w:name="Medium List 1 Accent 3" w:uiPriority="65"/>
-    <w:lsdException w:name="Medium List 2 Accent 3" w:uiPriority="66"/>
-    <w:lsdException w:name="Medium Grid 1 Accent 3" w:uiPriority="67"/>
-    <w:lsdException w:name="Medium Grid 2 Accent 3" w:uiPriority="68"/>
-    <w:lsdException w:name="Medium Grid 3 Accent 3" w:uiPriority="69"/>
-    <w:lsdException w:name="Dark List Accent 3" w:uiPriority="70"/>
-    <w:lsdException w:name="Colorful Shading Accent 3" w:uiPriority="71"/>
-    <w:lsdException w:name="Colorful List Accent 3" w:uiPriority="72"/>
-    <w:lsdException w:name="Colorful Grid Accent 3" w:uiPriority="73"/>
-    <w:lsdException w:name="Light Shading Accent 4" w:uiPriority="60"/>
-    <w:lsdException w:name="Light List Accent 4" w:uiPriority="61"/>
-    <w:lsdException w:name="Light Grid Accent 4" w:uiPriority="62"/>
-    <w:lsdException w:name="Medium Shading 1 Accent 4" w:uiPriority="63"/>
-    <w:lsdException w:name="Medium Shading 2 Accent 4" w:uiPriority="64"/>
-    <w:lsdException w:name="Medium List 1 Accent 4" w:uiPriority="65"/>
-    <w:lsdException w:name="Medium List 2 Accent 4" w:uiPriority="66"/>
-    <w:lsdException w:name="Medium Grid 1 Accent 4" w:uiPriority="67"/>
-    <w:lsdException w:name="Medium Grid 2 Accent 4" w:uiPriority="68"/>
-    <w:lsdException w:name="Medium Grid 3 Accent 4" w:uiPriority="69"/>
-    <w:lsdException w:name="Dark List Accent 4" w:uiPriority="70"/>
-    <w:lsdException w:name="Colorful Shading Accent 4" w:uiPriority="71"/>
-    <w:lsdException w:name="Colorful List Accent 4" w:uiPriority="72"/>
-    <w:lsdException w:name="Colorful Grid Accent 4" w:uiPriority="73"/>
-    <w:lsdException w:name="Light Shading Accent 5" w:uiPriority="60"/>
-    <w:lsdException w:name="Light List Accent 5" w:uiPriority="61"/>
-    <w:lsdException w:name="Light Grid Accent 5" w:uiPriority="62"/>
-    <w:lsdException w:name="Medium Shading 1 Accent 5" w:uiPriority="63"/>
-    <w:lsdException w:name="Medium Shading 2 Accent 5" w:uiPriority="64"/>
-    <w:lsdException w:name="Medium List 1 Accent 5" w:uiPriority="65"/>
-    <w:lsdException w:name="Medium List 2 Accent 5" w:uiPriority="66"/>
-    <w:lsdException w:name="Medium Grid 1 Accent 5" w:uiPriority="67"/>
-    <w:lsdException w:name="Medium Grid 2 Accent 5" w:uiPriority="68"/>
-    <w:lsdException w:name="Medium Grid 3 Accent 5" w:uiPriority="69"/>
-    <w:lsdException w:name="Dark List Accent 5" w:uiPriority="70"/>
-    <w:lsdException w:name="Colorful Shading Accent 5" w:uiPriority="71"/>
-    <w:lsdException w:name="Colorful List Accent 5" w:uiPriority="72"/>
-    <w:lsdException w:name="Colorful Grid Accent 5" w:uiPriority="73"/>
-    <w:lsdException w:name="Light Shading Accent 6" w:uiPriority="60"/>
-    <w:lsdException w:name="Light List Accent 6" w:uiPriority="61"/>
-    <w:lsdException w:name="Light Grid Accent 6" w:uiPriority="62"/>
-    <w:lsdException w:name="Medium Shading 1 Accent 6" w:uiPriority="63"/>
-    <w:lsdException w:name="Medium Shading 2 Accent 6" w:uiPriority="64"/>
-    <w:lsdException w:name="Medium List 1 Accent 6" w:uiPriority="65"/>
-    <w:lsdException w:name="Medium List 2 Accent 6" w:uiPriority="66"/>
-    <w:lsdException w:name="Medium Grid 1 Accent 6" w:uiPriority="67"/>
-    <w:lsdException w:name="Medium Grid 2 Accent 6" w:uiPriority="68"/>
-    <w:lsdException w:name="Medium Grid 3 Accent 6" w:uiPriority="69"/>
-    <w:lsdException w:name="Dark List Accent 6" w:uiPriority="70"/>
-    <w:lsdException w:name="Colorful Shading Accent 6" w:uiPriority="71"/>
-    <w:lsdException w:name="Colorful List Accent 6" w:uiPriority="72"/>
-    <w:lsdException w:name="Colorful Grid Accent 6" w:uiPriority="73"/>
-    <w:lsdException w:name="Subtle Emphasis" w:uiPriority="19" w:qFormat="1"/>
-    <w:lsdException w:name="Intense Emphasis" w:uiPriority="21" w:qFormat="1"/>
-    <w:lsdException w:name="Subtle Reference" w:uiPriority="31" w:qFormat="1"/>
-    <w:lsdException w:name="Intense Reference" w:uiPriority="32" w:qFormat="1"/>
-    <w:lsdException w:name="Book Title" w:uiPriority="33" w:qFormat="1"/>
-    <w:lsdException w:name="Bibliography" w:semiHidden="1" w:uiPriority="37" w:unhideWhenUsed="1"/>
-    <w:lsdException w:name="TOC Heading" w:semiHidden="1" w:uiPriority="39" w:unhideWhenUsed="1" w:qFormat="1"/>
-    <w:lsdException w:name="Plain Table 1" w:uiPriority="41"/>
-    <w:lsdException w:name="Plain Table 2" w:uiPriority="42"/>
-    <w:lsdException w:name="Plain Table 3" w:uiPriority="43"/>
-    <w:lsdException w:name="Plain Table 4" w:uiPriority="44"/>
-    <w:lsdException w:name="Plain Table 5" w:uiPriority="45"/>
-    <w:lsdException w:name="Grid Table Light" w:uiPriority="40"/>
-    <w:lsdException w:name="Grid Table 1 Light" w:uiPriority="46"/>
-    <w:lsdException w:name="Grid Table 2" w:uiPriority="47"/>
-    <w:lsdException w:name="Grid Table 3" w:uiPriority="48"/>
-    <w:lsdException w:name="Grid Table 4" w:uiPriority="49"/>
-    <w:lsdException w:name="Grid Table 5 Dark" w:uiPriority="50"/>
-    <w:lsdException w:name="Grid Table 6 Colorful" w:uiPriority="51"/>
-    <w:lsdException w:name="Grid Table 7 Colorful" w:uiPriority="52"/>
-    <w:lsdException w:name="Grid Table 1 Light Accent 1" w:uiPriority="46"/>
-    <w:lsdException w:name="Grid Table 2 Accent 1" w:uiPriority="47"/>
-    <w:lsdException w:name="Grid Table 3 Accent 1" w:uiPriority="48"/>
-    <w:lsdException w:name="Grid Table 4 Accent 1" w:uiPriority="49"/>
-    <w:lsdException w:name="Grid Table 5 Dark Accent 1" w:uiPriority="50"/>
-    <w:lsdException w:name="Grid Table 6 Colorful Accent 1" w:uiPriority="51"/>
-    <w:lsdException w:name="Grid Table 7 Colorful Accent 1" w:uiPriority="52"/>
-    <w:lsdException w:name="Grid Table 1 Light Accent 2" w:uiPriority="46"/>
-    <w:lsdException w:name="Grid Table 2 Accent 2" w:uiPriority="47"/>
-    <w:lsdException w:name="Grid Table 3 Accent 2" w:uiPriority="48"/>
-    <w:lsdException w:name="Grid Table 4 Accent 2" w:uiPriority="49"/>
-    <w:lsdException w:name="Grid Table 5 Dark Accent 2" w:uiPriority="50"/>
-    <w:lsdException w:name="Grid Table 6 Colorful Accent 2" w:uiPriority="51"/>
-    <w:lsdException w:name="Grid Table 7 Colorful Accent 2" w:uiPriority="52"/>
-    <w:lsdException w:name="Grid Table 1 Light Accent 3" w:uiPriority="46"/>
-    <w:lsdException w:name="Grid Table 2 Accent 3" w:uiPriority="47"/>
-    <w:lsdException w:name="Grid Table 3 Accent 3" w:uiPriority="48"/>
-    <w:lsdException w:name="Grid Table 4 Accent 3" w:uiPriority="49"/>
-    <w:lsdException w:name="Grid Table 5 Dark Accent 3" w:uiPriority="50"/>
-    <w:lsdException w:name="Grid Table 6 Colorful Accent 3" w:uiPriority="51"/>
-    <w:lsdException w:name="Grid Table 7 Colorful Accent 3" w:uiPriority="52"/>
-    <w:lsdException w:name="Grid Table 1 Light Accent 4" w:uiPriority="46"/>
-    <w:lsdException w:name="Grid Table 2 Accent 4" w:uiPriority="47"/>
-    <w:lsdException w:name="Grid Table 3 Accent 4" w:uiPriority="48"/>
-    <w:lsdException w:name="Grid Table 4 Accent 4" w:uiPriority="49"/>
-    <w:lsdException w:name="Grid Table 5 Dark Accent 4" w:uiPriority="50"/>
-    <w:lsdException w:name="Grid Table 6 Colorful Accent 4" w:uiPriority="51"/>
-    <w:lsdException w:name="Grid Table 7 Colorful Accent 4" w:uiPriority="52"/>
-    <w:lsdException w:name="Grid Table 1 Light Accent 5" w:uiPriority="46"/>
-    <w:lsdException w:name="Grid Table 2 Accent 5" w:uiPriority="47"/>
-    <w:lsdException w:name="Grid Table 3 Accent 5" w:uiPriority="48"/>
-    <w:lsdException w:name="Grid Table 4 Accent 5" w:uiPriority="49"/>
-    <w:lsdException w:name="Grid Table 5 Dark Accent 5" w:uiPriority="50"/>
-    <w:lsdException w:name="Grid Table 6 Colorful Accent 5" w:uiPriority="51"/>
-    <w:lsdException w:name="Grid Table 7 Colorful Accent 5" w:uiPriority="52"/>
-    <w:lsdException w:name="Grid Table 1 Light Accent 6" w:uiPriority="46"/>
-    <w:lsdException w:name="Grid Table 2 Accent 6" w:uiPriority="47"/>
-    <w:lsdException w:name="Grid Table 3 Accent 6" w:uiPriority="48"/>
-    <w:lsdException w:name="Grid Table 4 Accent 6" w:uiPriority="49"/>
-    <w:lsdException w:name="Grid Table 5 Dark Accent 6" w:uiPriority="50"/>
-    <w:lsdException w:name="Grid Table 6 Colorful Accent 6" w:uiPriority="51"/>
-    <w:lsdException w:name="Grid Table 7 Colorful Accent 6" w:uiPriority="52"/>
-    <w:lsdException w:name="List Table 1 Light" w:uiPriority="46"/>
-    <w:lsdException w:name="List Table 2" w:uiPriority="47"/>
-    <w:lsdException w:name="List Table 3" w:uiPriority="48"/>
-    <w:lsdException w:name="List Table 4" w:uiPriority="49"/>
-    <w:lsdException w:name="List Table 5 Dark" w:uiPriority="50"/>
-    <w:lsdException w:name="List Table 6 Colorful" w:uiPriority="51"/>
-    <w:lsdException w:name="List Table 7 Colorful" w:uiPriority="52"/>
-    <w:lsdException w:name="List Table 1 Light Accent 1" w:uiPriority="46"/>
-    <w:lsdException w:name="List Table 2 Accent 1" w:uiPriority="47"/>
-    <w:lsdException w:name="List Table 3 Accent 1" w:uiPriority="48"/>
-    <w:lsdException w:name="List Table 4 Accent 1" w:uiPriority="49"/>
-    <w:lsdException w:name="List Table 5 Dark Accent 1" w:uiPriority="50"/>
-    <w:lsdException w:name="List Table 6 Colorful Accent 1" w:uiPriority="51"/>
-    <w:lsdException w:name="List Table 7 Colorful Accent 1" w:uiPriority="52"/>
-    <w:lsdException w:name="List Table 1 Light Accent 2" w:uiPriority="46"/>
-    <w:lsdException w:name="List Table 2 Accent 2" w:uiPriority="47"/>
-    <w:lsdException w:name="List Table 3 Accent 2" w:uiPriority="48"/>
-    <w:lsdException w:name="List Table 4 Accent 2" w:uiPriority="49"/>
-    <w:lsdException w:name="List Table 5 Dark Accent 2" w:uiPriority="50"/>
-    <w:lsdException w:name="List Table 6 Colorful Accent 2" w:uiPriority="51"/>
-    <w:lsdException w:name="List Table 7 Colorful Accent 2" w:uiPriority="52"/>
-    <w:lsdException w:name="List Table 1 Light Accent 3" w:uiPriority="46"/>
-    <w:lsdException w:name="List Table 2 Accent 3" w:uiPriority="47"/>
-    <w:lsdException w:name="List Table 3 Accent 3" w:uiPriority="48"/>
-    <w:lsdException w:name="List Table 4 Accent 3" w:uiPriority="49"/>
-    <w:lsdException w:name="List Table 5 Dark Accent 3" w:uiPriority="50"/>
-    <w:lsdException w:name="List Table 6 Colorful Accent 3" w:uiPriority="51"/>
-    <w:lsdException w:name="List Table 7 Colorful Accent 3" w:uiPriority="52"/>
-    <w:lsdException w:name="List Table 1 Light Accent 4" w:uiPriority="46"/>
-    <w:lsdException w:name="List Table 2 Accent 4" w:uiPriority="47"/>
-    <w:lsdException w:name="List Table 3 Accent 4" w:uiPriority="48"/>
-    <w:lsdException w:name="List Table 4 Accent 4" w:uiPriority="49"/>
-    <w:lsdException w:name="List Table 5 Dark Accent 4" w:uiPriority="50"/>
-    <w:lsdException w:name="List Table 6 Colorful Accent 4" w:uiPriority="51"/>
-    <w:lsdException w:name="List Table 7 Colorful Accent 4" w:uiPriority="52"/>
-    <w:lsdException w:name="List Table 1 Light Accent 5" w:uiPriority="46"/>
-    <w:lsdException w:name="List Table 2 Accent 5" w:uiPriority="47"/>
-    <w:lsdException w:name="List Table 3 Accent 5" w:uiPriority="48"/>
-    <w:lsdException w:name="List Table 4 Accent 5" w:uiPriority="49"/>
-    <w:lsdException w:name="List Table 5 Dark Accent 5" w:uiPriority="50"/>
-    <w:lsdException w:name="List Table 6 Colorful Accent 5" w:uiPriority="51"/>
-    <w:lsdException w:name="List Table 7 Colorful Accent 5" w:uiPriority="52"/>
-    <w:lsdException w:name="List Table 1 Light Accent 6" w:uiPriority="46"/>
-    <w:lsdException w:name="List Table 2 Accent 6" w:uiPriority="47"/>
-    <w:lsdException w:name="List Table 3 Accent 6" w:uiPriority="48"/>
-    <w:lsdException w:name="List Table 4 Accent 6" w:uiPriority="49"/>
-    <w:lsdException w:name="List Table 5 Dark Accent 6" w:uiPriority="50"/>
-    <w:lsdException w:name="List Table 6 Colorful Accent 6" w:uiPriority="51"/>
-    <w:lsdException w:name="List Table 7 Colorful Accent 6" w:uiPriority="52"/>
+  <w:latentStyles w:defLockedState="0" w:defUIPriority="99" w:defSemiHidden="1" w:defUnhideWhenUsed="1" w:defQFormat="0" w:count="267">
+    <w:lsdException w:name="Normal" w:semiHidden="0" w:uiPriority="0" w:unhideWhenUsed="0" w:qFormat="1"/>
+    <w:lsdException w:name="heading 1" w:semiHidden="0" w:uiPriority="9" w:unhideWhenUsed="0" w:qFormat="1"/>
+    <w:lsdException w:name="heading 2" w:uiPriority="9" w:qFormat="1"/>
+    <w:lsdException w:name="heading 3" w:uiPriority="9" w:qFormat="1"/>
+    <w:lsdException w:name="heading 4" w:uiPriority="9" w:qFormat="1"/>
+    <w:lsdException w:name="heading 5" w:uiPriority="9" w:qFormat="1"/>
+    <w:lsdException w:name="heading 6" w:uiPriority="9" w:qFormat="1"/>
+    <w:lsdException w:name="heading 7" w:uiPriority="9" w:qFormat="1"/>
+    <w:lsdException w:name="heading 8" w:uiPriority="9" w:qFormat="1"/>
+    <w:lsdException w:name="heading 9" w:uiPriority="9" w:qFormat="1"/>
+    <w:lsdException w:name="toc 1" w:uiPriority="39"/>
+    <w:lsdException w:name="toc 2" w:uiPriority="39"/>
+    <w:lsdException w:name="toc 3" w:uiPriority="39"/>
+    <w:lsdException w:name="toc 4" w:uiPriority="39"/>
+    <w:lsdException w:name="toc 5" w:uiPriority="39"/>
+    <w:lsdException w:name="toc 6" w:uiPriority="39"/>
+    <w:lsdException w:name="toc 7" w:uiPriority="39"/>
+    <w:lsdException w:name="toc 8" w:uiPriority="39"/>
+    <w:lsdException w:name="toc 9" w:uiPriority="39"/>
+    <w:lsdException w:name="caption" w:uiPriority="35" w:qFormat="1"/>
+    <w:lsdException w:name="Title" w:semiHidden="0" w:uiPriority="10" w:unhideWhenUsed="0" w:qFormat="1"/>
+    <w:lsdException w:name="Default Paragraph Font" w:uiPriority="1"/>
+    <w:lsdException w:name="Subtitle" w:semiHidden="0" w:uiPriority="11" w:unhideWhenUsed="0" w:qFormat="1"/>
+    <w:lsdException w:name="Strong" w:semiHidden="0" w:uiPriority="22" w:unhideWhenUsed="0" w:qFormat="1"/>
+    <w:lsdException w:name="Emphasis" w:semiHidden="0" w:uiPriority="20" w:unhideWhenUsed="0" w:qFormat="1"/>
+    <w:lsdException w:name="Table Grid" w:semiHidden="0" w:uiPriority="59" w:unhideWhenUsed="0"/>
+    <w:lsdException w:name="Placeholder Text" w:unhideWhenUsed="0"/>
+    <w:lsdException w:name="No Spacing" w:semiHidden="0" w:uiPriority="1" w:unhideWhenUsed="0" w:qFormat="1"/>
+    <w:lsdException w:name="Light Shading" w:semiHidden="0" w:uiPriority="60" w:unhideWhenUsed="0"/>
+    <w:lsdException w:name="Light List" w:semiHidden="0" w:uiPriority="61" w:unhideWhenUsed="0"/>
+    <w:lsdException w:name="Light Grid" w:semiHidden="0" w:uiPriority="62" w:unhideWhenUsed="0"/>
+    <w:lsdException w:name="Medium Shading 1" w:semiHidden="0" w:uiPriority="63" w:unhideWhenUsed="0"/>
+    <w:lsdException w:name="Medium Shading 2" w:semiHidden="0" w:uiPriority="64" w:unhideWhenUsed="0"/>
+    <w:lsdException w:name="Medium List 1" w:semiHidden="0" w:uiPriority="65" w:unhideWhenUsed="0"/>
+    <w:lsdException w:name="Medium List 2" w:semiHidden="0" w:uiPriority="66" w:unhideWhenUsed="0"/>
+    <w:lsdException w:name="Medium Grid 1" w:semiHidden="0" w:uiPriority="67" w:unhideWhenUsed="0"/>
+    <w:lsdException w:name="Medium Grid 2" w:semiHidden="0" w:uiPriority="68" w:unhideWhenUsed="0"/>
+    <w:lsdException w:name="Medium Grid 3" w:semiHidden="0" w:uiPriority="69" w:unhideWhenUsed="0"/>
+    <w:lsdException w:name="Dark List" w:semiHidden="0" w:uiPriority="70" w:unhideWhenUsed="0"/>
+    <w:lsdException w:name="Colorful Shading" w:semiHidden="0" w:uiPriority="71" w:unhideWhenUsed="0"/>
+    <w:lsdException w:name="Colorful List" w:semiHidden="0" w:uiPriority="72" w:unhideWhenUsed="0"/>
+    <w:lsdException w:name="Colorful Grid" w:semiHidden="0" w:uiPriority="73" w:unhideWhenUsed="0"/>
+    <w:lsdException w:name="Light Shading Accent 1" w:semiHidden="0" w:uiPriority="60" w:unhideWhenUsed="0"/>
+    <w:lsdException w:name="Light List Accent 1" w:semiHidden="0" w:uiPriority="61" w:unhideWhenUsed="0"/>
+    <w:lsdException w:name="Light Grid Accent 1" w:semiHidden="0" w:uiPriority="62" w:unhideWhenUsed="0"/>
+    <w:lsdException w:name="Medium Shading 1 Accent 1" w:semiHidden="0" w:uiPriority="63" w:unhideWhenUsed="0"/>
+    <w:lsdException w:name="Medium Shading 2 Accent 1" w:semiHidden="0" w:uiPriority="64" w:unhideWhenUsed="0"/>
+    <w:lsdException w:name="Medium List 1 Accent 1" w:semiHidden="0" w:uiPriority="65" w:unhideWhenUsed="0"/>
+    <w:lsdException w:name="Revision" w:unhideWhenUsed="0"/>
+    <w:lsdException w:name="List Paragraph" w:semiHidden="0" w:uiPriority="34" w:unhideWhenUsed="0" w:qFormat="1"/>
+    <w:lsdException w:name="Quote" w:semiHidden="0" w:uiPriority="29" w:unhideWhenUsed="0" w:qFormat="1"/>
+    <w:lsdException w:name="Intense Quote" w:semiHidden="0" w:uiPriority="30" w:unhideWhenUsed="0" w:qFormat="1"/>
+    <w:lsdException w:name="Medium List 2 Accent 1" w:semiHidden="0" w:uiPriority="66" w:unhideWhenUsed="0"/>
+    <w:lsdException w:name="Medium Grid 1 Accent 1" w:semiHidden="0" w:uiPriority="67" w:unhideWhenUsed="0"/>
+    <w:lsdException w:name="Medium Grid 2 Accent 1" w:semiHidden="0" w:uiPriority="68" w:unhideWhenUsed="0"/>
+    <w:lsdException w:name="Medium Grid 3 Accent 1" w:semiHidden="0" w:uiPriority="69" w:unhideWhenUsed="0"/>
+    <w:lsdException w:name="Dark List Accent 1" w:semiHidden="0" w:uiPriority="70" w:unhideWhenUsed="0"/>
+    <w:lsdException w:name="Colorful Shading Accent 1" w:semiHidden="0" w:uiPriority="71" w:unhideWhenUsed="0"/>
+    <w:lsdException w:name="Colorful List Accent 1" w:semiHidden="0" w:uiPriority="72" w:unhideWhenUsed="0"/>
+    <w:lsdException w:name="Colorful Grid Accent 1" w:semiHidden="0" w:uiPriority="73" w:unhideWhenUsed="0"/>
+    <w:lsdException w:name="Light Shading Accent 2" w:semiHidden="0" w:uiPriority="60" w:unhideWhenUsed="0"/>
+    <w:lsdException w:name="Light List Accent 2" w:semiHidden="0" w:uiPriority="61" w:unhideWhenUsed="0"/>
+    <w:lsdException w:name="Light Grid Accent 2" w:semiHidden="0" w:uiPriority="62" w:unhideWhenUsed="0"/>
+    <w:lsdException w:name="Medium Shading 1 Accent 2" w:semiHidden="0" w:uiPriority="63" w:unhideWhenUsed="0"/>
+    <w:lsdException w:name="Medium Shading 2 Accent 2" w:semiHidden="0" w:uiPriority="64" w:unhideWhenUsed="0"/>
+    <w:lsdException w:name="Medium List 1 Accent 2" w:semiHidden="0" w:uiPriority="65" w:unhideWhenUsed="0"/>
+    <w:lsdException w:name="Medium List 2 Accent 2" w:semiHidden="0" w:uiPriority="66" w:unhideWhenUsed="0"/>
+    <w:lsdException w:name="Medium Grid 1 Accent 2" w:semiHidden="0" w:uiPriority="67" w:unhideWhenUsed="0"/>
+    <w:lsdException w:name="Medium Grid 2 Accent 2" w:semiHidden="0" w:uiPriority="68" w:unhideWhenUsed="0"/>
+    <w:lsdException w:name="Medium Grid 3 Accent 2" w:semiHidden="0" w:uiPriority="69" w:unhideWhenUsed="0"/>
+    <w:lsdException w:name="Dark List Accent 2" w:semiHidden="0" w:uiPriority="70" w:unhideWhenUsed="0"/>
+    <w:lsdException w:name="Colorful Shading Accent 2" w:semiHidden="0" w:uiPriority="71" w:unhideWhenUsed="0"/>
+    <w:lsdException w:name="Colorful List Accent 2" w:semiHidden="0" w:uiPriority="72" w:unhideWhenUsed="0"/>
+    <w:lsdException w:name="Colorful Grid Accent 2" w:semiHidden="0" w:uiPriority="73" w:unhideWhenUsed="0"/>
+    <w:lsdException w:name="Light Shading Accent 3" w:semiHidden="0" w:uiPriority="60" w:unhideWhenUsed="0"/>
+    <w:lsdException w:name="Light List Accent 3" w:semiHidden="0" w:uiPriority="61" w:unhideWhenUsed="0"/>
+    <w:lsdException w:name="Light Grid Accent 3" w:semiHidden="0" w:uiPriority="62" w:unhideWhenUsed="0"/>
+    <w:lsdException w:name="Medium Shading 1 Accent 3" w:semiHidden="0" w:uiPriority="63" w:unhideWhenUsed="0"/>
+    <w:lsdException w:name="Medium Shading 2 Accent 3" w:semiHidden="0" w:uiPriority="64" w:unhideWhenUsed="0"/>
+    <w:lsdException w:name="Medium List 1 Accent 3" w:semiHidden="0" w:uiPriority="65" w:unhideWhenUsed="0"/>
+    <w:lsdException w:name="Medium List 2 Accent 3" w:semiHidden="0" w:uiPriority="66" w:unhideWhenUsed="0"/>
+    <w:lsdException w:name="Medium Grid 1 Accent 3" w:semiHidden="0" w:uiPriority="67" w:unhideWhenUsed="0"/>
+    <w:lsdException w:name="Medium Grid 2 Accent 3" w:semiHidden="0" w:uiPriority="68" w:unhideWhenUsed="0"/>
+    <w:lsdException w:name="Medium Grid 3 Accent 3" w:semiHidden="0" w:uiPriority="69" w:unhideWhenUsed="0"/>
+    <w:lsdException w:name="Dark List Accent 3" w:semiHidden="0" w:uiPriority="70" w:unhideWhenUsed="0"/>
+    <w:lsdException w:name="Colorful Shading Accent 3" w:semiHidden="0" w:uiPriority="71" w:unhideWhenUsed="0"/>
+    <w:lsdException w:name="Colorful List Accent 3" w:semiHidden="0" w:uiPriority="72" w:unhideWhenUsed="0"/>
+    <w:lsdException w:name="Colorful Grid Accent 3" w:semiHidden="0" w:uiPriority="73" w:unhideWhenUsed="0"/>
+    <w:lsdException w:name="Light Shading Accent 4" w:semiHidden="0" w:uiPriority="60" w:unhideWhenUsed="0"/>
+    <w:lsdException w:name="Light List Accent 4" w:semiHidden="0" w:uiPriority="61" w:unhideWhenUsed="0"/>
+    <w:lsdException w:name="Light Grid Accent 4" w:semiHidden="0" w:uiPriority="62" w:unhideWhenUsed="0"/>
+    <w:lsdException w:name="Medium Shading 1 Accent 4" w:semiHidden="0" w:uiPriority="63" w:unhideWhenUsed="0"/>
+    <w:lsdException w:name="Medium Shading 2 Accent 4" w:semiHidden="0" w:uiPriority="64" w:unhideWhenUsed="0"/>
+    <w:lsdException w:name="Medium List 1 Accent 4" w:semiHidden="0" w:uiPriority="65" w:unhideWhenUsed="0"/>
+    <w:lsdException w:name="Medium List 2 Accent 4" w:semiHidden="0" w:uiPriority="66" w:unhideWhenUsed="0"/>
+    <w:lsdException w:name="Medium Grid 1 Accent 4" w:semiHidden="0" w:uiPriority="67" w:unhideWhenUsed="0"/>
+    <w:lsdException w:name="Medium Grid 2 Accent 4" w:semiHidden="0" w:uiPriority="68" w:unhideWhenUsed="0"/>
+    <w:lsdException w:name="Medium Grid 3 Accent 4" w:semiHidden="0" w:uiPriority="69" w:unhideWhenUsed="0"/>
+    <w:lsdException w:name="Dark List Accent 4" w:semiHidden="0" w:uiPriority="70" w:unhideWhenUsed="0"/>
+    <w:lsdException w:name="Colorful Shading Accent 4" w:semiHidden="0" w:uiPriority="71" w:unhideWhenUsed="0"/>
+    <w:lsdException w:name="Colorful List Accent 4" w:semiHidden="0" w:uiPriority="72" w:unhideWhenUsed="0"/>
+    <w:lsdException w:name="Colorful Grid Accent 4" w:semiHidden="0" w:uiPriority="73" w:unhideWhenUsed="0"/>
+    <w:lsdException w:name="Light Shading Accent 5" w:semiHidden="0" w:uiPriority="60" w:unhideWhenUsed="0"/>
+    <w:lsdException w:name="Light List Accent 5" w:semiHidden="0" w:uiPriority="61" w:unhideWhenUsed="0"/>
+    <w:lsdException w:name="Light Grid Accent 5" w:semiHidden="0" w:uiPriority="62" w:unhideWhenUsed="0"/>
+    <w:lsdException w:name="Medium Shading 1 Accent 5" w:semiHidden="0" w:uiPriority="63" w:unhideWhenUsed="0"/>
+    <w:lsdException w:name="Medium Shading 2 Accent 5" w:semiHidden="0" w:uiPriority="64" w:unhideWhenUsed="0"/>
+    <w:lsdException w:name="Medium List 1 Accent 5" w:semiHidden="0" w:uiPriority="65" w:unhideWhenUsed="0"/>
+    <w:lsdException w:name="Medium List 2 Accent 5" w:semiHidden="0" w:uiPriority="66" w:unhideWhenUsed="0"/>
+    <w:lsdException w:name="Medium Grid 1 Accent 5" w:semiHidden="0" w:uiPriority="67" w:unhideWhenUsed="0"/>
+    <w:lsdException w:name="Medium Grid 2 Accent 5" w:semiHidden="0" w:uiPriority="68" w:unhideWhenUsed="0"/>
+    <w:lsdException w:name="Medium Grid 3 Accent 5" w:semiHidden="0" w:uiPriority="69" w:unhideWhenUsed="0"/>
+    <w:lsdException w:name="Dark List Accent 5" w:semiHidden="0" w:uiPriority="70" w:unhideWhenUsed="0"/>
+    <w:lsdException w:name="Colorful Shading Accent 5" w:semiHidden="0" w:uiPriority="71" w:unhideWhenUsed="0"/>
+    <w:lsdException w:name="Colorful List Accent 5" w:semiHidden="0" w:uiPriority="72" w:unhideWhenUsed="0"/>
+    <w:lsdException w:name="Colorful Grid Accent 5" w:semiHidden="0" w:uiPriority="73" w:unhideWhenUsed="0"/>
+    <w:lsdException w:name="Light Shading Accent 6" w:semiHidden="0" w:uiPriority="60" w:unhideWhenUsed="0"/>
+    <w:lsdException w:name="Light List Accent 6" w:semiHidden="0" w:uiPriority="61" w:unhideWhenUsed="0"/>
+    <w:lsdException w:name="Light Grid Accent 6" w:semiHidden="0" w:uiPriority="62" w:unhideWhenUsed="0"/>
+    <w:lsdException w:name="Medium Shading 1 Accent 6" w:semiHidden="0" w:uiPriority="63" w:unhideWhenUsed="0"/>
+    <w:lsdException w:name="Medium Shading 2 Accent 6" w:semiHidden="0" w:uiPriority="64" w:unhideWhenUsed="0"/>
+    <w:lsdException w:name="Medium List 1 Accent 6" w:semiHidden="0" w:uiPriority="65" w:unhideWhenUsed="0"/>
+    <w:lsdException w:name="Medium List 2 Accent 6" w:semiHidden="0" w:uiPriority="66" w:unhideWhenUsed="0"/>
+    <w:lsdException w:name="Medium Grid 1 Accent 6" w:semiHidden="0" w:uiPriority="67" w:unhideWhenUsed="0"/>
+    <w:lsdException w:name="Medium Grid 2 Accent 6" w:semiHidden="0" w:uiPriority="68" w:unhideWhenUsed="0"/>
+    <w:lsdException w:name="Medium Grid 3 Accent 6" w:semiHidden="0" w:uiPriority="69" w:unhideWhenUsed="0"/>
+    <w:lsdException w:name="Dark List Accent 6" w:semiHidden="0" w:uiPriority="70" w:unhideWhenUsed="0"/>
+    <w:lsdException w:name="Colorful Shading Accent 6" w:semiHidden="0" w:uiPriority="71" w:unhideWhenUsed="0"/>
+    <w:lsdException w:name="Colorful List Accent 6" w:semiHidden="0" w:uiPriority="72" w:unhideWhenUsed="0"/>
+    <w:lsdException w:name="Colorful Grid Accent 6" w:semiHidden="0" w:uiPriority="73" w:unhideWhenUsed="0"/>
+    <w:lsdException w:name="Subtle Emphasis" w:semiHidden="0" w:uiPriority="19" w:unhideWhenUsed="0" w:qFormat="1"/>
+    <w:lsdException w:name="Intense Emphasis" w:semiHidden="0" w:uiPriority="21" w:unhideWhenUsed="0" w:qFormat="1"/>
+    <w:lsdException w:name="Subtle Reference" w:semiHidden="0" w:uiPriority="31" w:unhideWhenUsed="0" w:qFormat="1"/>
+    <w:lsdException w:name="Intense Reference" w:semiHidden="0" w:uiPriority="32" w:unhideWhenUsed="0" w:qFormat="1"/>
+    <w:lsdException w:name="Book Title" w:semiHidden="0" w:uiPriority="33" w:unhideWhenUsed="0" w:qFormat="1"/>
+    <w:lsdException w:name="Bibliography" w:uiPriority="37"/>
+    <w:lsdException w:name="TOC Heading" w:uiPriority="39" w:qFormat="1"/>
   </w:latentStyles>
   <w:style w:type="paragraph" w:default="1" w:styleId="Normal">
     <w:name w:val="Normal"/>
@@ -10145,7 +10855,6 @@
   <w:style w:type="character" w:default="1" w:styleId="DefaultParagraphFont">
     <w:name w:val="Default Paragraph Font"/>
     <w:uiPriority w:val="1"/>
-    <w:semiHidden/>
     <w:unhideWhenUsed/>
   </w:style>
   <w:style w:type="table" w:default="1" w:styleId="TableNormal">
@@ -10250,6 +10959,455 @@
     <w:rPr>
       <w:color w:val="605E5C"/>
       <w:shd w:val="clear" w:color="auto" w:fill="E1DFDD"/>
+    </w:rPr>
+  </w:style>
+  <w:style w:type="paragraph" w:styleId="EndnoteText">
+    <w:name w:val="endnote text"/>
+    <w:basedOn w:val="Normal"/>
+    <w:link w:val="EndnoteTextChar"/>
+    <w:uiPriority w:val="99"/>
+    <w:semiHidden/>
+    <w:unhideWhenUsed/>
+    <w:rsid w:val="00430F36"/>
+    <w:pPr>
+      <w:spacing w:after="0" w:line="240" w:lineRule="auto"/>
+    </w:pPr>
+    <w:rPr>
+      <w:sz w:val="20"/>
+      <w:szCs w:val="20"/>
+    </w:rPr>
+  </w:style>
+  <w:style w:type="character" w:customStyle="1" w:styleId="EndnoteTextChar">
+    <w:name w:val="Endnote Text Char"/>
+    <w:basedOn w:val="DefaultParagraphFont"/>
+    <w:link w:val="EndnoteText"/>
+    <w:uiPriority w:val="99"/>
+    <w:semiHidden/>
+    <w:rsid w:val="00430F36"/>
+    <w:rPr>
+      <w:rFonts w:cs="Times New Roman"/>
+      <w:sz w:val="20"/>
+      <w:szCs w:val="20"/>
+    </w:rPr>
+  </w:style>
+  <w:style w:type="character" w:styleId="EndnoteReference">
+    <w:name w:val="endnote reference"/>
+    <w:basedOn w:val="DefaultParagraphFont"/>
+    <w:uiPriority w:val="99"/>
+    <w:semiHidden/>
+    <w:unhideWhenUsed/>
+    <w:rsid w:val="00430F36"/>
+    <w:rPr>
+      <w:vertAlign w:val="superscript"/>
+    </w:rPr>
+  </w:style>
+  <w:style w:type="character" w:styleId="FollowedHyperlink">
+    <w:name w:val="FollowedHyperlink"/>
+    <w:basedOn w:val="DefaultParagraphFont"/>
+    <w:uiPriority w:val="99"/>
+    <w:semiHidden/>
+    <w:unhideWhenUsed/>
+    <w:rsid w:val="00605DB3"/>
+    <w:rPr>
+      <w:color w:val="800080" w:themeColor="followedHyperlink"/>
+      <w:u w:val="single"/>
+    </w:rPr>
+  </w:style>
+</w:styles>
+</file>
+
+<file path=word/stylesWithEffects.xml><?xml version="1.0" encoding="utf-8"?>
+<w:styles xmlns:wpc="http://schemas.microsoft.com/office/word/2010/wordprocessingCanvas" xmlns:mc="http://schemas.openxmlformats.org/markup-compatibility/2006" xmlns:o="urn:schemas-microsoft-com:office:office" xmlns:r="http://schemas.openxmlformats.org/officeDocument/2006/relationships" xmlns:m="http://schemas.openxmlformats.org/officeDocument/2006/math" xmlns:v="urn:schemas-microsoft-com:vml" xmlns:wp14="http://schemas.microsoft.com/office/word/2010/wordprocessingDrawing" xmlns:wp="http://schemas.openxmlformats.org/drawingml/2006/wordprocessingDrawing" xmlns:w10="urn:schemas-microsoft-com:office:word" xmlns:w="http://schemas.openxmlformats.org/wordprocessingml/2006/main" xmlns:w14="http://schemas.microsoft.com/office/word/2010/wordml" xmlns:wpg="http://schemas.microsoft.com/office/word/2010/wordprocessingGroup" xmlns:wpi="http://schemas.microsoft.com/office/word/2010/wordprocessingInk" xmlns:wne="http://schemas.microsoft.com/office/word/2006/wordml" xmlns:wps="http://schemas.microsoft.com/office/word/2010/wordprocessingShape" mc:Ignorable="w14 wp14">
+  <w:docDefaults>
+    <w:rPrDefault>
+      <w:rPr>
+        <w:rFonts w:asciiTheme="minorHAnsi" w:eastAsia="Times New Roman" w:hAnsiTheme="minorHAnsi" w:cstheme="minorHAnsi"/>
+        <w:sz w:val="22"/>
+        <w:szCs w:val="22"/>
+        <w:lang w:val="bg-BG" w:eastAsia="en-US" w:bidi="ar-SA"/>
+      </w:rPr>
+    </w:rPrDefault>
+    <w:pPrDefault>
+      <w:pPr>
+        <w:spacing w:after="200" w:line="276" w:lineRule="auto"/>
+      </w:pPr>
+    </w:pPrDefault>
+  </w:docDefaults>
+  <w:latentStyles w:defLockedState="0" w:defUIPriority="99" w:defSemiHidden="1" w:defUnhideWhenUsed="1" w:defQFormat="0" w:count="267">
+    <w:lsdException w:name="Normal" w:semiHidden="0" w:uiPriority="0" w:unhideWhenUsed="0" w:qFormat="1"/>
+    <w:lsdException w:name="heading 1" w:semiHidden="0" w:uiPriority="9" w:unhideWhenUsed="0" w:qFormat="1"/>
+    <w:lsdException w:name="heading 2" w:uiPriority="9" w:qFormat="1"/>
+    <w:lsdException w:name="heading 3" w:uiPriority="9" w:qFormat="1"/>
+    <w:lsdException w:name="heading 4" w:uiPriority="9" w:qFormat="1"/>
+    <w:lsdException w:name="heading 5" w:uiPriority="9" w:qFormat="1"/>
+    <w:lsdException w:name="heading 6" w:uiPriority="9" w:qFormat="1"/>
+    <w:lsdException w:name="heading 7" w:uiPriority="9" w:qFormat="1"/>
+    <w:lsdException w:name="heading 8" w:uiPriority="9" w:qFormat="1"/>
+    <w:lsdException w:name="heading 9" w:uiPriority="9" w:qFormat="1"/>
+    <w:lsdException w:name="toc 1" w:uiPriority="39"/>
+    <w:lsdException w:name="toc 2" w:uiPriority="39"/>
+    <w:lsdException w:name="toc 3" w:uiPriority="39"/>
+    <w:lsdException w:name="toc 4" w:uiPriority="39"/>
+    <w:lsdException w:name="toc 5" w:uiPriority="39"/>
+    <w:lsdException w:name="toc 6" w:uiPriority="39"/>
+    <w:lsdException w:name="toc 7" w:uiPriority="39"/>
+    <w:lsdException w:name="toc 8" w:uiPriority="39"/>
+    <w:lsdException w:name="toc 9" w:uiPriority="39"/>
+    <w:lsdException w:name="caption" w:uiPriority="35" w:qFormat="1"/>
+    <w:lsdException w:name="Title" w:semiHidden="0" w:uiPriority="10" w:unhideWhenUsed="0" w:qFormat="1"/>
+    <w:lsdException w:name="Default Paragraph Font" w:uiPriority="1"/>
+    <w:lsdException w:name="Subtitle" w:semiHidden="0" w:uiPriority="11" w:unhideWhenUsed="0" w:qFormat="1"/>
+    <w:lsdException w:name="Strong" w:semiHidden="0" w:uiPriority="22" w:unhideWhenUsed="0" w:qFormat="1"/>
+    <w:lsdException w:name="Emphasis" w:semiHidden="0" w:uiPriority="20" w:unhideWhenUsed="0" w:qFormat="1"/>
+    <w:lsdException w:name="Table Grid" w:semiHidden="0" w:uiPriority="59" w:unhideWhenUsed="0"/>
+    <w:lsdException w:name="Placeholder Text" w:unhideWhenUsed="0"/>
+    <w:lsdException w:name="No Spacing" w:semiHidden="0" w:uiPriority="1" w:unhideWhenUsed="0" w:qFormat="1"/>
+    <w:lsdException w:name="Light Shading" w:semiHidden="0" w:uiPriority="60" w:unhideWhenUsed="0"/>
+    <w:lsdException w:name="Light List" w:semiHidden="0" w:uiPriority="61" w:unhideWhenUsed="0"/>
+    <w:lsdException w:name="Light Grid" w:semiHidden="0" w:uiPriority="62" w:unhideWhenUsed="0"/>
+    <w:lsdException w:name="Medium Shading 1" w:semiHidden="0" w:uiPriority="63" w:unhideWhenUsed="0"/>
+    <w:lsdException w:name="Medium Shading 2" w:semiHidden="0" w:uiPriority="64" w:unhideWhenUsed="0"/>
+    <w:lsdException w:name="Medium List 1" w:semiHidden="0" w:uiPriority="65" w:unhideWhenUsed="0"/>
+    <w:lsdException w:name="Medium List 2" w:semiHidden="0" w:uiPriority="66" w:unhideWhenUsed="0"/>
+    <w:lsdException w:name="Medium Grid 1" w:semiHidden="0" w:uiPriority="67" w:unhideWhenUsed="0"/>
+    <w:lsdException w:name="Medium Grid 2" w:semiHidden="0" w:uiPriority="68" w:unhideWhenUsed="0"/>
+    <w:lsdException w:name="Medium Grid 3" w:semiHidden="0" w:uiPriority="69" w:unhideWhenUsed="0"/>
+    <w:lsdException w:name="Dark List" w:semiHidden="0" w:uiPriority="70" w:unhideWhenUsed="0"/>
+    <w:lsdException w:name="Colorful Shading" w:semiHidden="0" w:uiPriority="71" w:unhideWhenUsed="0"/>
+    <w:lsdException w:name="Colorful List" w:semiHidden="0" w:uiPriority="72" w:unhideWhenUsed="0"/>
+    <w:lsdException w:name="Colorful Grid" w:semiHidden="0" w:uiPriority="73" w:unhideWhenUsed="0"/>
+    <w:lsdException w:name="Light Shading Accent 1" w:semiHidden="0" w:uiPriority="60" w:unhideWhenUsed="0"/>
+    <w:lsdException w:name="Light List Accent 1" w:semiHidden="0" w:uiPriority="61" w:unhideWhenUsed="0"/>
+    <w:lsdException w:name="Light Grid Accent 1" w:semiHidden="0" w:uiPriority="62" w:unhideWhenUsed="0"/>
+    <w:lsdException w:name="Medium Shading 1 Accent 1" w:semiHidden="0" w:uiPriority="63" w:unhideWhenUsed="0"/>
+    <w:lsdException w:name="Medium Shading 2 Accent 1" w:semiHidden="0" w:uiPriority="64" w:unhideWhenUsed="0"/>
+    <w:lsdException w:name="Medium List 1 Accent 1" w:semiHidden="0" w:uiPriority="65" w:unhideWhenUsed="0"/>
+    <w:lsdException w:name="Revision" w:unhideWhenUsed="0"/>
+    <w:lsdException w:name="List Paragraph" w:semiHidden="0" w:uiPriority="34" w:unhideWhenUsed="0" w:qFormat="1"/>
+    <w:lsdException w:name="Quote" w:semiHidden="0" w:uiPriority="29" w:unhideWhenUsed="0" w:qFormat="1"/>
+    <w:lsdException w:name="Intense Quote" w:semiHidden="0" w:uiPriority="30" w:unhideWhenUsed="0" w:qFormat="1"/>
+    <w:lsdException w:name="Medium List 2 Accent 1" w:semiHidden="0" w:uiPriority="66" w:unhideWhenUsed="0"/>
+    <w:lsdException w:name="Medium Grid 1 Accent 1" w:semiHidden="0" w:uiPriority="67" w:unhideWhenUsed="0"/>
+    <w:lsdException w:name="Medium Grid 2 Accent 1" w:semiHidden="0" w:uiPriority="68" w:unhideWhenUsed="0"/>
+    <w:lsdException w:name="Medium Grid 3 Accent 1" w:semiHidden="0" w:uiPriority="69" w:unhideWhenUsed="0"/>
+    <w:lsdException w:name="Dark List Accent 1" w:semiHidden="0" w:uiPriority="70" w:unhideWhenUsed="0"/>
+    <w:lsdException w:name="Colorful Shading Accent 1" w:semiHidden="0" w:uiPriority="71" w:unhideWhenUsed="0"/>
+    <w:lsdException w:name="Colorful List Accent 1" w:semiHidden="0" w:uiPriority="72" w:unhideWhenUsed="0"/>
+    <w:lsdException w:name="Colorful Grid Accent 1" w:semiHidden="0" w:uiPriority="73" w:unhideWhenUsed="0"/>
+    <w:lsdException w:name="Light Shading Accent 2" w:semiHidden="0" w:uiPriority="60" w:unhideWhenUsed="0"/>
+    <w:lsdException w:name="Light List Accent 2" w:semiHidden="0" w:uiPriority="61" w:unhideWhenUsed="0"/>
+    <w:lsdException w:name="Light Grid Accent 2" w:semiHidden="0" w:uiPriority="62" w:unhideWhenUsed="0"/>
+    <w:lsdException w:name="Medium Shading 1 Accent 2" w:semiHidden="0" w:uiPriority="63" w:unhideWhenUsed="0"/>
+    <w:lsdException w:name="Medium Shading 2 Accent 2" w:semiHidden="0" w:uiPriority="64" w:unhideWhenUsed="0"/>
+    <w:lsdException w:name="Medium List 1 Accent 2" w:semiHidden="0" w:uiPriority="65" w:unhideWhenUsed="0"/>
+    <w:lsdException w:name="Medium List 2 Accent 2" w:semiHidden="0" w:uiPriority="66" w:unhideWhenUsed="0"/>
+    <w:lsdException w:name="Medium Grid 1 Accent 2" w:semiHidden="0" w:uiPriority="67" w:unhideWhenUsed="0"/>
+    <w:lsdException w:name="Medium Grid 2 Accent 2" w:semiHidden="0" w:uiPriority="68" w:unhideWhenUsed="0"/>
+    <w:lsdException w:name="Medium Grid 3 Accent 2" w:semiHidden="0" w:uiPriority="69" w:unhideWhenUsed="0"/>
+    <w:lsdException w:name="Dark List Accent 2" w:semiHidden="0" w:uiPriority="70" w:unhideWhenUsed="0"/>
+    <w:lsdException w:name="Colorful Shading Accent 2" w:semiHidden="0" w:uiPriority="71" w:unhideWhenUsed="0"/>
+    <w:lsdException w:name="Colorful List Accent 2" w:semiHidden="0" w:uiPriority="72" w:unhideWhenUsed="0"/>
+    <w:lsdException w:name="Colorful Grid Accent 2" w:semiHidden="0" w:uiPriority="73" w:unhideWhenUsed="0"/>
+    <w:lsdException w:name="Light Shading Accent 3" w:semiHidden="0" w:uiPriority="60" w:unhideWhenUsed="0"/>
+    <w:lsdException w:name="Light List Accent 3" w:semiHidden="0" w:uiPriority="61" w:unhideWhenUsed="0"/>
+    <w:lsdException w:name="Light Grid Accent 3" w:semiHidden="0" w:uiPriority="62" w:unhideWhenUsed="0"/>
+    <w:lsdException w:name="Medium Shading 1 Accent 3" w:semiHidden="0" w:uiPriority="63" w:unhideWhenUsed="0"/>
+    <w:lsdException w:name="Medium Shading 2 Accent 3" w:semiHidden="0" w:uiPriority="64" w:unhideWhenUsed="0"/>
+    <w:lsdException w:name="Medium List 1 Accent 3" w:semiHidden="0" w:uiPriority="65" w:unhideWhenUsed="0"/>
+    <w:lsdException w:name="Medium List 2 Accent 3" w:semiHidden="0" w:uiPriority="66" w:unhideWhenUsed="0"/>
+    <w:lsdException w:name="Medium Grid 1 Accent 3" w:semiHidden="0" w:uiPriority="67" w:unhideWhenUsed="0"/>
+    <w:lsdException w:name="Medium Grid 2 Accent 3" w:semiHidden="0" w:uiPriority="68" w:unhideWhenUsed="0"/>
+    <w:lsdException w:name="Medium Grid 3 Accent 3" w:semiHidden="0" w:uiPriority="69" w:unhideWhenUsed="0"/>
+    <w:lsdException w:name="Dark List Accent 3" w:semiHidden="0" w:uiPriority="70" w:unhideWhenUsed="0"/>
+    <w:lsdException w:name="Colorful Shading Accent 3" w:semiHidden="0" w:uiPriority="71" w:unhideWhenUsed="0"/>
+    <w:lsdException w:name="Colorful List Accent 3" w:semiHidden="0" w:uiPriority="72" w:unhideWhenUsed="0"/>
+    <w:lsdException w:name="Colorful Grid Accent 3" w:semiHidden="0" w:uiPriority="73" w:unhideWhenUsed="0"/>
+    <w:lsdException w:name="Light Shading Accent 4" w:semiHidden="0" w:uiPriority="60" w:unhideWhenUsed="0"/>
+    <w:lsdException w:name="Light List Accent 4" w:semiHidden="0" w:uiPriority="61" w:unhideWhenUsed="0"/>
+    <w:lsdException w:name="Light Grid Accent 4" w:semiHidden="0" w:uiPriority="62" w:unhideWhenUsed="0"/>
+    <w:lsdException w:name="Medium Shading 1 Accent 4" w:semiHidden="0" w:uiPriority="63" w:unhideWhenUsed="0"/>
+    <w:lsdException w:name="Medium Shading 2 Accent 4" w:semiHidden="0" w:uiPriority="64" w:unhideWhenUsed="0"/>
+    <w:lsdException w:name="Medium List 1 Accent 4" w:semiHidden="0" w:uiPriority="65" w:unhideWhenUsed="0"/>
+    <w:lsdException w:name="Medium List 2 Accent 4" w:semiHidden="0" w:uiPriority="66" w:unhideWhenUsed="0"/>
+    <w:lsdException w:name="Medium Grid 1 Accent 4" w:semiHidden="0" w:uiPriority="67" w:unhideWhenUsed="0"/>
+    <w:lsdException w:name="Medium Grid 2 Accent 4" w:semiHidden="0" w:uiPriority="68" w:unhideWhenUsed="0"/>
+    <w:lsdException w:name="Medium Grid 3 Accent 4" w:semiHidden="0" w:uiPriority="69" w:unhideWhenUsed="0"/>
+    <w:lsdException w:name="Dark List Accent 4" w:semiHidden="0" w:uiPriority="70" w:unhideWhenUsed="0"/>
+    <w:lsdException w:name="Colorful Shading Accent 4" w:semiHidden="0" w:uiPriority="71" w:unhideWhenUsed="0"/>
+    <w:lsdException w:name="Colorful List Accent 4" w:semiHidden="0" w:uiPriority="72" w:unhideWhenUsed="0"/>
+    <w:lsdException w:name="Colorful Grid Accent 4" w:semiHidden="0" w:uiPriority="73" w:unhideWhenUsed="0"/>
+    <w:lsdException w:name="Light Shading Accent 5" w:semiHidden="0" w:uiPriority="60" w:unhideWhenUsed="0"/>
+    <w:lsdException w:name="Light List Accent 5" w:semiHidden="0" w:uiPriority="61" w:unhideWhenUsed="0"/>
+    <w:lsdException w:name="Light Grid Accent 5" w:semiHidden="0" w:uiPriority="62" w:unhideWhenUsed="0"/>
+    <w:lsdException w:name="Medium Shading 1 Accent 5" w:semiHidden="0" w:uiPriority="63" w:unhideWhenUsed="0"/>
+    <w:lsdException w:name="Medium Shading 2 Accent 5" w:semiHidden="0" w:uiPriority="64" w:unhideWhenUsed="0"/>
+    <w:lsdException w:name="Medium List 1 Accent 5" w:semiHidden="0" w:uiPriority="65" w:unhideWhenUsed="0"/>
+    <w:lsdException w:name="Medium List 2 Accent 5" w:semiHidden="0" w:uiPriority="66" w:unhideWhenUsed="0"/>
+    <w:lsdException w:name="Medium Grid 1 Accent 5" w:semiHidden="0" w:uiPriority="67" w:unhideWhenUsed="0"/>
+    <w:lsdException w:name="Medium Grid 2 Accent 5" w:semiHidden="0" w:uiPriority="68" w:unhideWhenUsed="0"/>
+    <w:lsdException w:name="Medium Grid 3 Accent 5" w:semiHidden="0" w:uiPriority="69" w:unhideWhenUsed="0"/>
+    <w:lsdException w:name="Dark List Accent 5" w:semiHidden="0" w:uiPriority="70" w:unhideWhenUsed="0"/>
+    <w:lsdException w:name="Colorful Shading Accent 5" w:semiHidden="0" w:uiPriority="71" w:unhideWhenUsed="0"/>
+    <w:lsdException w:name="Colorful List Accent 5" w:semiHidden="0" w:uiPriority="72" w:unhideWhenUsed="0"/>
+    <w:lsdException w:name="Colorful Grid Accent 5" w:semiHidden="0" w:uiPriority="73" w:unhideWhenUsed="0"/>
+    <w:lsdException w:name="Light Shading Accent 6" w:semiHidden="0" w:uiPriority="60" w:unhideWhenUsed="0"/>
+    <w:lsdException w:name="Light List Accent 6" w:semiHidden="0" w:uiPriority="61" w:unhideWhenUsed="0"/>
+    <w:lsdException w:name="Light Grid Accent 6" w:semiHidden="0" w:uiPriority="62" w:unhideWhenUsed="0"/>
+    <w:lsdException w:name="Medium Shading 1 Accent 6" w:semiHidden="0" w:uiPriority="63" w:unhideWhenUsed="0"/>
+    <w:lsdException w:name="Medium Shading 2 Accent 6" w:semiHidden="0" w:uiPriority="64" w:unhideWhenUsed="0"/>
+    <w:lsdException w:name="Medium List 1 Accent 6" w:semiHidden="0" w:uiPriority="65" w:unhideWhenUsed="0"/>
+    <w:lsdException w:name="Medium List 2 Accent 6" w:semiHidden="0" w:uiPriority="66" w:unhideWhenUsed="0"/>
+    <w:lsdException w:name="Medium Grid 1 Accent 6" w:semiHidden="0" w:uiPriority="67" w:unhideWhenUsed="0"/>
+    <w:lsdException w:name="Medium Grid 2 Accent 6" w:semiHidden="0" w:uiPriority="68" w:unhideWhenUsed="0"/>
+    <w:lsdException w:name="Medium Grid 3 Accent 6" w:semiHidden="0" w:uiPriority="69" w:unhideWhenUsed="0"/>
+    <w:lsdException w:name="Dark List Accent 6" w:semiHidden="0" w:uiPriority="70" w:unhideWhenUsed="0"/>
+    <w:lsdException w:name="Colorful Shading Accent 6" w:semiHidden="0" w:uiPriority="71" w:unhideWhenUsed="0"/>
+    <w:lsdException w:name="Colorful List Accent 6" w:semiHidden="0" w:uiPriority="72" w:unhideWhenUsed="0"/>
+    <w:lsdException w:name="Colorful Grid Accent 6" w:semiHidden="0" w:uiPriority="73" w:unhideWhenUsed="0"/>
+    <w:lsdException w:name="Subtle Emphasis" w:semiHidden="0" w:uiPriority="19" w:unhideWhenUsed="0" w:qFormat="1"/>
+    <w:lsdException w:name="Intense Emphasis" w:semiHidden="0" w:uiPriority="21" w:unhideWhenUsed="0" w:qFormat="1"/>
+    <w:lsdException w:name="Subtle Reference" w:semiHidden="0" w:uiPriority="31" w:unhideWhenUsed="0" w:qFormat="1"/>
+    <w:lsdException w:name="Intense Reference" w:semiHidden="0" w:uiPriority="32" w:unhideWhenUsed="0" w:qFormat="1"/>
+    <w:lsdException w:name="Book Title" w:semiHidden="0" w:uiPriority="33" w:unhideWhenUsed="0" w:qFormat="1"/>
+    <w:lsdException w:name="Bibliography" w:uiPriority="37"/>
+    <w:lsdException w:name="TOC Heading" w:uiPriority="39" w:qFormat="1"/>
+  </w:latentStyles>
+  <w:style w:type="paragraph" w:default="1" w:styleId="Normal">
+    <w:name w:val="Normal"/>
+    <w:qFormat/>
+    <w:rsid w:val="002B3D5C"/>
+    <w:rPr>
+      <w:rFonts w:cs="Times New Roman"/>
+    </w:rPr>
+  </w:style>
+  <w:style w:type="paragraph" w:styleId="Heading1">
+    <w:name w:val="heading 1"/>
+    <w:basedOn w:val="Normal"/>
+    <w:next w:val="Normal"/>
+    <w:link w:val="Heading1Char"/>
+    <w:uiPriority w:val="9"/>
+    <w:qFormat/>
+    <w:rsid w:val="00A45680"/>
+    <w:pPr>
+      <w:keepNext/>
+      <w:keepLines/>
+      <w:spacing w:before="480" w:after="0"/>
+      <w:outlineLvl w:val="0"/>
+    </w:pPr>
+    <w:rPr>
+      <w:rFonts w:asciiTheme="majorHAnsi" w:eastAsiaTheme="majorEastAsia" w:hAnsiTheme="majorHAnsi"/>
+      <w:b/>
+      <w:bCs/>
+      <w:color w:val="365F91" w:themeColor="accent1" w:themeShade="BF"/>
+      <w:sz w:val="28"/>
+      <w:szCs w:val="28"/>
+    </w:rPr>
+  </w:style>
+  <w:style w:type="paragraph" w:styleId="Heading2">
+    <w:name w:val="heading 2"/>
+    <w:basedOn w:val="Normal"/>
+    <w:next w:val="Normal"/>
+    <w:link w:val="Heading2Char"/>
+    <w:uiPriority w:val="9"/>
+    <w:unhideWhenUsed/>
+    <w:qFormat/>
+    <w:rsid w:val="00A45680"/>
+    <w:pPr>
+      <w:keepNext/>
+      <w:keepLines/>
+      <w:spacing w:before="200" w:after="0"/>
+      <w:outlineLvl w:val="1"/>
+    </w:pPr>
+    <w:rPr>
+      <w:rFonts w:asciiTheme="majorHAnsi" w:eastAsiaTheme="majorEastAsia" w:hAnsiTheme="majorHAnsi"/>
+      <w:b/>
+      <w:bCs/>
+      <w:color w:val="4F81BD" w:themeColor="accent1"/>
+      <w:sz w:val="26"/>
+      <w:szCs w:val="26"/>
+    </w:rPr>
+  </w:style>
+  <w:style w:type="paragraph" w:styleId="Heading3">
+    <w:name w:val="heading 3"/>
+    <w:basedOn w:val="Normal"/>
+    <w:next w:val="Normal"/>
+    <w:link w:val="Heading3Char"/>
+    <w:uiPriority w:val="9"/>
+    <w:unhideWhenUsed/>
+    <w:qFormat/>
+    <w:rsid w:val="00663D82"/>
+    <w:pPr>
+      <w:keepNext/>
+      <w:keepLines/>
+      <w:spacing w:before="200" w:after="0"/>
+      <w:outlineLvl w:val="2"/>
+    </w:pPr>
+    <w:rPr>
+      <w:rFonts w:asciiTheme="majorHAnsi" w:eastAsiaTheme="majorEastAsia" w:hAnsiTheme="majorHAnsi"/>
+      <w:b/>
+      <w:bCs/>
+      <w:color w:val="4F81BD" w:themeColor="accent1"/>
+    </w:rPr>
+  </w:style>
+  <w:style w:type="character" w:default="1" w:styleId="DefaultParagraphFont">
+    <w:name w:val="Default Paragraph Font"/>
+    <w:uiPriority w:val="1"/>
+    <w:unhideWhenUsed/>
+  </w:style>
+  <w:style w:type="table" w:default="1" w:styleId="TableNormal">
+    <w:name w:val="Normal Table"/>
+    <w:uiPriority w:val="99"/>
+    <w:semiHidden/>
+    <w:unhideWhenUsed/>
+    <w:tblPr>
+      <w:tblInd w:w="0" w:type="dxa"/>
+      <w:tblCellMar>
+        <w:top w:w="0" w:type="dxa"/>
+        <w:left w:w="108" w:type="dxa"/>
+        <w:bottom w:w="0" w:type="dxa"/>
+        <w:right w:w="108" w:type="dxa"/>
+      </w:tblCellMar>
+    </w:tblPr>
+  </w:style>
+  <w:style w:type="numbering" w:default="1" w:styleId="NoList">
+    <w:name w:val="No List"/>
+    <w:uiPriority w:val="99"/>
+    <w:semiHidden/>
+    <w:unhideWhenUsed/>
+  </w:style>
+  <w:style w:type="character" w:customStyle="1" w:styleId="Heading1Char">
+    <w:name w:val="Heading 1 Char"/>
+    <w:basedOn w:val="DefaultParagraphFont"/>
+    <w:link w:val="Heading1"/>
+    <w:uiPriority w:val="9"/>
+    <w:locked/>
+    <w:rsid w:val="00A45680"/>
+    <w:rPr>
+      <w:rFonts w:asciiTheme="majorHAnsi" w:eastAsiaTheme="majorEastAsia" w:hAnsiTheme="majorHAnsi" w:cs="Times New Roman"/>
+      <w:b/>
+      <w:bCs/>
+      <w:color w:val="365F91" w:themeColor="accent1" w:themeShade="BF"/>
+      <w:sz w:val="28"/>
+      <w:szCs w:val="28"/>
+    </w:rPr>
+  </w:style>
+  <w:style w:type="character" w:customStyle="1" w:styleId="Heading2Char">
+    <w:name w:val="Heading 2 Char"/>
+    <w:basedOn w:val="DefaultParagraphFont"/>
+    <w:link w:val="Heading2"/>
+    <w:uiPriority w:val="9"/>
+    <w:locked/>
+    <w:rsid w:val="00A45680"/>
+    <w:rPr>
+      <w:rFonts w:asciiTheme="majorHAnsi" w:eastAsiaTheme="majorEastAsia" w:hAnsiTheme="majorHAnsi" w:cs="Times New Roman"/>
+      <w:b/>
+      <w:bCs/>
+      <w:color w:val="4F81BD" w:themeColor="accent1"/>
+      <w:sz w:val="26"/>
+      <w:szCs w:val="26"/>
+    </w:rPr>
+  </w:style>
+  <w:style w:type="character" w:customStyle="1" w:styleId="Heading3Char">
+    <w:name w:val="Heading 3 Char"/>
+    <w:basedOn w:val="DefaultParagraphFont"/>
+    <w:link w:val="Heading3"/>
+    <w:uiPriority w:val="9"/>
+    <w:locked/>
+    <w:rsid w:val="00663D82"/>
+    <w:rPr>
+      <w:rFonts w:asciiTheme="majorHAnsi" w:eastAsiaTheme="majorEastAsia" w:hAnsiTheme="majorHAnsi" w:cs="Times New Roman"/>
+      <w:b/>
+      <w:bCs/>
+      <w:color w:val="4F81BD" w:themeColor="accent1"/>
+    </w:rPr>
+  </w:style>
+  <w:style w:type="paragraph" w:styleId="ListParagraph">
+    <w:name w:val="List Paragraph"/>
+    <w:basedOn w:val="Normal"/>
+    <w:uiPriority w:val="34"/>
+    <w:qFormat/>
+    <w:rsid w:val="00663D82"/>
+    <w:pPr>
+      <w:numPr>
+        <w:numId w:val="2"/>
+      </w:numPr>
+      <w:contextualSpacing/>
+    </w:pPr>
+  </w:style>
+  <w:style w:type="character" w:styleId="Hyperlink">
+    <w:name w:val="Hyperlink"/>
+    <w:basedOn w:val="DefaultParagraphFont"/>
+    <w:uiPriority w:val="99"/>
+    <w:unhideWhenUsed/>
+    <w:rsid w:val="00DB14CF"/>
+    <w:rPr>
+      <w:rFonts w:cs="Times New Roman"/>
+      <w:color w:val="0000FF" w:themeColor="hyperlink"/>
+      <w:u w:val="single"/>
+    </w:rPr>
+  </w:style>
+  <w:style w:type="character" w:customStyle="1" w:styleId="UnresolvedMention">
+    <w:name w:val="Unresolved Mention"/>
+    <w:basedOn w:val="DefaultParagraphFont"/>
+    <w:uiPriority w:val="99"/>
+    <w:semiHidden/>
+    <w:unhideWhenUsed/>
+    <w:rsid w:val="00180442"/>
+    <w:rPr>
+      <w:color w:val="605E5C"/>
+      <w:shd w:val="clear" w:color="auto" w:fill="E1DFDD"/>
+    </w:rPr>
+  </w:style>
+  <w:style w:type="paragraph" w:styleId="EndnoteText">
+    <w:name w:val="endnote text"/>
+    <w:basedOn w:val="Normal"/>
+    <w:link w:val="EndnoteTextChar"/>
+    <w:uiPriority w:val="99"/>
+    <w:semiHidden/>
+    <w:unhideWhenUsed/>
+    <w:rsid w:val="00430F36"/>
+    <w:pPr>
+      <w:spacing w:after="0" w:line="240" w:lineRule="auto"/>
+    </w:pPr>
+    <w:rPr>
+      <w:sz w:val="20"/>
+      <w:szCs w:val="20"/>
+    </w:rPr>
+  </w:style>
+  <w:style w:type="character" w:customStyle="1" w:styleId="EndnoteTextChar">
+    <w:name w:val="Endnote Text Char"/>
+    <w:basedOn w:val="DefaultParagraphFont"/>
+    <w:link w:val="EndnoteText"/>
+    <w:uiPriority w:val="99"/>
+    <w:semiHidden/>
+    <w:rsid w:val="00430F36"/>
+    <w:rPr>
+      <w:rFonts w:cs="Times New Roman"/>
+      <w:sz w:val="20"/>
+      <w:szCs w:val="20"/>
+    </w:rPr>
+  </w:style>
+  <w:style w:type="character" w:styleId="EndnoteReference">
+    <w:name w:val="endnote reference"/>
+    <w:basedOn w:val="DefaultParagraphFont"/>
+    <w:uiPriority w:val="99"/>
+    <w:semiHidden/>
+    <w:unhideWhenUsed/>
+    <w:rsid w:val="00430F36"/>
+    <w:rPr>
+      <w:vertAlign w:val="superscript"/>
+    </w:rPr>
+  </w:style>
+  <w:style w:type="character" w:styleId="FollowedHyperlink">
+    <w:name w:val="FollowedHyperlink"/>
+    <w:basedOn w:val="DefaultParagraphFont"/>
+    <w:uiPriority w:val="99"/>
+    <w:semiHidden/>
+    <w:unhideWhenUsed/>
+    <w:rsid w:val="00605DB3"/>
+    <w:rPr>
+      <w:color w:val="800080" w:themeColor="followedHyperlink"/>
+      <w:u w:val="single"/>
     </w:rPr>
   </w:style>
 </w:styles>
@@ -10536,4 +11694,16 @@
   <a:objectDefaults/>
   <a:extraClrSchemeLst/>
 </a:theme>
+</file>
+
+<file path=customXml/item1.xml><?xml version="1.0" encoding="utf-8"?>
+<b:Sources xmlns:b="http://schemas.openxmlformats.org/officeDocument/2006/bibliography" xmlns="http://schemas.openxmlformats.org/officeDocument/2006/bibliography" SelectedStyle="\APA.XSL" StyleName="APA"/>
+</file>
+
+<file path=customXml/itemProps1.xml><?xml version="1.0" encoding="utf-8"?>
+<ds:datastoreItem xmlns:ds="http://schemas.openxmlformats.org/officeDocument/2006/customXml" ds:itemID="{0C1C597A-9F4D-4689-9C92-F995AA03A3BC}">
+  <ds:schemaRefs>
+    <ds:schemaRef ds:uri="http://schemas.openxmlformats.org/officeDocument/2006/bibliography"/>
+  </ds:schemaRefs>
+</ds:datastoreItem>
 </file>
</xml_diff>

<commit_message>
documentation point 3 initial version
</commit_message>
<xml_diff>
--- a/doctemplate_and_requirements/documentation_template.docx
+++ b/doctemplate_and_requirements/documentation_template.docx
@@ -2159,6 +2159,7 @@
         <w:spacing w:before="120" w:after="160" w:line="259" w:lineRule="auto"/>
         <w:rPr>
           <w:rFonts w:eastAsia="Calibri" w:cstheme="minorHAnsi"/>
+          <w:lang w:val="en-US"/>
         </w:rPr>
       </w:pPr>
       <w:r>
@@ -2173,6 +2174,8 @@
         </w:rPr>
         <w:t>Описание на останалите изисквания</w:t>
       </w:r>
+      <w:bookmarkStart w:id="2" w:name="_GoBack"/>
+      <w:bookmarkEnd w:id="2"/>
     </w:p>
     <w:p>
       <w:pPr>
@@ -2229,6 +2232,220 @@
       </w:r>
     </w:p>
     <w:p>
+      <w:r>
+        <w:t>Проектът представлява уеб базирано приложение за управление на турнири, реализирано като server-side rendered (SSR) PHP система. Всички основни операции – автентикация, управление на турнири, записване и отписване на участници – се обработват на сървъра, който генерира готов HTML за клиента.</w:t>
+      </w:r>
+    </w:p>
+    <w:p>
+      <w:r>
+        <w:t>3.1 Архитектура и структура</w:t>
+      </w:r>
+    </w:p>
+    <w:p>
+      <w:r>
+        <w:t>Приложението използва клиент–сървър архитектура, комбинирана с Front Controller модел. Уеб интерфейсът и API функционалността са централизирани чрез index.php, който служи като единна входна точка за обработка на заявки.</w:t>
+      </w:r>
+    </w:p>
+    <w:p>
+      <w:r>
+        <w:t>Чрез конфигурация в .htaccess:</w:t>
+      </w:r>
+    </w:p>
+    <w:p>
+      <w:r>
+        <w:t>•</w:t>
+      </w:r>
+      <w:r>
+        <w:tab/>
+        <w:t>се ограничава директният достъп до вътрешни директории със сензитивна информация (config, database)</w:t>
+      </w:r>
+    </w:p>
+    <w:p>
+      <w:r>
+        <w:t>•</w:t>
+      </w:r>
+      <w:r>
+        <w:tab/>
+        <w:t>определени заявки се пренасочват към index.php</w:t>
+      </w:r>
+    </w:p>
+    <w:p>
+      <w:r>
+        <w:t>3.2 Модулна декомпозиция</w:t>
+      </w:r>
+    </w:p>
+    <w:p>
+      <w:r>
+        <w:t>Системата е разделена на логически модули:</w:t>
+      </w:r>
+    </w:p>
+    <w:p>
+      <w:r>
+        <w:t>•</w:t>
+      </w:r>
+      <w:r>
+        <w:tab/>
+        <w:t>Модул за автентикация и достъп</w:t>
+      </w:r>
+    </w:p>
+    <w:p>
+      <w:r>
+        <w:t>o</w:t>
+      </w:r>
+      <w:r>
+        <w:tab/>
+        <w:t>управление на сесии и контрол на правата</w:t>
+      </w:r>
+    </w:p>
+    <w:p>
+      <w:r>
+        <w:lastRenderedPageBreak/>
+        <w:t>•</w:t>
+      </w:r>
+      <w:r>
+        <w:tab/>
+        <w:t>Модул за потребители</w:t>
+      </w:r>
+    </w:p>
+    <w:p>
+      <w:r>
+        <w:t>o</w:t>
+      </w:r>
+      <w:r>
+        <w:tab/>
+        <w:t>потребителски профил, статистики и отличия</w:t>
+      </w:r>
+    </w:p>
+    <w:p>
+      <w:r>
+        <w:t>•</w:t>
+      </w:r>
+      <w:r>
+        <w:tab/>
+        <w:t>Модул за управление на турнири</w:t>
+      </w:r>
+    </w:p>
+    <w:p>
+      <w:r>
+        <w:t>o</w:t>
+      </w:r>
+      <w:r>
+        <w:tab/>
+        <w:t>създаване, визуализация, записване и отписване от турнири</w:t>
+      </w:r>
+    </w:p>
+    <w:p>
+      <w:r>
+        <w:t>•</w:t>
+      </w:r>
+      <w:r>
+        <w:tab/>
+        <w:t>Модул за бизнес логика</w:t>
+      </w:r>
+    </w:p>
+    <w:p>
+      <w:r>
+        <w:t>o</w:t>
+      </w:r>
+      <w:r>
+        <w:tab/>
+        <w:t>автоматично обновяване на статуси на турнири според времето</w:t>
+      </w:r>
+    </w:p>
+    <w:p>
+      <w:r>
+        <w:t>•</w:t>
+      </w:r>
+      <w:r>
+        <w:tab/>
+        <w:t>Модул за данни</w:t>
+      </w:r>
+    </w:p>
+    <w:p>
+      <w:r>
+        <w:t>o</w:t>
+      </w:r>
+      <w:r>
+        <w:tab/>
+        <w:t>централизирана връзка с базата данни и SQL операции</w:t>
+      </w:r>
+    </w:p>
+    <w:p>
+      <w:r>
+        <w:t>•</w:t>
+      </w:r>
+      <w:r>
+        <w:tab/>
+        <w:t>API модул</w:t>
+      </w:r>
+    </w:p>
+    <w:p>
+      <w:r>
+        <w:t>o</w:t>
+      </w:r>
+      <w:r>
+        <w:tab/>
+        <w:t>дефинирани команди за външни скриптове и интеграции</w:t>
+      </w:r>
+    </w:p>
+    <w:p>
+      <w:r>
+        <w:t>Всеки модул има ясно дефинирана отговорност и взаимодейства с останалите чрез контролирани точки на достъп.</w:t>
+      </w:r>
+    </w:p>
+    <w:p>
+      <w:r>
+        <w:t>3.3 Презентационен и клиентски слой</w:t>
+      </w:r>
+    </w:p>
+    <w:p>
+      <w:r>
+        <w:t>Презентационният слой се реализира чрез динамично генериран HTML (SSR). Клиентската логика използва ограничен JavaScript само за визуални подобрения като филтриране и сортиране, без да засяга бизнес логиката.</w:t>
+      </w:r>
+    </w:p>
+    <w:p>
+      <w:r>
+        <w:t>3.4 Архитектурен модел</w:t>
+      </w:r>
+    </w:p>
+    <w:p>
+      <w:r>
+        <w:t>Проектът следва опростен MVC-подобен модел, при който:</w:t>
+      </w:r>
+    </w:p>
+    <w:p>
+      <w:r>
+        <w:t>•</w:t>
+      </w:r>
+      <w:r>
+        <w:tab/>
+        <w:t>PHP скриптовете изпълняват ролята на контролери</w:t>
+      </w:r>
+    </w:p>
+    <w:p>
+      <w:r>
+        <w:t>•</w:t>
+      </w:r>
+      <w:r>
+        <w:tab/>
+        <w:t>базата данни представлява моделния слой</w:t>
+      </w:r>
+    </w:p>
+    <w:p>
+      <w:r>
+        <w:t>•</w:t>
+      </w:r>
+      <w:r>
+        <w:tab/>
+        <w:t>HTML шаблоните – изгледа</w:t>
+      </w:r>
+    </w:p>
+    <w:p>
+      <w:r>
+        <w:t>Комбинацията от SSR, API слой и Front Controller модел осигурява добра разширяемост, сигурност и поддържане на приложението.</w:t>
+      </w:r>
+    </w:p>
+    <w:p>
       <w:pPr>
         <w:pStyle w:val="Heading2"/>
         <w:rPr>
@@ -2366,6 +2583,7 @@
         </w:rPr>
       </w:pPr>
       <w:r>
+        <w:lastRenderedPageBreak/>
         <w:t>З</w:t>
       </w:r>
       <w:r>
@@ -2784,7 +3002,6 @@
           <w:sz w:val="22"/>
           <w:szCs w:val="22"/>
         </w:rPr>
-        <w:lastRenderedPageBreak/>
         <w:t xml:space="preserve">6. Кратко ръководство на потребителя </w:t>
       </w:r>
       <w:r>
@@ -2989,6 +3206,7 @@
         </w:rPr>
       </w:pPr>
       <w:r>
+        <w:lastRenderedPageBreak/>
         <w:t>На страницата на предстоящ турнир потребителят може да се включи в отборен турнир</w:t>
       </w:r>
       <w:r>
@@ -3135,7 +3353,6 @@
           <w:noProof/>
           <w:lang w:val="en-US"/>
         </w:rPr>
-        <w:lastRenderedPageBreak/>
         <w:drawing>
           <wp:inline distT="0" distB="0" distL="0" distR="0" wp14:anchorId="5F996687" wp14:editId="24F2A35D">
             <wp:extent cx="5760720" cy="2572385"/>
@@ -3326,8 +3543,8 @@
         </w:rPr>
         <w:t>API:</w:t>
       </w:r>
-      <w:bookmarkStart w:id="2" w:name="api"/>
-      <w:bookmarkEnd w:id="2"/>
+      <w:bookmarkStart w:id="3" w:name="api"/>
+      <w:bookmarkEnd w:id="3"/>
     </w:p>
     <w:p>
       <w:r>
@@ -3488,8 +3705,6 @@
         </w:rPr>
         <w:t xml:space="preserve"> </w:t>
       </w:r>
-      <w:bookmarkStart w:id="3" w:name="_GoBack"/>
-      <w:bookmarkEnd w:id="3"/>
       <w:r>
         <w:t>директорията.</w:t>
       </w:r>
@@ -3647,6 +3862,7 @@
     </w:p>
     <w:p>
       <w:r>
+        <w:lastRenderedPageBreak/>
         <w:t>﻿ID,Име</w:t>
       </w:r>
     </w:p>
@@ -4432,6 +4648,7 @@
           <w:sz w:val="22"/>
           <w:szCs w:val="22"/>
         </w:rPr>
+        <w:lastRenderedPageBreak/>
         <w:t xml:space="preserve">9. </w:t>
       </w:r>
       <w:r>
@@ -4630,7 +4847,6 @@
           <w:sz w:val="22"/>
           <w:szCs w:val="22"/>
         </w:rPr>
-        <w:lastRenderedPageBreak/>
         <w:t>1</w:t>
       </w:r>
       <w:r>
@@ -5263,6 +5479,7 @@
         <w:rPr>
           <w:lang w:bidi="he-IL"/>
         </w:rPr>
+        <w:lastRenderedPageBreak/>
         <w:t>Финален проект</w:t>
       </w:r>
       <w:r>
@@ -5389,14 +5606,7 @@
         <w:rPr>
           <w:lang w:bidi="he-IL"/>
         </w:rPr>
-        <w:t xml:space="preserve">2.2. За документация на проекта ползвайте шаблона (ще гледам да го кача скоро); Задължително потребителска документация (а.к.а. userguide) - няколко скрийншота с кратко разяснение; условие на проекта (т.е. какво сте разтълкували сме се разбрали да правите - то може и да се различава от описанието дадено в гугъл докс-а към момента); както и инструкции за инсталиране; за защитата - ще дам няколко дати през сесията/преди сесията + официалните дати, за който не успее да мине преди това; за защитата - кода, документацията/необходими </w:t>
-      </w:r>
-      <w:r>
-        <w:rPr>
-          <w:lang w:bidi="he-IL"/>
-        </w:rPr>
-        <w:lastRenderedPageBreak/>
-        <w:t>библиотеки/среди, инсталации - за инсталирането се предават на DVD (ако има още такова нещо като CD-може и на CD). Може по изключение да сложа И форма за качване само на документацията и програмен код и в мудъл, НО идеята е, че ако няма интернет (да речем е паднал мудъла, спрял е тока и т.н. - само по съдържанието на диска, който сте предали да може да се инсталира</w:t>
+        <w:t>2.2. За документация на проекта ползвайте шаблона (ще гледам да го кача скоро); Задължително потребителска документация (а.к.а. userguide) - няколко скрийншота с кратко разяснение; условие на проекта (т.е. какво сте разтълкували сме се разбрали да правите - то може и да се различава от описанието дадено в гугъл докс-а към момента); както и инструкции за инсталиране; за защитата - ще дам няколко дати през сесията/преди сесията + официалните дати, за който не успее да мине преди това; за защитата - кода, документацията/необходими библиотеки/среди, инсталации - за инсталирането се предават на DVD (ако има още такова нещо като CD-може и на CD). Може по изключение да сложа И форма за качване само на документацията и програмен код и в мудъл, НО идеята е, че ако няма интернет (да речем е паднал мудъла, спрял е тока и т.н. - само по съдържанието на диска, който сте предали да може да се инсталира</w:t>
       </w:r>
       <w:r>
         <w:rPr>
@@ -5734,6 +5944,7 @@
         <w:rPr>
           <w:lang w:bidi="he-IL"/>
         </w:rPr>
+        <w:lastRenderedPageBreak/>
         <w:t>II. ФУНКЦИОНАЛНИ ХАРАКТЕРИСТИКИ: Съгласуват се с преподавателя - избира се темата, а каква да е функционалността - питате на лекции или се явявате на предварителна защита, където съгласувате обхвата на изискванията;</w:t>
       </w:r>
       <w:r>
@@ -5832,14 +6043,7 @@
         <w:rPr>
           <w:lang w:bidi="he-IL"/>
         </w:rPr>
-        <w:t xml:space="preserve">, примерни данни за тестване - администраторски акаунти, ръководство на </w:t>
-      </w:r>
-      <w:r>
-        <w:rPr>
-          <w:lang w:bidi="he-IL"/>
-        </w:rPr>
-        <w:lastRenderedPageBreak/>
-        <w:t xml:space="preserve">потребителя за различните роли </w:t>
+        <w:t xml:space="preserve">, примерни данни за тестване - администраторски акаунти, ръководство на потребителя за различните роли </w:t>
       </w:r>
       <w:r>
         <w:rPr>
@@ -7033,6 +7237,7 @@
           <w:szCs w:val="20"/>
           <w:highlight w:val="yellow"/>
         </w:rPr>
+        <w:lastRenderedPageBreak/>
         <w:tab/>
       </w:r>
       <w:r>
@@ -8367,7 +8572,6 @@
           <w:szCs w:val="20"/>
           <w:highlight w:val="yellow"/>
         </w:rPr>
-        <w:lastRenderedPageBreak/>
         <w:tab/>
       </w:r>
       <w:r>
@@ -9222,6 +9426,7 @@
         </w:rPr>
       </w:pPr>
       <w:r>
+        <w:lastRenderedPageBreak/>
         <w:t xml:space="preserve">  $SITE_URL=</w:t>
       </w:r>
       <w:r>
@@ -9436,7 +9641,6 @@
           <w:iCs/>
           <w:lang w:bidi="he-IL"/>
         </w:rPr>
-        <w:lastRenderedPageBreak/>
         <w:t>?&gt;</w:t>
       </w:r>
     </w:p>
@@ -9950,6 +10154,155 @@
     </w:lvl>
   </w:abstractNum>
   <w:abstractNum w:abstractNumId="4">
+    <w:nsid w:val="17B07CFD"/>
+    <w:multiLevelType w:val="multilevel"/>
+    <w:tmpl w:val="7C58BE20"/>
+    <w:lvl w:ilvl="0">
+      <w:start w:val="1"/>
+      <w:numFmt w:val="bullet"/>
+      <w:lvlText w:val=""/>
+      <w:lvlJc w:val="left"/>
+      <w:pPr>
+        <w:tabs>
+          <w:tab w:val="num" w:pos="720"/>
+        </w:tabs>
+        <w:ind w:left="720" w:hanging="360"/>
+      </w:pPr>
+      <w:rPr>
+        <w:rFonts w:ascii="Symbol" w:hAnsi="Symbol" w:hint="default"/>
+        <w:sz w:val="20"/>
+      </w:rPr>
+    </w:lvl>
+    <w:lvl w:ilvl="1" w:tentative="1">
+      <w:start w:val="1"/>
+      <w:numFmt w:val="bullet"/>
+      <w:lvlText w:val="o"/>
+      <w:lvlJc w:val="left"/>
+      <w:pPr>
+        <w:tabs>
+          <w:tab w:val="num" w:pos="1440"/>
+        </w:tabs>
+        <w:ind w:left="1440" w:hanging="360"/>
+      </w:pPr>
+      <w:rPr>
+        <w:rFonts w:ascii="Courier New" w:hAnsi="Courier New" w:hint="default"/>
+        <w:sz w:val="20"/>
+      </w:rPr>
+    </w:lvl>
+    <w:lvl w:ilvl="2" w:tentative="1">
+      <w:start w:val="1"/>
+      <w:numFmt w:val="bullet"/>
+      <w:lvlText w:val=""/>
+      <w:lvlJc w:val="left"/>
+      <w:pPr>
+        <w:tabs>
+          <w:tab w:val="num" w:pos="2160"/>
+        </w:tabs>
+        <w:ind w:left="2160" w:hanging="360"/>
+      </w:pPr>
+      <w:rPr>
+        <w:rFonts w:ascii="Wingdings" w:hAnsi="Wingdings" w:hint="default"/>
+        <w:sz w:val="20"/>
+      </w:rPr>
+    </w:lvl>
+    <w:lvl w:ilvl="3" w:tentative="1">
+      <w:start w:val="1"/>
+      <w:numFmt w:val="bullet"/>
+      <w:lvlText w:val=""/>
+      <w:lvlJc w:val="left"/>
+      <w:pPr>
+        <w:tabs>
+          <w:tab w:val="num" w:pos="2880"/>
+        </w:tabs>
+        <w:ind w:left="2880" w:hanging="360"/>
+      </w:pPr>
+      <w:rPr>
+        <w:rFonts w:ascii="Wingdings" w:hAnsi="Wingdings" w:hint="default"/>
+        <w:sz w:val="20"/>
+      </w:rPr>
+    </w:lvl>
+    <w:lvl w:ilvl="4" w:tentative="1">
+      <w:start w:val="1"/>
+      <w:numFmt w:val="bullet"/>
+      <w:lvlText w:val=""/>
+      <w:lvlJc w:val="left"/>
+      <w:pPr>
+        <w:tabs>
+          <w:tab w:val="num" w:pos="3600"/>
+        </w:tabs>
+        <w:ind w:left="3600" w:hanging="360"/>
+      </w:pPr>
+      <w:rPr>
+        <w:rFonts w:ascii="Wingdings" w:hAnsi="Wingdings" w:hint="default"/>
+        <w:sz w:val="20"/>
+      </w:rPr>
+    </w:lvl>
+    <w:lvl w:ilvl="5" w:tentative="1">
+      <w:start w:val="1"/>
+      <w:numFmt w:val="bullet"/>
+      <w:lvlText w:val=""/>
+      <w:lvlJc w:val="left"/>
+      <w:pPr>
+        <w:tabs>
+          <w:tab w:val="num" w:pos="4320"/>
+        </w:tabs>
+        <w:ind w:left="4320" w:hanging="360"/>
+      </w:pPr>
+      <w:rPr>
+        <w:rFonts w:ascii="Wingdings" w:hAnsi="Wingdings" w:hint="default"/>
+        <w:sz w:val="20"/>
+      </w:rPr>
+    </w:lvl>
+    <w:lvl w:ilvl="6" w:tentative="1">
+      <w:start w:val="1"/>
+      <w:numFmt w:val="bullet"/>
+      <w:lvlText w:val=""/>
+      <w:lvlJc w:val="left"/>
+      <w:pPr>
+        <w:tabs>
+          <w:tab w:val="num" w:pos="5040"/>
+        </w:tabs>
+        <w:ind w:left="5040" w:hanging="360"/>
+      </w:pPr>
+      <w:rPr>
+        <w:rFonts w:ascii="Wingdings" w:hAnsi="Wingdings" w:hint="default"/>
+        <w:sz w:val="20"/>
+      </w:rPr>
+    </w:lvl>
+    <w:lvl w:ilvl="7" w:tentative="1">
+      <w:start w:val="1"/>
+      <w:numFmt w:val="bullet"/>
+      <w:lvlText w:val=""/>
+      <w:lvlJc w:val="left"/>
+      <w:pPr>
+        <w:tabs>
+          <w:tab w:val="num" w:pos="5760"/>
+        </w:tabs>
+        <w:ind w:left="5760" w:hanging="360"/>
+      </w:pPr>
+      <w:rPr>
+        <w:rFonts w:ascii="Wingdings" w:hAnsi="Wingdings" w:hint="default"/>
+        <w:sz w:val="20"/>
+      </w:rPr>
+    </w:lvl>
+    <w:lvl w:ilvl="8" w:tentative="1">
+      <w:start w:val="1"/>
+      <w:numFmt w:val="bullet"/>
+      <w:lvlText w:val=""/>
+      <w:lvlJc w:val="left"/>
+      <w:pPr>
+        <w:tabs>
+          <w:tab w:val="num" w:pos="6480"/>
+        </w:tabs>
+        <w:ind w:left="6480" w:hanging="360"/>
+      </w:pPr>
+      <w:rPr>
+        <w:rFonts w:ascii="Wingdings" w:hAnsi="Wingdings" w:hint="default"/>
+        <w:sz w:val="20"/>
+      </w:rPr>
+    </w:lvl>
+  </w:abstractNum>
+  <w:abstractNum w:abstractNumId="5">
     <w:nsid w:val="27732A9B"/>
     <w:multiLevelType w:val="multilevel"/>
     <w:tmpl w:val="0409001F"/>
@@ -10035,7 +10388,7 @@
       </w:pPr>
     </w:lvl>
   </w:abstractNum>
-  <w:abstractNum w:abstractNumId="5">
+  <w:abstractNum w:abstractNumId="6">
     <w:nsid w:val="2CF56644"/>
     <w:multiLevelType w:val="hybridMultilevel"/>
     <w:tmpl w:val="43EAE156"/>
@@ -10149,7 +10502,7 @@
       </w:rPr>
     </w:lvl>
   </w:abstractNum>
-  <w:abstractNum w:abstractNumId="6">
+  <w:abstractNum w:abstractNumId="7">
     <w:nsid w:val="2EC155CA"/>
     <w:multiLevelType w:val="hybridMultilevel"/>
     <w:tmpl w:val="D062D96E"/>
@@ -10239,7 +10592,7 @@
       </w:pPr>
     </w:lvl>
   </w:abstractNum>
-  <w:abstractNum w:abstractNumId="7">
+  <w:abstractNum w:abstractNumId="8">
     <w:nsid w:val="39B934AE"/>
     <w:multiLevelType w:val="hybridMultilevel"/>
     <w:tmpl w:val="C8306BBE"/>
@@ -10329,7 +10682,7 @@
       </w:pPr>
     </w:lvl>
   </w:abstractNum>
-  <w:abstractNum w:abstractNumId="8">
+  <w:abstractNum w:abstractNumId="9">
     <w:nsid w:val="415819F6"/>
     <w:multiLevelType w:val="hybridMultilevel"/>
     <w:tmpl w:val="725E2314"/>
@@ -10442,7 +10795,156 @@
       </w:rPr>
     </w:lvl>
   </w:abstractNum>
-  <w:abstractNum w:abstractNumId="9">
+  <w:abstractNum w:abstractNumId="10">
+    <w:nsid w:val="41825100"/>
+    <w:multiLevelType w:val="multilevel"/>
+    <w:tmpl w:val="80C0DA3C"/>
+    <w:lvl w:ilvl="0">
+      <w:start w:val="1"/>
+      <w:numFmt w:val="bullet"/>
+      <w:lvlText w:val=""/>
+      <w:lvlJc w:val="left"/>
+      <w:pPr>
+        <w:tabs>
+          <w:tab w:val="num" w:pos="720"/>
+        </w:tabs>
+        <w:ind w:left="720" w:hanging="360"/>
+      </w:pPr>
+      <w:rPr>
+        <w:rFonts w:ascii="Symbol" w:hAnsi="Symbol" w:hint="default"/>
+        <w:sz w:val="20"/>
+      </w:rPr>
+    </w:lvl>
+    <w:lvl w:ilvl="1">
+      <w:start w:val="1"/>
+      <w:numFmt w:val="bullet"/>
+      <w:lvlText w:val="o"/>
+      <w:lvlJc w:val="left"/>
+      <w:pPr>
+        <w:tabs>
+          <w:tab w:val="num" w:pos="1440"/>
+        </w:tabs>
+        <w:ind w:left="1440" w:hanging="360"/>
+      </w:pPr>
+      <w:rPr>
+        <w:rFonts w:ascii="Courier New" w:hAnsi="Courier New" w:hint="default"/>
+        <w:sz w:val="20"/>
+      </w:rPr>
+    </w:lvl>
+    <w:lvl w:ilvl="2" w:tentative="1">
+      <w:start w:val="1"/>
+      <w:numFmt w:val="bullet"/>
+      <w:lvlText w:val=""/>
+      <w:lvlJc w:val="left"/>
+      <w:pPr>
+        <w:tabs>
+          <w:tab w:val="num" w:pos="2160"/>
+        </w:tabs>
+        <w:ind w:left="2160" w:hanging="360"/>
+      </w:pPr>
+      <w:rPr>
+        <w:rFonts w:ascii="Wingdings" w:hAnsi="Wingdings" w:hint="default"/>
+        <w:sz w:val="20"/>
+      </w:rPr>
+    </w:lvl>
+    <w:lvl w:ilvl="3" w:tentative="1">
+      <w:start w:val="1"/>
+      <w:numFmt w:val="bullet"/>
+      <w:lvlText w:val=""/>
+      <w:lvlJc w:val="left"/>
+      <w:pPr>
+        <w:tabs>
+          <w:tab w:val="num" w:pos="2880"/>
+        </w:tabs>
+        <w:ind w:left="2880" w:hanging="360"/>
+      </w:pPr>
+      <w:rPr>
+        <w:rFonts w:ascii="Wingdings" w:hAnsi="Wingdings" w:hint="default"/>
+        <w:sz w:val="20"/>
+      </w:rPr>
+    </w:lvl>
+    <w:lvl w:ilvl="4" w:tentative="1">
+      <w:start w:val="1"/>
+      <w:numFmt w:val="bullet"/>
+      <w:lvlText w:val=""/>
+      <w:lvlJc w:val="left"/>
+      <w:pPr>
+        <w:tabs>
+          <w:tab w:val="num" w:pos="3600"/>
+        </w:tabs>
+        <w:ind w:left="3600" w:hanging="360"/>
+      </w:pPr>
+      <w:rPr>
+        <w:rFonts w:ascii="Wingdings" w:hAnsi="Wingdings" w:hint="default"/>
+        <w:sz w:val="20"/>
+      </w:rPr>
+    </w:lvl>
+    <w:lvl w:ilvl="5" w:tentative="1">
+      <w:start w:val="1"/>
+      <w:numFmt w:val="bullet"/>
+      <w:lvlText w:val=""/>
+      <w:lvlJc w:val="left"/>
+      <w:pPr>
+        <w:tabs>
+          <w:tab w:val="num" w:pos="4320"/>
+        </w:tabs>
+        <w:ind w:left="4320" w:hanging="360"/>
+      </w:pPr>
+      <w:rPr>
+        <w:rFonts w:ascii="Wingdings" w:hAnsi="Wingdings" w:hint="default"/>
+        <w:sz w:val="20"/>
+      </w:rPr>
+    </w:lvl>
+    <w:lvl w:ilvl="6" w:tentative="1">
+      <w:start w:val="1"/>
+      <w:numFmt w:val="bullet"/>
+      <w:lvlText w:val=""/>
+      <w:lvlJc w:val="left"/>
+      <w:pPr>
+        <w:tabs>
+          <w:tab w:val="num" w:pos="5040"/>
+        </w:tabs>
+        <w:ind w:left="5040" w:hanging="360"/>
+      </w:pPr>
+      <w:rPr>
+        <w:rFonts w:ascii="Wingdings" w:hAnsi="Wingdings" w:hint="default"/>
+        <w:sz w:val="20"/>
+      </w:rPr>
+    </w:lvl>
+    <w:lvl w:ilvl="7" w:tentative="1">
+      <w:start w:val="1"/>
+      <w:numFmt w:val="bullet"/>
+      <w:lvlText w:val=""/>
+      <w:lvlJc w:val="left"/>
+      <w:pPr>
+        <w:tabs>
+          <w:tab w:val="num" w:pos="5760"/>
+        </w:tabs>
+        <w:ind w:left="5760" w:hanging="360"/>
+      </w:pPr>
+      <w:rPr>
+        <w:rFonts w:ascii="Wingdings" w:hAnsi="Wingdings" w:hint="default"/>
+        <w:sz w:val="20"/>
+      </w:rPr>
+    </w:lvl>
+    <w:lvl w:ilvl="8" w:tentative="1">
+      <w:start w:val="1"/>
+      <w:numFmt w:val="bullet"/>
+      <w:lvlText w:val=""/>
+      <w:lvlJc w:val="left"/>
+      <w:pPr>
+        <w:tabs>
+          <w:tab w:val="num" w:pos="6480"/>
+        </w:tabs>
+        <w:ind w:left="6480" w:hanging="360"/>
+      </w:pPr>
+      <w:rPr>
+        <w:rFonts w:ascii="Wingdings" w:hAnsi="Wingdings" w:hint="default"/>
+        <w:sz w:val="20"/>
+      </w:rPr>
+    </w:lvl>
+  </w:abstractNum>
+  <w:abstractNum w:abstractNumId="11">
     <w:nsid w:val="4B2939DD"/>
     <w:multiLevelType w:val="hybridMultilevel"/>
     <w:tmpl w:val="354628E0"/>
@@ -10528,7 +11030,7 @@
       </w:pPr>
     </w:lvl>
   </w:abstractNum>
-  <w:abstractNum w:abstractNumId="10">
+  <w:abstractNum w:abstractNumId="12">
     <w:nsid w:val="4BEF580D"/>
     <w:multiLevelType w:val="hybridMultilevel"/>
     <w:tmpl w:val="8578F48E"/>
@@ -10641,7 +11143,7 @@
       </w:rPr>
     </w:lvl>
   </w:abstractNum>
-  <w:abstractNum w:abstractNumId="11">
+  <w:abstractNum w:abstractNumId="13">
     <w:nsid w:val="4D6F6379"/>
     <w:multiLevelType w:val="hybridMultilevel"/>
     <w:tmpl w:val="C5F00BB4"/>
@@ -10754,7 +11256,7 @@
       </w:rPr>
     </w:lvl>
   </w:abstractNum>
-  <w:abstractNum w:abstractNumId="12">
+  <w:abstractNum w:abstractNumId="14">
     <w:nsid w:val="621D3478"/>
     <w:multiLevelType w:val="hybridMultilevel"/>
     <w:tmpl w:val="287CA07C"/>
@@ -10867,7 +11369,156 @@
       </w:rPr>
     </w:lvl>
   </w:abstractNum>
-  <w:abstractNum w:abstractNumId="13">
+  <w:abstractNum w:abstractNumId="15">
+    <w:nsid w:val="62703FF9"/>
+    <w:multiLevelType w:val="multilevel"/>
+    <w:tmpl w:val="034E3D82"/>
+    <w:lvl w:ilvl="0">
+      <w:start w:val="1"/>
+      <w:numFmt w:val="bullet"/>
+      <w:lvlText w:val=""/>
+      <w:lvlJc w:val="left"/>
+      <w:pPr>
+        <w:tabs>
+          <w:tab w:val="num" w:pos="720"/>
+        </w:tabs>
+        <w:ind w:left="720" w:hanging="360"/>
+      </w:pPr>
+      <w:rPr>
+        <w:rFonts w:ascii="Symbol" w:hAnsi="Symbol" w:hint="default"/>
+        <w:sz w:val="20"/>
+      </w:rPr>
+    </w:lvl>
+    <w:lvl w:ilvl="1" w:tentative="1">
+      <w:start w:val="1"/>
+      <w:numFmt w:val="bullet"/>
+      <w:lvlText w:val="o"/>
+      <w:lvlJc w:val="left"/>
+      <w:pPr>
+        <w:tabs>
+          <w:tab w:val="num" w:pos="1440"/>
+        </w:tabs>
+        <w:ind w:left="1440" w:hanging="360"/>
+      </w:pPr>
+      <w:rPr>
+        <w:rFonts w:ascii="Courier New" w:hAnsi="Courier New" w:hint="default"/>
+        <w:sz w:val="20"/>
+      </w:rPr>
+    </w:lvl>
+    <w:lvl w:ilvl="2" w:tentative="1">
+      <w:start w:val="1"/>
+      <w:numFmt w:val="bullet"/>
+      <w:lvlText w:val=""/>
+      <w:lvlJc w:val="left"/>
+      <w:pPr>
+        <w:tabs>
+          <w:tab w:val="num" w:pos="2160"/>
+        </w:tabs>
+        <w:ind w:left="2160" w:hanging="360"/>
+      </w:pPr>
+      <w:rPr>
+        <w:rFonts w:ascii="Wingdings" w:hAnsi="Wingdings" w:hint="default"/>
+        <w:sz w:val="20"/>
+      </w:rPr>
+    </w:lvl>
+    <w:lvl w:ilvl="3" w:tentative="1">
+      <w:start w:val="1"/>
+      <w:numFmt w:val="bullet"/>
+      <w:lvlText w:val=""/>
+      <w:lvlJc w:val="left"/>
+      <w:pPr>
+        <w:tabs>
+          <w:tab w:val="num" w:pos="2880"/>
+        </w:tabs>
+        <w:ind w:left="2880" w:hanging="360"/>
+      </w:pPr>
+      <w:rPr>
+        <w:rFonts w:ascii="Wingdings" w:hAnsi="Wingdings" w:hint="default"/>
+        <w:sz w:val="20"/>
+      </w:rPr>
+    </w:lvl>
+    <w:lvl w:ilvl="4" w:tentative="1">
+      <w:start w:val="1"/>
+      <w:numFmt w:val="bullet"/>
+      <w:lvlText w:val=""/>
+      <w:lvlJc w:val="left"/>
+      <w:pPr>
+        <w:tabs>
+          <w:tab w:val="num" w:pos="3600"/>
+        </w:tabs>
+        <w:ind w:left="3600" w:hanging="360"/>
+      </w:pPr>
+      <w:rPr>
+        <w:rFonts w:ascii="Wingdings" w:hAnsi="Wingdings" w:hint="default"/>
+        <w:sz w:val="20"/>
+      </w:rPr>
+    </w:lvl>
+    <w:lvl w:ilvl="5" w:tentative="1">
+      <w:start w:val="1"/>
+      <w:numFmt w:val="bullet"/>
+      <w:lvlText w:val=""/>
+      <w:lvlJc w:val="left"/>
+      <w:pPr>
+        <w:tabs>
+          <w:tab w:val="num" w:pos="4320"/>
+        </w:tabs>
+        <w:ind w:left="4320" w:hanging="360"/>
+      </w:pPr>
+      <w:rPr>
+        <w:rFonts w:ascii="Wingdings" w:hAnsi="Wingdings" w:hint="default"/>
+        <w:sz w:val="20"/>
+      </w:rPr>
+    </w:lvl>
+    <w:lvl w:ilvl="6" w:tentative="1">
+      <w:start w:val="1"/>
+      <w:numFmt w:val="bullet"/>
+      <w:lvlText w:val=""/>
+      <w:lvlJc w:val="left"/>
+      <w:pPr>
+        <w:tabs>
+          <w:tab w:val="num" w:pos="5040"/>
+        </w:tabs>
+        <w:ind w:left="5040" w:hanging="360"/>
+      </w:pPr>
+      <w:rPr>
+        <w:rFonts w:ascii="Wingdings" w:hAnsi="Wingdings" w:hint="default"/>
+        <w:sz w:val="20"/>
+      </w:rPr>
+    </w:lvl>
+    <w:lvl w:ilvl="7" w:tentative="1">
+      <w:start w:val="1"/>
+      <w:numFmt w:val="bullet"/>
+      <w:lvlText w:val=""/>
+      <w:lvlJc w:val="left"/>
+      <w:pPr>
+        <w:tabs>
+          <w:tab w:val="num" w:pos="5760"/>
+        </w:tabs>
+        <w:ind w:left="5760" w:hanging="360"/>
+      </w:pPr>
+      <w:rPr>
+        <w:rFonts w:ascii="Wingdings" w:hAnsi="Wingdings" w:hint="default"/>
+        <w:sz w:val="20"/>
+      </w:rPr>
+    </w:lvl>
+    <w:lvl w:ilvl="8" w:tentative="1">
+      <w:start w:val="1"/>
+      <w:numFmt w:val="bullet"/>
+      <w:lvlText w:val=""/>
+      <w:lvlJc w:val="left"/>
+      <w:pPr>
+        <w:tabs>
+          <w:tab w:val="num" w:pos="6480"/>
+        </w:tabs>
+        <w:ind w:left="6480" w:hanging="360"/>
+      </w:pPr>
+      <w:rPr>
+        <w:rFonts w:ascii="Wingdings" w:hAnsi="Wingdings" w:hint="default"/>
+        <w:sz w:val="20"/>
+      </w:rPr>
+    </w:lvl>
+  </w:abstractNum>
+  <w:abstractNum w:abstractNumId="16">
     <w:nsid w:val="704846B8"/>
     <w:multiLevelType w:val="hybridMultilevel"/>
     <w:tmpl w:val="DB26C1EE"/>
@@ -10957,7 +11608,7 @@
       </w:pPr>
     </w:lvl>
   </w:abstractNum>
-  <w:abstractNum w:abstractNumId="14">
+  <w:abstractNum w:abstractNumId="17">
     <w:nsid w:val="70803446"/>
     <w:multiLevelType w:val="hybridMultilevel"/>
     <w:tmpl w:val="29F2B534"/>
@@ -11043,7 +11694,7 @@
       </w:pPr>
     </w:lvl>
   </w:abstractNum>
-  <w:abstractNum w:abstractNumId="15">
+  <w:abstractNum w:abstractNumId="18">
     <w:nsid w:val="79230737"/>
     <w:multiLevelType w:val="hybridMultilevel"/>
     <w:tmpl w:val="3AB475A0"/>
@@ -11157,19 +11808,19 @@
     </w:lvl>
   </w:abstractNum>
   <w:num w:numId="1">
-    <w:abstractNumId w:val="11"/>
+    <w:abstractNumId w:val="13"/>
   </w:num>
   <w:num w:numId="2">
-    <w:abstractNumId w:val="5"/>
+    <w:abstractNumId w:val="6"/>
   </w:num>
   <w:num w:numId="3">
-    <w:abstractNumId w:val="12"/>
+    <w:abstractNumId w:val="14"/>
   </w:num>
   <w:num w:numId="4">
     <w:abstractNumId w:val="2"/>
   </w:num>
   <w:num w:numId="5">
-    <w:abstractNumId w:val="4"/>
+    <w:abstractNumId w:val="5"/>
   </w:num>
   <w:num w:numId="6">
     <w:abstractNumId w:val="3"/>
@@ -11178,31 +11829,40 @@
     <w:abstractNumId w:val="0"/>
   </w:num>
   <w:num w:numId="8">
-    <w:abstractNumId w:val="6"/>
+    <w:abstractNumId w:val="7"/>
   </w:num>
   <w:num w:numId="9">
-    <w:abstractNumId w:val="13"/>
+    <w:abstractNumId w:val="16"/>
   </w:num>
   <w:num w:numId="10">
-    <w:abstractNumId w:val="7"/>
+    <w:abstractNumId w:val="8"/>
   </w:num>
   <w:num w:numId="11">
-    <w:abstractNumId w:val="15"/>
+    <w:abstractNumId w:val="18"/>
   </w:num>
   <w:num w:numId="12">
-    <w:abstractNumId w:val="10"/>
+    <w:abstractNumId w:val="12"/>
   </w:num>
   <w:num w:numId="13">
-    <w:abstractNumId w:val="8"/>
+    <w:abstractNumId w:val="9"/>
   </w:num>
   <w:num w:numId="14">
-    <w:abstractNumId w:val="9"/>
+    <w:abstractNumId w:val="11"/>
   </w:num>
   <w:num w:numId="15">
     <w:abstractNumId w:val="1"/>
   </w:num>
   <w:num w:numId="16">
-    <w:abstractNumId w:val="14"/>
+    <w:abstractNumId w:val="17"/>
+  </w:num>
+  <w:num w:numId="17">
+    <w:abstractNumId w:val="4"/>
+  </w:num>
+  <w:num w:numId="18">
+    <w:abstractNumId w:val="10"/>
+  </w:num>
+  <w:num w:numId="19">
+    <w:abstractNumId w:val="15"/>
   </w:num>
 </w:numbering>
 </file>
@@ -11440,6 +12100,31 @@
       <w:color w:val="4F81BD" w:themeColor="accent1"/>
     </w:rPr>
   </w:style>
+  <w:style w:type="paragraph" w:styleId="Heading4">
+    <w:name w:val="heading 4"/>
+    <w:basedOn w:val="Normal"/>
+    <w:next w:val="Normal"/>
+    <w:link w:val="Heading4Char"/>
+    <w:uiPriority w:val="9"/>
+    <w:semiHidden/>
+    <w:unhideWhenUsed/>
+    <w:qFormat/>
+    <w:rsid w:val="00CA41A6"/>
+    <w:pPr>
+      <w:keepNext/>
+      <w:keepLines/>
+      <w:spacing w:before="200" w:after="0"/>
+      <w:outlineLvl w:val="3"/>
+    </w:pPr>
+    <w:rPr>
+      <w:rFonts w:asciiTheme="majorHAnsi" w:eastAsiaTheme="majorEastAsia" w:hAnsiTheme="majorHAnsi" w:cstheme="majorBidi"/>
+      <w:b/>
+      <w:bCs/>
+      <w:i/>
+      <w:iCs/>
+      <w:color w:val="4F81BD" w:themeColor="accent1"/>
+    </w:rPr>
+  </w:style>
   <w:style w:type="character" w:default="1" w:styleId="DefaultParagraphFont">
     <w:name w:val="Default Paragraph Font"/>
     <w:uiPriority w:val="1"/>
@@ -11590,6 +12275,63 @@
     <w:rPr>
       <w:color w:val="800080" w:themeColor="followedHyperlink"/>
       <w:u w:val="single"/>
+    </w:rPr>
+  </w:style>
+  <w:style w:type="character" w:customStyle="1" w:styleId="Heading4Char">
+    <w:name w:val="Heading 4 Char"/>
+    <w:basedOn w:val="DefaultParagraphFont"/>
+    <w:link w:val="Heading4"/>
+    <w:uiPriority w:val="9"/>
+    <w:semiHidden/>
+    <w:rsid w:val="00CA41A6"/>
+    <w:rPr>
+      <w:rFonts w:asciiTheme="majorHAnsi" w:eastAsiaTheme="majorEastAsia" w:hAnsiTheme="majorHAnsi" w:cstheme="majorBidi"/>
+      <w:b/>
+      <w:bCs/>
+      <w:i/>
+      <w:iCs/>
+      <w:color w:val="4F81BD" w:themeColor="accent1"/>
+    </w:rPr>
+  </w:style>
+  <w:style w:type="paragraph" w:styleId="NormalWeb">
+    <w:name w:val="Normal (Web)"/>
+    <w:basedOn w:val="Normal"/>
+    <w:uiPriority w:val="99"/>
+    <w:semiHidden/>
+    <w:unhideWhenUsed/>
+    <w:rsid w:val="00B52118"/>
+    <w:pPr>
+      <w:spacing w:before="100" w:beforeAutospacing="1" w:after="100" w:afterAutospacing="1" w:line="240" w:lineRule="auto"/>
+    </w:pPr>
+    <w:rPr>
+      <w:rFonts w:ascii="Times New Roman" w:hAnsi="Times New Roman"/>
+      <w:sz w:val="24"/>
+      <w:szCs w:val="24"/>
+      <w:lang w:val="en-US"/>
+    </w:rPr>
+  </w:style>
+  <w:style w:type="character" w:styleId="Strong">
+    <w:name w:val="Strong"/>
+    <w:basedOn w:val="DefaultParagraphFont"/>
+    <w:uiPriority w:val="22"/>
+    <w:qFormat/>
+    <w:rsid w:val="00B52118"/>
+    <w:rPr>
+      <w:b/>
+      <w:bCs/>
+    </w:rPr>
+  </w:style>
+  <w:style w:type="character" w:styleId="HTMLCode">
+    <w:name w:val="HTML Code"/>
+    <w:basedOn w:val="DefaultParagraphFont"/>
+    <w:uiPriority w:val="99"/>
+    <w:semiHidden/>
+    <w:unhideWhenUsed/>
+    <w:rsid w:val="00B52118"/>
+    <w:rPr>
+      <w:rFonts w:ascii="Courier New" w:eastAsia="Times New Roman" w:hAnsi="Courier New" w:cs="Courier New"/>
+      <w:sz w:val="20"/>
+      <w:szCs w:val="20"/>
     </w:rPr>
   </w:style>
 </w:styles>
@@ -11828,6 +12570,31 @@
       <w:color w:val="4F81BD" w:themeColor="accent1"/>
     </w:rPr>
   </w:style>
+  <w:style w:type="paragraph" w:styleId="Heading4">
+    <w:name w:val="heading 4"/>
+    <w:basedOn w:val="Normal"/>
+    <w:next w:val="Normal"/>
+    <w:link w:val="Heading4Char"/>
+    <w:uiPriority w:val="9"/>
+    <w:semiHidden/>
+    <w:unhideWhenUsed/>
+    <w:qFormat/>
+    <w:rsid w:val="00CA41A6"/>
+    <w:pPr>
+      <w:keepNext/>
+      <w:keepLines/>
+      <w:spacing w:before="200" w:after="0"/>
+      <w:outlineLvl w:val="3"/>
+    </w:pPr>
+    <w:rPr>
+      <w:rFonts w:asciiTheme="majorHAnsi" w:eastAsiaTheme="majorEastAsia" w:hAnsiTheme="majorHAnsi" w:cstheme="majorBidi"/>
+      <w:b/>
+      <w:bCs/>
+      <w:i/>
+      <w:iCs/>
+      <w:color w:val="4F81BD" w:themeColor="accent1"/>
+    </w:rPr>
+  </w:style>
   <w:style w:type="character" w:default="1" w:styleId="DefaultParagraphFont">
     <w:name w:val="Default Paragraph Font"/>
     <w:uiPriority w:val="1"/>
@@ -11978,6 +12745,63 @@
     <w:rPr>
       <w:color w:val="800080" w:themeColor="followedHyperlink"/>
       <w:u w:val="single"/>
+    </w:rPr>
+  </w:style>
+  <w:style w:type="character" w:customStyle="1" w:styleId="Heading4Char">
+    <w:name w:val="Heading 4 Char"/>
+    <w:basedOn w:val="DefaultParagraphFont"/>
+    <w:link w:val="Heading4"/>
+    <w:uiPriority w:val="9"/>
+    <w:semiHidden/>
+    <w:rsid w:val="00CA41A6"/>
+    <w:rPr>
+      <w:rFonts w:asciiTheme="majorHAnsi" w:eastAsiaTheme="majorEastAsia" w:hAnsiTheme="majorHAnsi" w:cstheme="majorBidi"/>
+      <w:b/>
+      <w:bCs/>
+      <w:i/>
+      <w:iCs/>
+      <w:color w:val="4F81BD" w:themeColor="accent1"/>
+    </w:rPr>
+  </w:style>
+  <w:style w:type="paragraph" w:styleId="NormalWeb">
+    <w:name w:val="Normal (Web)"/>
+    <w:basedOn w:val="Normal"/>
+    <w:uiPriority w:val="99"/>
+    <w:semiHidden/>
+    <w:unhideWhenUsed/>
+    <w:rsid w:val="00B52118"/>
+    <w:pPr>
+      <w:spacing w:before="100" w:beforeAutospacing="1" w:after="100" w:afterAutospacing="1" w:line="240" w:lineRule="auto"/>
+    </w:pPr>
+    <w:rPr>
+      <w:rFonts w:ascii="Times New Roman" w:hAnsi="Times New Roman"/>
+      <w:sz w:val="24"/>
+      <w:szCs w:val="24"/>
+      <w:lang w:val="en-US"/>
+    </w:rPr>
+  </w:style>
+  <w:style w:type="character" w:styleId="Strong">
+    <w:name w:val="Strong"/>
+    <w:basedOn w:val="DefaultParagraphFont"/>
+    <w:uiPriority w:val="22"/>
+    <w:qFormat/>
+    <w:rsid w:val="00B52118"/>
+    <w:rPr>
+      <w:b/>
+      <w:bCs/>
+    </w:rPr>
+  </w:style>
+  <w:style w:type="character" w:styleId="HTMLCode">
+    <w:name w:val="HTML Code"/>
+    <w:basedOn w:val="DefaultParagraphFont"/>
+    <w:uiPriority w:val="99"/>
+    <w:semiHidden/>
+    <w:unhideWhenUsed/>
+    <w:rsid w:val="00B52118"/>
+    <w:rPr>
+      <w:rFonts w:ascii="Courier New" w:eastAsia="Times New Roman" w:hAnsi="Courier New" w:cs="Courier New"/>
+      <w:sz w:val="20"/>
+      <w:szCs w:val="20"/>
     </w:rPr>
   </w:style>
 </w:styles>
@@ -12271,7 +13095,7 @@
 </file>
 
 <file path=customXml/itemProps1.xml><?xml version="1.0" encoding="utf-8"?>
-<ds:datastoreItem xmlns:ds="http://schemas.openxmlformats.org/officeDocument/2006/customXml" ds:itemID="{B2E6F766-1686-478E-80E5-E64656F3DFF0}">
+<ds:datastoreItem xmlns:ds="http://schemas.openxmlformats.org/officeDocument/2006/customXml" ds:itemID="{EBBB5944-E382-4069-9AA9-9326ED60BCA8}">
   <ds:schemaRefs>
     <ds:schemaRef ds:uri="http://schemas.openxmlformats.org/officeDocument/2006/bibliography"/>
   </ds:schemaRefs>

</xml_diff>